<commit_message>
Remove legacy notebooks and update docs
Delete obsolete statistical-analysis notebooks (QuantitativeEvaluation_Llama.ipynb, QuantitativeEvaluation_Mistral.ipynb, RecursiveTrainingQuantitativeEvaluation_Llama.ipynb). Update QuantitativeEvaluation_Mistral_with_seeds.ipynb and update the Word doc docs/LLM Collapse Paper - Sharon remarks.docx (plus added temporary ~$ file). Cleanup of analysis artifacts and documentation.
</commit_message>
<xml_diff>
--- a/docs/LLM Collapse Paper - Sharon remarks.docx
+++ b/docs/LLM Collapse Paper - Sharon remarks.docx
@@ -2532,35 +2532,7 @@
         <w:rPr>
           <w:rFonts w:cstheme="minorHAnsi"/>
         </w:rPr>
-        <w:t xml:space="preserve">but also exhibited unusually long perplexity </w:t>
-      </w:r>
-      <w:proofErr w:type="gramStart"/>
-      <w:r>
-        <w:rPr>
-          <w:rFonts w:cstheme="minorHAnsi"/>
-        </w:rPr>
-        <w:t>tails</w:t>
-      </w:r>
-      <w:proofErr w:type="gramEnd"/>
-      <w:r>
-        <w:rPr>
-          <w:rFonts w:cstheme="minorHAnsi"/>
-        </w:rPr>
-        <w:t xml:space="preserve">, suggesting increasing errors and a loss of </w:t>
-      </w:r>
-      <w:proofErr w:type="gramStart"/>
-      <w:r>
-        <w:rPr>
-          <w:rFonts w:cstheme="minorHAnsi"/>
-        </w:rPr>
-        <w:t>grounding in reality</w:t>
-      </w:r>
-      <w:proofErr w:type="gramEnd"/>
-      <w:r>
-        <w:rPr>
-          <w:rFonts w:cstheme="minorHAnsi"/>
-        </w:rPr>
-        <w:t>. To mitigate model collapse, maintaining access to high</w:t>
+        <w:t>but also exhibited unusually long perplexity tails, suggesting increasing errors and a loss of grounding in reality. To mitigate model collapse, maintaining access to high</w:t>
       </w:r>
       <w:r>
         <w:rPr>
@@ -2701,28 +2673,14 @@
         <w:rPr>
           <w:rFonts w:cstheme="minorHAnsi"/>
         </w:rPr>
-        <w:t xml:space="preserve">GAN, where the generator and discriminator </w:t>
-      </w:r>
-      <w:proofErr w:type="gramStart"/>
-      <w:r>
-        <w:rPr>
-          <w:rFonts w:cstheme="minorHAnsi"/>
-        </w:rPr>
-        <w:t xml:space="preserve">enter </w:t>
+        <w:t xml:space="preserve">GAN, where the generator and discriminator enter </w:t>
       </w:r>
       <w:r>
         <w:rPr>
           <w:rFonts w:cstheme="minorHAnsi"/>
         </w:rPr>
         <w:lastRenderedPageBreak/>
-        <w:t>into</w:t>
-      </w:r>
-      <w:proofErr w:type="gramEnd"/>
-      <w:r>
-        <w:rPr>
-          <w:rFonts w:cstheme="minorHAnsi"/>
-        </w:rPr>
-        <w:t xml:space="preserve"> an endless loop of oscillations instead of settling. This happens because the discriminator's gradients become very steep around the true data distribution, constantly pushing the generator away and preventing convergence. This behavior connects closely to model collapse </w:t>
+        <w:t xml:space="preserve">into an endless loop of oscillations instead of settling. This happens because the discriminator's gradients become very steep around the true data distribution, constantly pushing the generator away and preventing convergence. This behavior connects closely to model collapse </w:t>
       </w:r>
       <w:r>
         <w:rPr>
@@ -4269,21 +4227,7 @@
         <w:rPr>
           <w:rFonts w:cstheme="minorHAnsi"/>
         </w:rPr>
-        <w:t xml:space="preserve"> </w:t>
-      </w:r>
-      <w:proofErr w:type="gramStart"/>
-      <w:r>
-        <w:rPr>
-          <w:rFonts w:cstheme="minorHAnsi"/>
-        </w:rPr>
-        <w:t>This metric leverages</w:t>
-      </w:r>
-      <w:proofErr w:type="gramEnd"/>
-      <w:r>
-        <w:rPr>
-          <w:rFonts w:cstheme="minorHAnsi"/>
-        </w:rPr>
-        <w:t xml:space="preserve"> contextual embeddings from BERT to calculate the similarity between generated and reference sentences. Unlike n</w:t>
+        <w:t xml:space="preserve"> This metric leverages contextual embeddings from BERT to calculate the similarity between generated and reference sentences. Unlike n</w:t>
       </w:r>
       <w:r>
         <w:rPr>
@@ -4874,14 +4818,7 @@
         <w:rPr>
           <w:rFonts w:cstheme="minorHAnsi"/>
         </w:rPr>
-        <w:t xml:space="preserve">Firstly, the quantification of "semantic diversity" and "factuality" can be challenging. While metrics like BLEU and BERTSCORE provide proxies for semantic similarity and quality, they may not fully capture the nuanced concept of "diversity" in meaning beyond lexical variety. Similarly, precisely measuring "factual diversity" requires methodologies for </w:t>
-      </w:r>
-      <w:proofErr w:type="gramStart"/>
-      <w:r>
-        <w:rPr>
-          <w:rFonts w:cstheme="minorHAnsi"/>
-        </w:rPr>
-        <w:t>fact</w:t>
+        <w:t>Firstly, the quantification of "semantic diversity" and "factuality" can be challenging. While metrics like BLEU and BERTSCORE provide proxies for semantic similarity and quality, they may not fully capture the nuanced concept of "diversity" in meaning beyond lexical variety. Similarly, precisely measuring "factual diversity" requires methodologies for fact</w:t>
       </w:r>
       <w:r>
         <w:rPr>
@@ -4893,14 +4830,7 @@
         <w:rPr>
           <w:rFonts w:cstheme="minorHAnsi"/>
         </w:rPr>
-        <w:t>checking</w:t>
-      </w:r>
-      <w:proofErr w:type="gramEnd"/>
-      <w:r>
-        <w:rPr>
-          <w:rFonts w:cstheme="minorHAnsi"/>
-        </w:rPr>
-        <w:t xml:space="preserve"> and assessing the range of accurate claims, which can be complex and context</w:t>
+        <w:t>checking and assessing the range of accurate claims, which can be complex and context</w:t>
       </w:r>
       <w:r>
         <w:rPr>
@@ -6489,14 +6419,7 @@
         <w:rPr>
           <w:rFonts w:cstheme="minorHAnsi"/>
         </w:rPr>
-        <w:t xml:space="preserve">Access: </w:t>
-      </w:r>
-      <w:proofErr w:type="gramStart"/>
-      <w:r>
-        <w:rPr>
-          <w:rFonts w:cstheme="minorHAnsi"/>
-        </w:rPr>
-        <w:t>Open</w:t>
+        <w:t>Access: Open</w:t>
       </w:r>
       <w:r>
         <w:rPr>
@@ -6508,14 +6431,7 @@
         <w:rPr>
           <w:rFonts w:cstheme="minorHAnsi"/>
         </w:rPr>
-        <w:t>source</w:t>
-      </w:r>
-      <w:proofErr w:type="gramEnd"/>
-      <w:r>
-        <w:rPr>
-          <w:rFonts w:cstheme="minorHAnsi"/>
-        </w:rPr>
-        <w:t>, no commercial restrictions</w:t>
+        <w:t>source, no commercial restrictions</w:t>
       </w:r>
     </w:p>
     <w:p>
@@ -6669,14 +6585,7 @@
         <w:rPr>
           <w:rFonts w:cstheme="minorHAnsi"/>
         </w:rPr>
-        <w:t xml:space="preserve"> Part of </w:t>
-      </w:r>
-      <w:proofErr w:type="gramStart"/>
-      <w:r>
-        <w:rPr>
-          <w:rFonts w:cstheme="minorHAnsi"/>
-        </w:rPr>
-        <w:t>widely</w:t>
+        <w:t xml:space="preserve"> Part of widely</w:t>
       </w:r>
       <w:r>
         <w:rPr>
@@ -6688,14 +6597,7 @@
         <w:rPr>
           <w:rFonts w:cstheme="minorHAnsi"/>
         </w:rPr>
-        <w:t>studied</w:t>
-      </w:r>
-      <w:proofErr w:type="gramEnd"/>
-      <w:r>
-        <w:rPr>
-          <w:rFonts w:cstheme="minorHAnsi"/>
-        </w:rPr>
-        <w:t xml:space="preserve"> Llama family with extensive documentation</w:t>
+        <w:t>studied Llama family with extensive documentation</w:t>
       </w:r>
     </w:p>
     <w:p>
@@ -6859,16 +6761,15 @@
           <w:b/>
           <w:bCs/>
         </w:rPr>
-        <w:t xml:space="preserve">Access: </w:t>
-      </w:r>
-      <w:proofErr w:type="gramStart"/>
+        <w:t>Access: Open</w:t>
+      </w:r>
       <w:r>
         <w:rPr>
           <w:rFonts w:cstheme="minorHAnsi"/>
           <w:b/>
           <w:bCs/>
         </w:rPr>
-        <w:t>Open</w:t>
+        <w:t>-</w:t>
       </w:r>
       <w:r>
         <w:rPr>
@@ -6876,24 +6777,7 @@
           <w:b/>
           <w:bCs/>
         </w:rPr>
-        <w:t>-</w:t>
-      </w:r>
-      <w:r>
-        <w:rPr>
-          <w:rFonts w:cstheme="minorHAnsi"/>
-          <w:b/>
-          <w:bCs/>
-        </w:rPr>
-        <w:t>source</w:t>
-      </w:r>
-      <w:proofErr w:type="gramEnd"/>
-      <w:r>
-        <w:rPr>
-          <w:rFonts w:cstheme="minorHAnsi"/>
-          <w:b/>
-          <w:bCs/>
-        </w:rPr>
-        <w:t>, no commercial restrictions</w:t>
+        <w:t>source, no commercial restrictions</w:t>
       </w:r>
     </w:p>
     <w:p>
@@ -7328,21 +7212,7 @@
         <w:rPr>
           <w:rFonts w:cstheme="minorHAnsi"/>
         </w:rPr>
-        <w:t xml:space="preserve">Training </w:t>
-      </w:r>
-      <w:proofErr w:type="gramStart"/>
-      <w:r>
-        <w:rPr>
-          <w:rFonts w:cstheme="minorHAnsi"/>
-        </w:rPr>
-        <w:t>epochs</w:t>
-      </w:r>
-      <w:proofErr w:type="gramEnd"/>
-      <w:r>
-        <w:rPr>
-          <w:rFonts w:cstheme="minorHAnsi"/>
-        </w:rPr>
-        <w:t>: 3</w:t>
+        <w:t>Training epochs: 3</w:t>
       </w:r>
     </w:p>
     <w:p>
@@ -7948,64 +7818,34 @@
         <w:rPr>
           <w:lang w:bidi="he-IL"/>
         </w:rPr>
-        <w:t xml:space="preserve">he </w:t>
-      </w:r>
-      <w:proofErr w:type="gramStart"/>
+        <w:t>he mean is taken across the set. Lower Self-BLEU indicates more diverse outputs, while higher values reveal repetitive or collapsed generation:</w:t>
+      </w:r>
+    </w:p>
+    <w:p>
+      <w:pPr>
+        <w:ind w:firstLine="720"/>
+      </w:pPr>
       <w:r>
         <w:rPr>
           <w:lang w:bidi="he-IL"/>
         </w:rPr>
-        <w:t>mean</w:t>
-      </w:r>
-      <w:proofErr w:type="gramEnd"/>
+        <w:t>Self-BLEU = mean BLEU(</w:t>
+      </w:r>
+      <w:proofErr w:type="spellStart"/>
       <w:r>
         <w:rPr>
           <w:lang w:bidi="he-IL"/>
         </w:rPr>
-        <w:t xml:space="preserve"> is taken across the set. Lower Self-BLEU indicates more diverse outputs, while higher values reveal repetitive or collapsed generation:</w:t>
-      </w:r>
-    </w:p>
-    <w:p>
-      <w:pPr>
-        <w:ind w:firstLine="720"/>
-      </w:pPr>
+        <w:t>output_i</w:t>
+      </w:r>
+      <w:proofErr w:type="spellEnd"/>
       <w:r>
         <w:rPr>
           <w:lang w:bidi="he-IL"/>
         </w:rPr>
-        <w:t xml:space="preserve">Self-BLEU = mean </w:t>
-      </w:r>
-      <w:proofErr w:type="gramStart"/>
-      <w:r>
-        <w:rPr>
-          <w:lang w:bidi="he-IL"/>
-        </w:rPr>
-        <w:t>BLEU(</w:t>
+        <w:t>, {</w:t>
       </w:r>
       <w:proofErr w:type="spellStart"/>
-      <w:proofErr w:type="gramEnd"/>
-      <w:r>
-        <w:rPr>
-          <w:lang w:bidi="he-IL"/>
-        </w:rPr>
-        <w:t>output_</w:t>
-      </w:r>
-      <w:proofErr w:type="gramStart"/>
-      <w:r>
-        <w:rPr>
-          <w:lang w:bidi="he-IL"/>
-        </w:rPr>
-        <w:t>i</w:t>
-      </w:r>
-      <w:proofErr w:type="spellEnd"/>
-      <w:r>
-        <w:rPr>
-          <w:lang w:bidi="he-IL"/>
-        </w:rPr>
-        <w:t>, {</w:t>
-      </w:r>
-      <w:proofErr w:type="spellStart"/>
-      <w:proofErr w:type="gramEnd"/>
       <w:r>
         <w:rPr>
           <w:lang w:bidi="he-IL"/>
@@ -8085,21 +7925,7 @@
         <w:rPr>
           <w:lang w:bidi="he-IL"/>
         </w:rPr>
-        <w:t xml:space="preserve">Factual Consistency = mean </w:t>
-      </w:r>
-      <w:proofErr w:type="gramStart"/>
-      <w:r>
-        <w:rPr>
-          <w:lang w:bidi="he-IL"/>
-        </w:rPr>
-        <w:t>P(</w:t>
-      </w:r>
-      <w:proofErr w:type="gramEnd"/>
-      <w:r>
-        <w:rPr>
-          <w:lang w:bidi="he-IL"/>
-        </w:rPr>
-        <w:t>entailment | prompt, generated sentence)</w:t>
+        <w:t>Factual Consistency = mean P(entailment | prompt, generated sentence)</w:t>
       </w:r>
     </w:p>
     <w:p>
@@ -8448,12 +8274,32 @@
       </w:r>
     </w:p>
     <w:p>
-      <w:r>
+      <w:pPr>
         <w:rPr>
           <w:b/>
           <w:bCs/>
         </w:rPr>
-        <w:t>Quantitative Findings:</w:t>
+      </w:pPr>
+      <w:r>
+        <w:rPr>
+          <w:b/>
+          <w:bCs/>
+        </w:rPr>
+        <w:t xml:space="preserve">Quantitative </w:t>
+      </w:r>
+      <w:r>
+        <w:rPr>
+          <w:b/>
+          <w:bCs/>
+        </w:rPr>
+        <w:t>Evaluation</w:t>
+      </w:r>
+      <w:r>
+        <w:rPr>
+          <w:b/>
+          <w:bCs/>
+        </w:rPr>
+        <w:t>:</w:t>
       </w:r>
     </w:p>
     <w:p>
@@ -9406,135 +9252,202 @@
       <w:pPr>
         <w:rPr>
           <w:rFonts w:cstheme="minorHAnsi"/>
+        </w:rPr>
+      </w:pPr>
+      <w:r>
+        <w:rPr>
+          <w:rFonts w:cstheme="minorHAnsi"/>
           <w:b/>
           <w:bCs/>
         </w:rPr>
-      </w:pPr>
-      <w:r>
-        <w:rPr>
-          <w:rFonts w:cstheme="minorHAnsi"/>
-          <w:b/>
-          <w:bCs/>
-        </w:rPr>
-        <w:t>Quantitative Findings:</w:t>
+        <w:t>Quantitative Evaluation:</w:t>
+      </w:r>
+    </w:p>
+    <w:p>
+      <w:pPr>
+        <w:rPr>
+          <w:rFonts w:cstheme="minorHAnsi"/>
+        </w:rPr>
+      </w:pPr>
+      <w:r>
+        <w:rPr>
+          <w:rFonts w:cstheme="minorHAnsi"/>
+        </w:rPr>
+        <w:t>Quantitative Evaluation Results - mean ± std over 3 seeds, 50 prompts each. ↑ higher is better; ↓ lower is better.</w:t>
       </w:r>
     </w:p>
     <w:tbl>
       <w:tblPr>
-        <w:tblStyle w:val="TableGrid"/>
         <w:tblW w:w="0" w:type="auto"/>
+        <w:tblBorders>
+          <w:top w:val="single" w:sz="2" w:space="0" w:color="auto"/>
+          <w:left w:val="single" w:sz="2" w:space="0" w:color="auto"/>
+          <w:bottom w:val="single" w:sz="2" w:space="0" w:color="auto"/>
+          <w:right w:val="single" w:sz="2" w:space="0" w:color="auto"/>
+        </w:tblBorders>
+        <w:tblCellMar>
+          <w:top w:w="15" w:type="dxa"/>
+          <w:left w:w="15" w:type="dxa"/>
+          <w:bottom w:w="15" w:type="dxa"/>
+          <w:right w:w="15" w:type="dxa"/>
+        </w:tblCellMar>
         <w:tblLook w:val="04A0" w:firstRow="1" w:lastRow="0" w:firstColumn="1" w:lastColumn="0" w:noHBand="0" w:noVBand="1"/>
       </w:tblPr>
       <w:tblGrid>
-        <w:gridCol w:w="1973"/>
-        <w:gridCol w:w="1558"/>
-        <w:gridCol w:w="1558"/>
-        <w:gridCol w:w="1558"/>
-        <w:gridCol w:w="1559"/>
+        <w:gridCol w:w="1392"/>
+        <w:gridCol w:w="1115"/>
+        <w:gridCol w:w="948"/>
+        <w:gridCol w:w="1344"/>
+        <w:gridCol w:w="1186"/>
+        <w:gridCol w:w="1115"/>
+        <w:gridCol w:w="1130"/>
+        <w:gridCol w:w="1124"/>
       </w:tblGrid>
       <w:tr>
+        <w:trPr>
+          <w:tblHeader/>
+        </w:trPr>
         <w:tc>
           <w:tcPr>
-            <w:tcW w:w="1973" w:type="dxa"/>
+            <w:tcW w:w="0" w:type="auto"/>
+            <w:tcBorders>
+              <w:top w:val="single" w:sz="2" w:space="0" w:color="auto"/>
+              <w:left w:val="single" w:sz="2" w:space="0" w:color="auto"/>
+              <w:bottom w:val="single" w:sz="2" w:space="0" w:color="auto"/>
+              <w:right w:val="single" w:sz="6" w:space="0" w:color="auto"/>
+            </w:tcBorders>
             <w:vAlign w:val="center"/>
+            <w:hideMark/>
           </w:tcPr>
           <w:p>
-            <w:pPr>
-              <w:rPr>
-                <w:rFonts w:cstheme="minorHAnsi"/>
-              </w:rPr>
-            </w:pPr>
             <w:r>
-              <w:rPr>
-                <w:rFonts w:cstheme="minorHAnsi"/>
-                <w:b/>
-                <w:bCs/>
-              </w:rPr>
               <w:t>Model</w:t>
             </w:r>
           </w:p>
         </w:tc>
         <w:tc>
           <w:tcPr>
-            <w:tcW w:w="1558" w:type="dxa"/>
+            <w:tcW w:w="0" w:type="auto"/>
+            <w:tcBorders>
+              <w:top w:val="single" w:sz="2" w:space="0" w:color="auto"/>
+              <w:left w:val="single" w:sz="2" w:space="0" w:color="auto"/>
+              <w:bottom w:val="single" w:sz="2" w:space="0" w:color="auto"/>
+              <w:right w:val="single" w:sz="6" w:space="0" w:color="auto"/>
+            </w:tcBorders>
             <w:vAlign w:val="center"/>
+            <w:hideMark/>
           </w:tcPr>
           <w:p>
-            <w:pPr>
-              <w:rPr>
-                <w:rFonts w:cstheme="minorHAnsi"/>
-              </w:rPr>
-            </w:pPr>
             <w:r>
-              <w:rPr>
-                <w:rFonts w:cstheme="minorHAnsi"/>
-                <w:b/>
-                <w:bCs/>
-              </w:rPr>
-              <w:t>TTR</w:t>
+              <w:t>TTR ↑</w:t>
             </w:r>
           </w:p>
         </w:tc>
         <w:tc>
           <w:tcPr>
-            <w:tcW w:w="1558" w:type="dxa"/>
+            <w:tcW w:w="0" w:type="auto"/>
+            <w:tcBorders>
+              <w:top w:val="single" w:sz="2" w:space="0" w:color="auto"/>
+              <w:left w:val="single" w:sz="2" w:space="0" w:color="auto"/>
+              <w:bottom w:val="single" w:sz="2" w:space="0" w:color="auto"/>
+              <w:right w:val="single" w:sz="6" w:space="0" w:color="auto"/>
+            </w:tcBorders>
             <w:vAlign w:val="center"/>
+            <w:hideMark/>
           </w:tcPr>
           <w:p>
-            <w:pPr>
-              <w:rPr>
-                <w:rFonts w:cstheme="minorHAnsi"/>
-              </w:rPr>
-            </w:pPr>
             <w:r>
-              <w:rPr>
-                <w:rFonts w:cstheme="minorHAnsi"/>
-                <w:b/>
-                <w:bCs/>
-              </w:rPr>
-              <w:t>Vocabulary</w:t>
+              <w:t>Vocab Size ↑</w:t>
             </w:r>
           </w:p>
         </w:tc>
         <w:tc>
           <w:tcPr>
-            <w:tcW w:w="1558" w:type="dxa"/>
+            <w:tcW w:w="0" w:type="auto"/>
+            <w:tcBorders>
+              <w:top w:val="single" w:sz="2" w:space="0" w:color="auto"/>
+              <w:left w:val="single" w:sz="2" w:space="0" w:color="auto"/>
+              <w:bottom w:val="single" w:sz="2" w:space="0" w:color="auto"/>
+              <w:right w:val="single" w:sz="6" w:space="0" w:color="auto"/>
+            </w:tcBorders>
             <w:vAlign w:val="center"/>
+            <w:hideMark/>
           </w:tcPr>
           <w:p>
-            <w:pPr>
-              <w:rPr>
-                <w:rFonts w:cstheme="minorHAnsi"/>
-              </w:rPr>
-            </w:pPr>
             <w:r>
-              <w:rPr>
-                <w:rFonts w:cstheme="minorHAnsi"/>
-                <w:b/>
-                <w:bCs/>
-              </w:rPr>
-              <w:t>Bigram Diversity</w:t>
+              <w:t>Bigram Diversity ↑</w:t>
             </w:r>
           </w:p>
         </w:tc>
         <w:tc>
           <w:tcPr>
-            <w:tcW w:w="1559" w:type="dxa"/>
+            <w:tcW w:w="0" w:type="auto"/>
+            <w:tcBorders>
+              <w:top w:val="single" w:sz="2" w:space="0" w:color="auto"/>
+              <w:left w:val="single" w:sz="2" w:space="0" w:color="auto"/>
+              <w:bottom w:val="single" w:sz="2" w:space="0" w:color="auto"/>
+              <w:right w:val="single" w:sz="6" w:space="0" w:color="auto"/>
+            </w:tcBorders>
             <w:vAlign w:val="center"/>
+            <w:hideMark/>
           </w:tcPr>
           <w:p>
-            <w:pPr>
-              <w:rPr>
-                <w:rFonts w:cstheme="minorHAnsi"/>
-              </w:rPr>
-            </w:pPr>
             <w:r>
-              <w:rPr>
-                <w:rFonts w:cstheme="minorHAnsi"/>
-                <w:b/>
-                <w:bCs/>
-              </w:rPr>
-              <w:t>Perplexity</w:t>
+              <w:t>Distinct-3 ↑</w:t>
+            </w:r>
+          </w:p>
+        </w:tc>
+        <w:tc>
+          <w:tcPr>
+            <w:tcW w:w="0" w:type="auto"/>
+            <w:tcBorders>
+              <w:top w:val="single" w:sz="2" w:space="0" w:color="auto"/>
+              <w:left w:val="single" w:sz="2" w:space="0" w:color="auto"/>
+              <w:bottom w:val="single" w:sz="2" w:space="0" w:color="auto"/>
+              <w:right w:val="single" w:sz="6" w:space="0" w:color="auto"/>
+            </w:tcBorders>
+            <w:vAlign w:val="center"/>
+            <w:hideMark/>
+          </w:tcPr>
+          <w:p>
+            <w:r>
+              <w:t>Self-BLEU ↓</w:t>
+            </w:r>
+          </w:p>
+        </w:tc>
+        <w:tc>
+          <w:tcPr>
+            <w:tcW w:w="0" w:type="auto"/>
+            <w:tcBorders>
+              <w:top w:val="single" w:sz="2" w:space="0" w:color="auto"/>
+              <w:left w:val="single" w:sz="2" w:space="0" w:color="auto"/>
+              <w:bottom w:val="single" w:sz="2" w:space="0" w:color="auto"/>
+              <w:right w:val="single" w:sz="6" w:space="0" w:color="auto"/>
+            </w:tcBorders>
+            <w:vAlign w:val="center"/>
+            <w:hideMark/>
+          </w:tcPr>
+          <w:p>
+            <w:r>
+              <w:t>Factual Cons. ↑</w:t>
+            </w:r>
+          </w:p>
+        </w:tc>
+        <w:tc>
+          <w:tcPr>
+            <w:tcW w:w="0" w:type="auto"/>
+            <w:tcBorders>
+              <w:top w:val="single" w:sz="2" w:space="0" w:color="auto"/>
+              <w:left w:val="single" w:sz="2" w:space="0" w:color="auto"/>
+              <w:bottom w:val="single" w:sz="2" w:space="0" w:color="auto"/>
+              <w:right w:val="single" w:sz="2" w:space="0" w:color="auto"/>
+            </w:tcBorders>
+            <w:vAlign w:val="center"/>
+            <w:hideMark/>
+          </w:tcPr>
+          <w:p>
+            <w:r>
+              <w:t>Perplexity ↓</w:t>
             </w:r>
           </w:p>
         </w:tc>
@@ -9542,96 +9455,145 @@
       <w:tr>
         <w:tc>
           <w:tcPr>
-            <w:tcW w:w="1973" w:type="dxa"/>
+            <w:tcW w:w="0" w:type="auto"/>
+            <w:tcBorders>
+              <w:top w:val="single" w:sz="2" w:space="0" w:color="auto"/>
+              <w:left w:val="single" w:sz="2" w:space="0" w:color="auto"/>
+              <w:bottom w:val="single" w:sz="2" w:space="0" w:color="auto"/>
+              <w:right w:val="single" w:sz="6" w:space="0" w:color="auto"/>
+            </w:tcBorders>
             <w:vAlign w:val="center"/>
+            <w:hideMark/>
           </w:tcPr>
           <w:p>
-            <w:pPr>
-              <w:rPr>
-                <w:rFonts w:cstheme="minorHAnsi"/>
-              </w:rPr>
-            </w:pPr>
             <w:r>
-              <w:rPr>
-                <w:rFonts w:cstheme="minorHAnsi"/>
-              </w:rPr>
               <w:t>Base (Untrained)</w:t>
             </w:r>
           </w:p>
         </w:tc>
         <w:tc>
           <w:tcPr>
-            <w:tcW w:w="1558" w:type="dxa"/>
+            <w:tcW w:w="0" w:type="auto"/>
+            <w:tcBorders>
+              <w:top w:val="single" w:sz="2" w:space="0" w:color="auto"/>
+              <w:left w:val="single" w:sz="2" w:space="0" w:color="auto"/>
+              <w:bottom w:val="single" w:sz="2" w:space="0" w:color="auto"/>
+              <w:right w:val="single" w:sz="6" w:space="0" w:color="auto"/>
+            </w:tcBorders>
             <w:vAlign w:val="center"/>
+            <w:hideMark/>
           </w:tcPr>
           <w:p>
-            <w:pPr>
-              <w:rPr>
-                <w:rFonts w:cstheme="minorHAnsi"/>
-              </w:rPr>
-            </w:pPr>
             <w:r>
-              <w:rPr>
-                <w:rFonts w:cstheme="minorHAnsi"/>
-              </w:rPr>
-              <w:t>0.3671</w:t>
+              <w:t>0.3987 ± 0.0114</w:t>
             </w:r>
           </w:p>
         </w:tc>
         <w:tc>
           <w:tcPr>
-            <w:tcW w:w="1558" w:type="dxa"/>
+            <w:tcW w:w="0" w:type="auto"/>
+            <w:tcBorders>
+              <w:top w:val="single" w:sz="2" w:space="0" w:color="auto"/>
+              <w:left w:val="single" w:sz="2" w:space="0" w:color="auto"/>
+              <w:bottom w:val="single" w:sz="2" w:space="0" w:color="auto"/>
+              <w:right w:val="single" w:sz="6" w:space="0" w:color="auto"/>
+            </w:tcBorders>
             <w:vAlign w:val="center"/>
+            <w:hideMark/>
           </w:tcPr>
           <w:p>
-            <w:pPr>
-              <w:rPr>
-                <w:rFonts w:cstheme="minorHAnsi"/>
-              </w:rPr>
-            </w:pPr>
             <w:r>
-              <w:rPr>
-                <w:rFonts w:cstheme="minorHAnsi"/>
-              </w:rPr>
-              <w:t>1839</w:t>
+              <w:t>1633 ± 21</w:t>
             </w:r>
           </w:p>
         </w:tc>
         <w:tc>
           <w:tcPr>
-            <w:tcW w:w="1558" w:type="dxa"/>
+            <w:tcW w:w="0" w:type="auto"/>
+            <w:tcBorders>
+              <w:top w:val="single" w:sz="2" w:space="0" w:color="auto"/>
+              <w:left w:val="single" w:sz="2" w:space="0" w:color="auto"/>
+              <w:bottom w:val="single" w:sz="2" w:space="0" w:color="auto"/>
+              <w:right w:val="single" w:sz="6" w:space="0" w:color="auto"/>
+            </w:tcBorders>
             <w:vAlign w:val="center"/>
+            <w:hideMark/>
           </w:tcPr>
           <w:p>
-            <w:pPr>
-              <w:rPr>
-                <w:rFonts w:cstheme="minorHAnsi"/>
-              </w:rPr>
-            </w:pPr>
             <w:r>
-              <w:rPr>
-                <w:rFonts w:cstheme="minorHAnsi"/>
-              </w:rPr>
-              <w:t>0.7897</w:t>
+              <w:t>0.8109 ± 0.0053</w:t>
             </w:r>
           </w:p>
         </w:tc>
         <w:tc>
           <w:tcPr>
-            <w:tcW w:w="1559" w:type="dxa"/>
+            <w:tcW w:w="0" w:type="auto"/>
+            <w:tcBorders>
+              <w:top w:val="single" w:sz="2" w:space="0" w:color="auto"/>
+              <w:left w:val="single" w:sz="2" w:space="0" w:color="auto"/>
+              <w:bottom w:val="single" w:sz="2" w:space="0" w:color="auto"/>
+              <w:right w:val="single" w:sz="6" w:space="0" w:color="auto"/>
+            </w:tcBorders>
             <w:vAlign w:val="center"/>
+            <w:hideMark/>
           </w:tcPr>
           <w:p>
-            <w:pPr>
-              <w:rPr>
-                <w:rFonts w:cstheme="minorHAnsi"/>
-              </w:rPr>
-            </w:pPr>
             <w:r>
-              <w:rPr>
-                <w:rFonts w:cstheme="minorHAnsi"/>
-              </w:rPr>
-              <w:t>4.31</w:t>
+              <w:t>0.9450 ± 0.0057</w:t>
+            </w:r>
+          </w:p>
+        </w:tc>
+        <w:tc>
+          <w:tcPr>
+            <w:tcW w:w="0" w:type="auto"/>
+            <w:tcBorders>
+              <w:top w:val="single" w:sz="2" w:space="0" w:color="auto"/>
+              <w:left w:val="single" w:sz="2" w:space="0" w:color="auto"/>
+              <w:bottom w:val="single" w:sz="2" w:space="0" w:color="auto"/>
+              <w:right w:val="single" w:sz="6" w:space="0" w:color="auto"/>
+            </w:tcBorders>
+            <w:vAlign w:val="center"/>
+            <w:hideMark/>
+          </w:tcPr>
+          <w:p>
+            <w:r>
+              <w:t>0.0515 ± 0.0070</w:t>
+            </w:r>
+          </w:p>
+        </w:tc>
+        <w:tc>
+          <w:tcPr>
+            <w:tcW w:w="0" w:type="auto"/>
+            <w:tcBorders>
+              <w:top w:val="single" w:sz="2" w:space="0" w:color="auto"/>
+              <w:left w:val="single" w:sz="2" w:space="0" w:color="auto"/>
+              <w:bottom w:val="single" w:sz="2" w:space="0" w:color="auto"/>
+              <w:right w:val="single" w:sz="6" w:space="0" w:color="auto"/>
+            </w:tcBorders>
+            <w:vAlign w:val="center"/>
+            <w:hideMark/>
+          </w:tcPr>
+          <w:p>
+            <w:r>
+              <w:t>0.0414 ± 0.0023</w:t>
+            </w:r>
+          </w:p>
+        </w:tc>
+        <w:tc>
+          <w:tcPr>
+            <w:tcW w:w="0" w:type="auto"/>
+            <w:tcBorders>
+              <w:top w:val="single" w:sz="2" w:space="0" w:color="auto"/>
+              <w:left w:val="single" w:sz="2" w:space="0" w:color="auto"/>
+              <w:bottom w:val="single" w:sz="2" w:space="0" w:color="auto"/>
+              <w:right w:val="single" w:sz="2" w:space="0" w:color="auto"/>
+            </w:tcBorders>
+            <w:vAlign w:val="center"/>
+            <w:hideMark/>
+          </w:tcPr>
+          <w:p>
+            <w:r>
+              <w:t>4.73 ± 0.14</w:t>
             </w:r>
           </w:p>
         </w:tc>
@@ -9639,114 +9601,145 @@
       <w:tr>
         <w:tc>
           <w:tcPr>
-            <w:tcW w:w="1973" w:type="dxa"/>
+            <w:tcW w:w="0" w:type="auto"/>
+            <w:tcBorders>
+              <w:top w:val="single" w:sz="2" w:space="0" w:color="auto"/>
+              <w:left w:val="single" w:sz="2" w:space="0" w:color="auto"/>
+              <w:bottom w:val="single" w:sz="2" w:space="0" w:color="auto"/>
+              <w:right w:val="single" w:sz="6" w:space="0" w:color="auto"/>
+            </w:tcBorders>
             <w:vAlign w:val="center"/>
+            <w:hideMark/>
           </w:tcPr>
           <w:p>
-            <w:pPr>
-              <w:rPr>
-                <w:rFonts w:cstheme="minorHAnsi"/>
-              </w:rPr>
-            </w:pPr>
             <w:r>
-              <w:rPr>
-                <w:rFonts w:cstheme="minorHAnsi"/>
-              </w:rPr>
-              <w:t>Human</w:t>
-            </w:r>
-            <w:r>
-              <w:rPr>
-                <w:rFonts w:cstheme="minorHAnsi"/>
-              </w:rPr>
-              <w:t>-</w:t>
-            </w:r>
-            <w:r>
-              <w:rPr>
-                <w:rFonts w:cstheme="minorHAnsi"/>
-              </w:rPr>
-              <w:t>trained</w:t>
+              <w:t>Human-trained</w:t>
             </w:r>
           </w:p>
         </w:tc>
         <w:tc>
           <w:tcPr>
-            <w:tcW w:w="1558" w:type="dxa"/>
+            <w:tcW w:w="0" w:type="auto"/>
+            <w:tcBorders>
+              <w:top w:val="single" w:sz="2" w:space="0" w:color="auto"/>
+              <w:left w:val="single" w:sz="2" w:space="0" w:color="auto"/>
+              <w:bottom w:val="single" w:sz="2" w:space="0" w:color="auto"/>
+              <w:right w:val="single" w:sz="6" w:space="0" w:color="auto"/>
+            </w:tcBorders>
             <w:vAlign w:val="center"/>
+            <w:hideMark/>
           </w:tcPr>
           <w:p>
-            <w:pPr>
-              <w:rPr>
-                <w:rFonts w:cstheme="minorHAnsi"/>
-              </w:rPr>
-            </w:pPr>
             <w:r>
-              <w:rPr>
-                <w:rFonts w:cstheme="minorHAnsi"/>
-              </w:rPr>
-              <w:t>0.</w:t>
-            </w:r>
-            <w:r>
-              <w:rPr>
-                <w:rFonts w:cstheme="minorHAnsi"/>
-              </w:rPr>
-              <w:t>3074</w:t>
+              <w:t>0.3298 ± 0.0077</w:t>
             </w:r>
           </w:p>
         </w:tc>
         <w:tc>
           <w:tcPr>
-            <w:tcW w:w="1558" w:type="dxa"/>
+            <w:tcW w:w="0" w:type="auto"/>
+            <w:tcBorders>
+              <w:top w:val="single" w:sz="2" w:space="0" w:color="auto"/>
+              <w:left w:val="single" w:sz="2" w:space="0" w:color="auto"/>
+              <w:bottom w:val="single" w:sz="2" w:space="0" w:color="auto"/>
+              <w:right w:val="single" w:sz="6" w:space="0" w:color="auto"/>
+            </w:tcBorders>
             <w:vAlign w:val="center"/>
+            <w:hideMark/>
           </w:tcPr>
           <w:p>
-            <w:pPr>
-              <w:rPr>
-                <w:rFonts w:cstheme="minorHAnsi"/>
-              </w:rPr>
-            </w:pPr>
             <w:r>
-              <w:rPr>
-                <w:rFonts w:cstheme="minorHAnsi"/>
-              </w:rPr>
-              <w:t>1739</w:t>
+              <w:t>1523 ± 20</w:t>
             </w:r>
           </w:p>
         </w:tc>
         <w:tc>
           <w:tcPr>
-            <w:tcW w:w="1558" w:type="dxa"/>
+            <w:tcW w:w="0" w:type="auto"/>
+            <w:tcBorders>
+              <w:top w:val="single" w:sz="2" w:space="0" w:color="auto"/>
+              <w:left w:val="single" w:sz="2" w:space="0" w:color="auto"/>
+              <w:bottom w:val="single" w:sz="2" w:space="0" w:color="auto"/>
+              <w:right w:val="single" w:sz="6" w:space="0" w:color="auto"/>
+            </w:tcBorders>
             <w:vAlign w:val="center"/>
+            <w:hideMark/>
           </w:tcPr>
           <w:p>
-            <w:pPr>
-              <w:rPr>
-                <w:rFonts w:cstheme="minorHAnsi"/>
-              </w:rPr>
-            </w:pPr>
             <w:r>
-              <w:rPr>
-                <w:rFonts w:cstheme="minorHAnsi"/>
-              </w:rPr>
-              <w:t>0.7442</w:t>
+              <w:t>0.7721 ± 0.0078</w:t>
             </w:r>
           </w:p>
         </w:tc>
         <w:tc>
           <w:tcPr>
-            <w:tcW w:w="1559" w:type="dxa"/>
+            <w:tcW w:w="0" w:type="auto"/>
+            <w:tcBorders>
+              <w:top w:val="single" w:sz="2" w:space="0" w:color="auto"/>
+              <w:left w:val="single" w:sz="2" w:space="0" w:color="auto"/>
+              <w:bottom w:val="single" w:sz="2" w:space="0" w:color="auto"/>
+              <w:right w:val="single" w:sz="6" w:space="0" w:color="auto"/>
+            </w:tcBorders>
             <w:vAlign w:val="center"/>
+            <w:hideMark/>
           </w:tcPr>
           <w:p>
-            <w:pPr>
-              <w:rPr>
-                <w:rFonts w:cstheme="minorHAnsi"/>
-              </w:rPr>
-            </w:pPr>
             <w:r>
-              <w:rPr>
-                <w:rFonts w:cstheme="minorHAnsi"/>
-              </w:rPr>
-              <w:t>3.40</w:t>
+              <w:t>0.9433 ± 0.0032</w:t>
+            </w:r>
+          </w:p>
+        </w:tc>
+        <w:tc>
+          <w:tcPr>
+            <w:tcW w:w="0" w:type="auto"/>
+            <w:tcBorders>
+              <w:top w:val="single" w:sz="2" w:space="0" w:color="auto"/>
+              <w:left w:val="single" w:sz="2" w:space="0" w:color="auto"/>
+              <w:bottom w:val="single" w:sz="2" w:space="0" w:color="auto"/>
+              <w:right w:val="single" w:sz="6" w:space="0" w:color="auto"/>
+            </w:tcBorders>
+            <w:vAlign w:val="center"/>
+            <w:hideMark/>
+          </w:tcPr>
+          <w:p>
+            <w:r>
+              <w:t>0.0715 ± 0.0022</w:t>
+            </w:r>
+          </w:p>
+        </w:tc>
+        <w:tc>
+          <w:tcPr>
+            <w:tcW w:w="0" w:type="auto"/>
+            <w:tcBorders>
+              <w:top w:val="single" w:sz="2" w:space="0" w:color="auto"/>
+              <w:left w:val="single" w:sz="2" w:space="0" w:color="auto"/>
+              <w:bottom w:val="single" w:sz="2" w:space="0" w:color="auto"/>
+              <w:right w:val="single" w:sz="6" w:space="0" w:color="auto"/>
+            </w:tcBorders>
+            <w:vAlign w:val="center"/>
+            <w:hideMark/>
+          </w:tcPr>
+          <w:p>
+            <w:r>
+              <w:t>0.0383 ± 0.0074</w:t>
+            </w:r>
+          </w:p>
+        </w:tc>
+        <w:tc>
+          <w:tcPr>
+            <w:tcW w:w="0" w:type="auto"/>
+            <w:tcBorders>
+              <w:top w:val="single" w:sz="2" w:space="0" w:color="auto"/>
+              <w:left w:val="single" w:sz="2" w:space="0" w:color="auto"/>
+              <w:bottom w:val="single" w:sz="2" w:space="0" w:color="auto"/>
+              <w:right w:val="single" w:sz="2" w:space="0" w:color="auto"/>
+            </w:tcBorders>
+            <w:vAlign w:val="center"/>
+            <w:hideMark/>
+          </w:tcPr>
+          <w:p>
+            <w:r>
+              <w:t>3.69 ± 0.14</w:t>
             </w:r>
           </w:p>
         </w:tc>
@@ -9754,114 +9747,145 @@
       <w:tr>
         <w:tc>
           <w:tcPr>
-            <w:tcW w:w="1973" w:type="dxa"/>
+            <w:tcW w:w="0" w:type="auto"/>
+            <w:tcBorders>
+              <w:top w:val="single" w:sz="2" w:space="0" w:color="auto"/>
+              <w:left w:val="single" w:sz="2" w:space="0" w:color="auto"/>
+              <w:bottom w:val="single" w:sz="2" w:space="0" w:color="auto"/>
+              <w:right w:val="single" w:sz="6" w:space="0" w:color="auto"/>
+            </w:tcBorders>
             <w:vAlign w:val="center"/>
+            <w:hideMark/>
           </w:tcPr>
           <w:p>
-            <w:pPr>
-              <w:rPr>
-                <w:rFonts w:cstheme="minorHAnsi"/>
-              </w:rPr>
-            </w:pPr>
             <w:r>
-              <w:rPr>
-                <w:rFonts w:cstheme="minorHAnsi"/>
-              </w:rPr>
-              <w:t>AI</w:t>
-            </w:r>
-            <w:r>
-              <w:rPr>
-                <w:rFonts w:cstheme="minorHAnsi"/>
-              </w:rPr>
-              <w:t>-</w:t>
-            </w:r>
-            <w:r>
-              <w:rPr>
-                <w:rFonts w:cstheme="minorHAnsi"/>
-              </w:rPr>
-              <w:t>trained</w:t>
+              <w:t>AI-trained</w:t>
             </w:r>
           </w:p>
         </w:tc>
         <w:tc>
           <w:tcPr>
-            <w:tcW w:w="1558" w:type="dxa"/>
+            <w:tcW w:w="0" w:type="auto"/>
+            <w:tcBorders>
+              <w:top w:val="single" w:sz="2" w:space="0" w:color="auto"/>
+              <w:left w:val="single" w:sz="2" w:space="0" w:color="auto"/>
+              <w:bottom w:val="single" w:sz="2" w:space="0" w:color="auto"/>
+              <w:right w:val="single" w:sz="6" w:space="0" w:color="auto"/>
+            </w:tcBorders>
             <w:vAlign w:val="center"/>
+            <w:hideMark/>
           </w:tcPr>
           <w:p>
-            <w:pPr>
-              <w:rPr>
-                <w:rFonts w:cstheme="minorHAnsi"/>
-              </w:rPr>
-            </w:pPr>
             <w:r>
-              <w:rPr>
-                <w:rFonts w:cstheme="minorHAnsi"/>
-              </w:rPr>
-              <w:t>0.</w:t>
-            </w:r>
-            <w:r>
-              <w:rPr>
-                <w:rFonts w:cstheme="minorHAnsi"/>
-              </w:rPr>
-              <w:t>2594</w:t>
+              <w:t>0.2783 ± 0.0086</w:t>
             </w:r>
           </w:p>
         </w:tc>
         <w:tc>
           <w:tcPr>
-            <w:tcW w:w="1558" w:type="dxa"/>
+            <w:tcW w:w="0" w:type="auto"/>
+            <w:tcBorders>
+              <w:top w:val="single" w:sz="2" w:space="0" w:color="auto"/>
+              <w:left w:val="single" w:sz="2" w:space="0" w:color="auto"/>
+              <w:bottom w:val="single" w:sz="2" w:space="0" w:color="auto"/>
+              <w:right w:val="single" w:sz="6" w:space="0" w:color="auto"/>
+            </w:tcBorders>
             <w:vAlign w:val="center"/>
+            <w:hideMark/>
           </w:tcPr>
           <w:p>
-            <w:pPr>
-              <w:rPr>
-                <w:rFonts w:cstheme="minorHAnsi"/>
-              </w:rPr>
-            </w:pPr>
             <w:r>
-              <w:rPr>
-                <w:rFonts w:cstheme="minorHAnsi"/>
-              </w:rPr>
-              <w:t>1359</w:t>
+              <w:t>1211 ± 24</w:t>
             </w:r>
           </w:p>
         </w:tc>
         <w:tc>
           <w:tcPr>
-            <w:tcW w:w="1558" w:type="dxa"/>
+            <w:tcW w:w="0" w:type="auto"/>
+            <w:tcBorders>
+              <w:top w:val="single" w:sz="2" w:space="0" w:color="auto"/>
+              <w:left w:val="single" w:sz="2" w:space="0" w:color="auto"/>
+              <w:bottom w:val="single" w:sz="2" w:space="0" w:color="auto"/>
+              <w:right w:val="single" w:sz="6" w:space="0" w:color="auto"/>
+            </w:tcBorders>
             <w:vAlign w:val="center"/>
+            <w:hideMark/>
           </w:tcPr>
           <w:p>
-            <w:pPr>
-              <w:rPr>
-                <w:rFonts w:cstheme="minorHAnsi"/>
-              </w:rPr>
-            </w:pPr>
             <w:r>
-              <w:rPr>
-                <w:rFonts w:cstheme="minorHAnsi"/>
-              </w:rPr>
-              <w:t>0.5675</w:t>
+              <w:t>0.5998 ± 0.0115</w:t>
             </w:r>
           </w:p>
         </w:tc>
         <w:tc>
           <w:tcPr>
-            <w:tcW w:w="1559" w:type="dxa"/>
+            <w:tcW w:w="0" w:type="auto"/>
+            <w:tcBorders>
+              <w:top w:val="single" w:sz="2" w:space="0" w:color="auto"/>
+              <w:left w:val="single" w:sz="2" w:space="0" w:color="auto"/>
+              <w:bottom w:val="single" w:sz="2" w:space="0" w:color="auto"/>
+              <w:right w:val="single" w:sz="6" w:space="0" w:color="auto"/>
+            </w:tcBorders>
             <w:vAlign w:val="center"/>
+            <w:hideMark/>
           </w:tcPr>
           <w:p>
-            <w:pPr>
-              <w:rPr>
-                <w:rFonts w:cstheme="minorHAnsi"/>
-              </w:rPr>
-            </w:pPr>
             <w:r>
-              <w:rPr>
-                <w:rFonts w:cstheme="minorHAnsi"/>
-              </w:rPr>
-              <w:t>2.95</w:t>
+              <w:t>0.7517 ± 0.0112</w:t>
+            </w:r>
+          </w:p>
+        </w:tc>
+        <w:tc>
+          <w:tcPr>
+            <w:tcW w:w="0" w:type="auto"/>
+            <w:tcBorders>
+              <w:top w:val="single" w:sz="2" w:space="0" w:color="auto"/>
+              <w:left w:val="single" w:sz="2" w:space="0" w:color="auto"/>
+              <w:bottom w:val="single" w:sz="2" w:space="0" w:color="auto"/>
+              <w:right w:val="single" w:sz="6" w:space="0" w:color="auto"/>
+            </w:tcBorders>
+            <w:vAlign w:val="center"/>
+            <w:hideMark/>
+          </w:tcPr>
+          <w:p>
+            <w:r>
+              <w:t>0.0620 ± 0.0061</w:t>
+            </w:r>
+          </w:p>
+        </w:tc>
+        <w:tc>
+          <w:tcPr>
+            <w:tcW w:w="0" w:type="auto"/>
+            <w:tcBorders>
+              <w:top w:val="single" w:sz="2" w:space="0" w:color="auto"/>
+              <w:left w:val="single" w:sz="2" w:space="0" w:color="auto"/>
+              <w:bottom w:val="single" w:sz="2" w:space="0" w:color="auto"/>
+              <w:right w:val="single" w:sz="6" w:space="0" w:color="auto"/>
+            </w:tcBorders>
+            <w:vAlign w:val="center"/>
+            <w:hideMark/>
+          </w:tcPr>
+          <w:p>
+            <w:r>
+              <w:t>0.0771 ± 0.0227</w:t>
+            </w:r>
+          </w:p>
+        </w:tc>
+        <w:tc>
+          <w:tcPr>
+            <w:tcW w:w="0" w:type="auto"/>
+            <w:tcBorders>
+              <w:top w:val="single" w:sz="2" w:space="0" w:color="auto"/>
+              <w:left w:val="single" w:sz="2" w:space="0" w:color="auto"/>
+              <w:bottom w:val="single" w:sz="2" w:space="0" w:color="auto"/>
+              <w:right w:val="single" w:sz="2" w:space="0" w:color="auto"/>
+            </w:tcBorders>
+            <w:vAlign w:val="center"/>
+            <w:hideMark/>
+          </w:tcPr>
+          <w:p>
+            <w:r>
+              <w:t>3.40 ± 0.04</w:t>
             </w:r>
           </w:p>
         </w:tc>
@@ -9869,114 +9893,145 @@
       <w:tr>
         <w:tc>
           <w:tcPr>
-            <w:tcW w:w="1973" w:type="dxa"/>
+            <w:tcW w:w="0" w:type="auto"/>
+            <w:tcBorders>
+              <w:top w:val="single" w:sz="2" w:space="0" w:color="auto"/>
+              <w:left w:val="single" w:sz="2" w:space="0" w:color="auto"/>
+              <w:bottom w:val="single" w:sz="2" w:space="0" w:color="auto"/>
+              <w:right w:val="single" w:sz="6" w:space="0" w:color="auto"/>
+            </w:tcBorders>
             <w:vAlign w:val="center"/>
+            <w:hideMark/>
           </w:tcPr>
           <w:p>
-            <w:pPr>
-              <w:rPr>
-                <w:rFonts w:cstheme="minorHAnsi"/>
-              </w:rPr>
-            </w:pPr>
             <w:r>
-              <w:rPr>
-                <w:rFonts w:cstheme="minorHAnsi"/>
-              </w:rPr>
-              <w:t>Mixed</w:t>
-            </w:r>
-            <w:r>
-              <w:rPr>
-                <w:rFonts w:cstheme="minorHAnsi"/>
-              </w:rPr>
-              <w:t>-</w:t>
-            </w:r>
-            <w:r>
-              <w:rPr>
-                <w:rFonts w:cstheme="minorHAnsi"/>
-              </w:rPr>
-              <w:t>trained</w:t>
+              <w:t>Mixed-trained</w:t>
             </w:r>
           </w:p>
         </w:tc>
         <w:tc>
           <w:tcPr>
-            <w:tcW w:w="1558" w:type="dxa"/>
+            <w:tcW w:w="0" w:type="auto"/>
+            <w:tcBorders>
+              <w:top w:val="single" w:sz="2" w:space="0" w:color="auto"/>
+              <w:left w:val="single" w:sz="2" w:space="0" w:color="auto"/>
+              <w:bottom w:val="single" w:sz="2" w:space="0" w:color="auto"/>
+              <w:right w:val="single" w:sz="6" w:space="0" w:color="auto"/>
+            </w:tcBorders>
             <w:vAlign w:val="center"/>
+            <w:hideMark/>
           </w:tcPr>
           <w:p>
-            <w:pPr>
-              <w:rPr>
-                <w:rFonts w:cstheme="minorHAnsi"/>
-              </w:rPr>
-            </w:pPr>
             <w:r>
-              <w:rPr>
-                <w:rFonts w:cstheme="minorHAnsi"/>
-              </w:rPr>
-              <w:t>0.</w:t>
-            </w:r>
-            <w:r>
-              <w:rPr>
-                <w:rFonts w:cstheme="minorHAnsi"/>
-              </w:rPr>
-              <w:t>3151</w:t>
+              <w:t>0.3343 ± 0.0074</w:t>
             </w:r>
           </w:p>
         </w:tc>
         <w:tc>
           <w:tcPr>
-            <w:tcW w:w="1558" w:type="dxa"/>
+            <w:tcW w:w="0" w:type="auto"/>
+            <w:tcBorders>
+              <w:top w:val="single" w:sz="2" w:space="0" w:color="auto"/>
+              <w:left w:val="single" w:sz="2" w:space="0" w:color="auto"/>
+              <w:bottom w:val="single" w:sz="2" w:space="0" w:color="auto"/>
+              <w:right w:val="single" w:sz="6" w:space="0" w:color="auto"/>
+            </w:tcBorders>
             <w:vAlign w:val="center"/>
+            <w:hideMark/>
           </w:tcPr>
           <w:p>
-            <w:pPr>
-              <w:rPr>
-                <w:rFonts w:cstheme="minorHAnsi"/>
-              </w:rPr>
-            </w:pPr>
             <w:r>
-              <w:rPr>
-                <w:rFonts w:cstheme="minorHAnsi"/>
-              </w:rPr>
-              <w:t>1782</w:t>
+              <w:t>1521 ± 39</w:t>
             </w:r>
           </w:p>
         </w:tc>
         <w:tc>
           <w:tcPr>
-            <w:tcW w:w="1558" w:type="dxa"/>
+            <w:tcW w:w="0" w:type="auto"/>
+            <w:tcBorders>
+              <w:top w:val="single" w:sz="2" w:space="0" w:color="auto"/>
+              <w:left w:val="single" w:sz="2" w:space="0" w:color="auto"/>
+              <w:bottom w:val="single" w:sz="2" w:space="0" w:color="auto"/>
+              <w:right w:val="single" w:sz="6" w:space="0" w:color="auto"/>
+            </w:tcBorders>
             <w:vAlign w:val="center"/>
+            <w:hideMark/>
           </w:tcPr>
           <w:p>
-            <w:pPr>
-              <w:rPr>
-                <w:rFonts w:cstheme="minorHAnsi"/>
-              </w:rPr>
-            </w:pPr>
             <w:r>
-              <w:rPr>
-                <w:rFonts w:cstheme="minorHAnsi"/>
-              </w:rPr>
-              <w:t>0.7617</w:t>
+              <w:t>0.7762 ± 0.0106</w:t>
             </w:r>
           </w:p>
         </w:tc>
         <w:tc>
           <w:tcPr>
-            <w:tcW w:w="1559" w:type="dxa"/>
+            <w:tcW w:w="0" w:type="auto"/>
+            <w:tcBorders>
+              <w:top w:val="single" w:sz="2" w:space="0" w:color="auto"/>
+              <w:left w:val="single" w:sz="2" w:space="0" w:color="auto"/>
+              <w:bottom w:val="single" w:sz="2" w:space="0" w:color="auto"/>
+              <w:right w:val="single" w:sz="6" w:space="0" w:color="auto"/>
+            </w:tcBorders>
             <w:vAlign w:val="center"/>
+            <w:hideMark/>
           </w:tcPr>
           <w:p>
-            <w:pPr>
-              <w:rPr>
-                <w:rFonts w:cstheme="minorHAnsi"/>
-              </w:rPr>
-            </w:pPr>
             <w:r>
-              <w:rPr>
-                <w:rFonts w:cstheme="minorHAnsi"/>
-              </w:rPr>
-              <w:t>3.33</w:t>
+              <w:t>0.9448 ± 0.0073</w:t>
+            </w:r>
+          </w:p>
+        </w:tc>
+        <w:tc>
+          <w:tcPr>
+            <w:tcW w:w="0" w:type="auto"/>
+            <w:tcBorders>
+              <w:top w:val="single" w:sz="2" w:space="0" w:color="auto"/>
+              <w:left w:val="single" w:sz="2" w:space="0" w:color="auto"/>
+              <w:bottom w:val="single" w:sz="2" w:space="0" w:color="auto"/>
+              <w:right w:val="single" w:sz="6" w:space="0" w:color="auto"/>
+            </w:tcBorders>
+            <w:vAlign w:val="center"/>
+            <w:hideMark/>
+          </w:tcPr>
+          <w:p>
+            <w:r>
+              <w:t>0.0674 ± 0.0009</w:t>
+            </w:r>
+          </w:p>
+        </w:tc>
+        <w:tc>
+          <w:tcPr>
+            <w:tcW w:w="0" w:type="auto"/>
+            <w:tcBorders>
+              <w:top w:val="single" w:sz="2" w:space="0" w:color="auto"/>
+              <w:left w:val="single" w:sz="2" w:space="0" w:color="auto"/>
+              <w:bottom w:val="single" w:sz="2" w:space="0" w:color="auto"/>
+              <w:right w:val="single" w:sz="6" w:space="0" w:color="auto"/>
+            </w:tcBorders>
+            <w:vAlign w:val="center"/>
+            <w:hideMark/>
+          </w:tcPr>
+          <w:p>
+            <w:r>
+              <w:t>0.0356 ± 0.0015</w:t>
+            </w:r>
+          </w:p>
+        </w:tc>
+        <w:tc>
+          <w:tcPr>
+            <w:tcW w:w="0" w:type="auto"/>
+            <w:tcBorders>
+              <w:top w:val="single" w:sz="2" w:space="0" w:color="auto"/>
+              <w:left w:val="single" w:sz="2" w:space="0" w:color="auto"/>
+              <w:bottom w:val="single" w:sz="2" w:space="0" w:color="auto"/>
+              <w:right w:val="single" w:sz="2" w:space="0" w:color="auto"/>
+            </w:tcBorders>
+            <w:vAlign w:val="center"/>
+            <w:hideMark/>
+          </w:tcPr>
+          <w:p>
+            <w:r>
+              <w:t>3.70 ± 0.06</w:t>
             </w:r>
           </w:p>
         </w:tc>
@@ -9986,8 +10041,6 @@
       <w:pPr>
         <w:rPr>
           <w:rFonts w:cstheme="minorHAnsi"/>
-          <w:b/>
-          <w:bCs/>
         </w:rPr>
       </w:pPr>
     </w:p>
@@ -10013,29 +10066,11 @@
         <w:pStyle w:val="ListParagraph"/>
         <w:numPr>
           <w:ilvl w:val="0"/>
-          <w:numId w:val="106"/>
+          <w:numId w:val="100"/>
         </w:numPr>
-        <w:rPr>
-          <w:rFonts w:cstheme="minorHAnsi"/>
-        </w:rPr>
-      </w:pPr>
-      <w:r>
-        <w:rPr>
-          <w:rFonts w:cstheme="minorHAnsi"/>
-        </w:rPr>
-        <w:t>AI</w:t>
-      </w:r>
-      <w:r>
-        <w:rPr>
-          <w:rFonts w:cstheme="minorHAnsi"/>
-        </w:rPr>
-        <w:t>-</w:t>
-      </w:r>
-      <w:r>
-        <w:rPr>
-          <w:rFonts w:cstheme="minorHAnsi"/>
-        </w:rPr>
-        <w:t>trained models showed consistent degradation across all diversity metrics:</w:t>
+      </w:pPr>
+      <w:r>
+        <w:t>AI-trained models showed severe degradation across all diversity metrics:</w:t>
       </w:r>
     </w:p>
     <w:p>
@@ -10043,17 +10078,11 @@
         <w:pStyle w:val="ListParagraph"/>
         <w:numPr>
           <w:ilvl w:val="1"/>
-          <w:numId w:val="106"/>
+          <w:numId w:val="100"/>
         </w:numPr>
-        <w:rPr>
-          <w:rFonts w:cstheme="minorHAnsi"/>
-        </w:rPr>
-      </w:pPr>
-      <w:r>
-        <w:rPr>
-          <w:rFonts w:cstheme="minorHAnsi"/>
-        </w:rPr>
-        <w:t>TTR: 15.6% decline vs. human baseline</w:t>
+      </w:pPr>
+      <w:r>
+        <w:t>TTR: 15.6% decline vs. human baseline (0.3298 → 0.2783)</w:t>
       </w:r>
     </w:p>
     <w:p>
@@ -10061,23 +10090,11 @@
         <w:pStyle w:val="ListParagraph"/>
         <w:numPr>
           <w:ilvl w:val="1"/>
-          <w:numId w:val="106"/>
+          <w:numId w:val="100"/>
         </w:numPr>
-        <w:rPr>
-          <w:rFonts w:cstheme="minorHAnsi"/>
-        </w:rPr>
-      </w:pPr>
-      <w:r>
-        <w:rPr>
-          <w:rFonts w:cstheme="minorHAnsi"/>
-        </w:rPr>
-        <w:t>Vocabulary: 21.9% reduction</w:t>
-      </w:r>
-      <w:r>
-        <w:rPr>
-          <w:rFonts w:cstheme="minorHAnsi"/>
-        </w:rPr>
-        <w:tab/>
+      </w:pPr>
+      <w:r>
+        <w:t>Vocabulary: 20.5% reduction (1523 → 1211 unique tokens)</w:t>
       </w:r>
     </w:p>
     <w:p>
@@ -10085,17 +10102,41 @@
         <w:pStyle w:val="ListParagraph"/>
         <w:numPr>
           <w:ilvl w:val="1"/>
-          <w:numId w:val="106"/>
+          <w:numId w:val="100"/>
         </w:numPr>
-        <w:rPr>
-          <w:rFonts w:cstheme="minorHAnsi"/>
-        </w:rPr>
-      </w:pPr>
-      <w:r>
-        <w:rPr>
-          <w:rFonts w:cstheme="minorHAnsi"/>
-        </w:rPr>
-        <w:t>Bigram diversity: 23.7% decrease</w:t>
+      </w:pPr>
+      <w:r>
+        <w:t>Bigram Diversity: 22.3% decrease (0.7721 → 0.5998)</w:t>
+      </w:r>
+    </w:p>
+    <w:p>
+      <w:pPr>
+        <w:pStyle w:val="ListParagraph"/>
+        <w:numPr>
+          <w:ilvl w:val="1"/>
+          <w:numId w:val="100"/>
+        </w:numPr>
+      </w:pPr>
+      <w:r>
+        <w:t>Distinct-3: 20.3% decrease (0.9433 → 0.7517)</w:t>
+      </w:r>
+    </w:p>
+    <w:p>
+      <w:pPr>
+        <w:pStyle w:val="ListParagraph"/>
+        <w:numPr>
+          <w:ilvl w:val="1"/>
+          <w:numId w:val="100"/>
+        </w:numPr>
+      </w:pPr>
+      <w:r>
+        <w:t xml:space="preserve">Self-BLEU: −13.3% decrease (0.0715 → 0.0620) </w:t>
+      </w:r>
+      <w:r>
+        <w:t xml:space="preserve">- </w:t>
+      </w:r>
+      <w:r>
+        <w:t>unlike Llama, Self-BLEU does not confirm collapse here, as it measures surface-level output similarity rather than vocabulary breadth</w:t>
       </w:r>
     </w:p>
     <w:p>
@@ -10103,42 +10144,229 @@
         <w:pStyle w:val="ListParagraph"/>
         <w:numPr>
           <w:ilvl w:val="0"/>
-          <w:numId w:val="106"/>
+          <w:numId w:val="100"/>
         </w:numPr>
-        <w:rPr>
-          <w:rFonts w:cstheme="minorHAnsi"/>
-        </w:rPr>
-      </w:pPr>
-      <w:r>
-        <w:rPr>
-          <w:rFonts w:cstheme="minorHAnsi"/>
-        </w:rPr>
-        <w:t>Mixed</w:t>
-      </w:r>
-      <w:r>
-        <w:rPr>
-          <w:rFonts w:cstheme="minorHAnsi"/>
-        </w:rPr>
-        <w:t>-</w:t>
-      </w:r>
-      <w:r>
-        <w:rPr>
-          <w:rFonts w:cstheme="minorHAnsi"/>
-        </w:rPr>
-        <w:t>trained models matched or slightly exceeded human</w:t>
-      </w:r>
-      <w:r>
-        <w:rPr>
-          <w:rFonts w:cstheme="minorHAnsi"/>
-        </w:rPr>
-        <w:t>-</w:t>
-      </w:r>
-      <w:r>
-        <w:rPr>
-          <w:rFonts w:cstheme="minorHAnsi"/>
-        </w:rPr>
-        <w:t>trained performance across all metrics, suggesting that in larger models, 50% human data is sufficient to fully preserve linguistic diversity.</w:t>
-      </w:r>
+      </w:pPr>
+      <w:r>
+        <w:t xml:space="preserve">Distributional Narrowing: The AI-trained model's perplexity dropped significantly (3.69 → 3.40), with a notably low standard deviation (±0.04). This confirms that training on </w:t>
+      </w:r>
+      <w:r>
+        <w:lastRenderedPageBreak/>
+        <w:t>synthetic data causes the model to over-index on a simplified, repetitive subset of language.</w:t>
+      </w:r>
+    </w:p>
+    <w:p>
+      <w:pPr>
+        <w:pStyle w:val="ListParagraph"/>
+        <w:numPr>
+          <w:ilvl w:val="0"/>
+          <w:numId w:val="100"/>
+        </w:numPr>
+      </w:pPr>
+      <w:r>
+        <w:t>The Mixed-trained model showed only marginal degradation across all metrics, suggesting that even a 50% inclusion of human data can substantially delay the onset of total collapse.</w:t>
+      </w:r>
+    </w:p>
+    <w:p>
+      <w:pPr>
+        <w:pStyle w:val="ListParagraph"/>
+        <w:numPr>
+          <w:ilvl w:val="0"/>
+          <w:numId w:val="100"/>
+        </w:numPr>
+      </w:pPr>
+      <w:r>
+        <w:t>Effect Size: Comparisons between Human and AI models on TTR yielded a Cohen's d of ≈6.3 (pooled std from 3 seeds). This indicates a very large effect size, confirming that the observed collapse is a structural shift rather than a marginal fluctuation.</w:t>
+      </w:r>
+    </w:p>
+    <w:p>
+      <w:pPr>
+        <w:rPr>
+          <w:rFonts w:cstheme="minorHAnsi"/>
+        </w:rPr>
+      </w:pPr>
+    </w:p>
+    <w:p>
+      <w:pPr>
+        <w:rPr>
+          <w:rFonts w:cstheme="minorHAnsi"/>
+        </w:rPr>
+      </w:pPr>
+    </w:p>
+    <w:p>
+      <w:pPr>
+        <w:rPr>
+          <w:rFonts w:cstheme="minorHAnsi"/>
+        </w:rPr>
+      </w:pPr>
+    </w:p>
+    <w:p>
+      <w:pPr>
+        <w:rPr>
+          <w:rFonts w:cstheme="minorHAnsi"/>
+        </w:rPr>
+      </w:pPr>
+    </w:p>
+    <w:p>
+      <w:pPr>
+        <w:rPr>
+          <w:rFonts w:cstheme="minorHAnsi"/>
+        </w:rPr>
+      </w:pPr>
+    </w:p>
+    <w:p>
+      <w:pPr>
+        <w:rPr>
+          <w:rFonts w:cstheme="minorHAnsi"/>
+        </w:rPr>
+      </w:pPr>
+    </w:p>
+    <w:p>
+      <w:pPr>
+        <w:rPr>
+          <w:rFonts w:cstheme="minorHAnsi"/>
+        </w:rPr>
+      </w:pPr>
+    </w:p>
+    <w:p>
+      <w:pPr>
+        <w:rPr>
+          <w:rFonts w:cstheme="minorHAnsi"/>
+        </w:rPr>
+      </w:pPr>
+    </w:p>
+    <w:p>
+      <w:pPr>
+        <w:rPr>
+          <w:rFonts w:cstheme="minorHAnsi"/>
+        </w:rPr>
+      </w:pPr>
+    </w:p>
+    <w:p>
+      <w:pPr>
+        <w:rPr>
+          <w:rFonts w:cstheme="minorHAnsi"/>
+        </w:rPr>
+      </w:pPr>
+    </w:p>
+    <w:p>
+      <w:pPr>
+        <w:rPr>
+          <w:rFonts w:cstheme="minorHAnsi"/>
+        </w:rPr>
+      </w:pPr>
+    </w:p>
+    <w:p>
+      <w:pPr>
+        <w:rPr>
+          <w:rFonts w:cstheme="minorHAnsi"/>
+        </w:rPr>
+      </w:pPr>
+    </w:p>
+    <w:p>
+      <w:pPr>
+        <w:rPr>
+          <w:rFonts w:cstheme="minorHAnsi"/>
+        </w:rPr>
+      </w:pPr>
+    </w:p>
+    <w:p>
+      <w:pPr>
+        <w:rPr>
+          <w:rFonts w:cstheme="minorHAnsi"/>
+        </w:rPr>
+      </w:pPr>
+    </w:p>
+    <w:p>
+      <w:pPr>
+        <w:rPr>
+          <w:rFonts w:cstheme="minorHAnsi"/>
+        </w:rPr>
+      </w:pPr>
+    </w:p>
+    <w:p>
+      <w:pPr>
+        <w:rPr>
+          <w:rFonts w:cstheme="minorHAnsi"/>
+        </w:rPr>
+      </w:pPr>
+    </w:p>
+    <w:p>
+      <w:pPr>
+        <w:rPr>
+          <w:rFonts w:cstheme="minorHAnsi"/>
+        </w:rPr>
+      </w:pPr>
+    </w:p>
+    <w:p>
+      <w:pPr>
+        <w:rPr>
+          <w:rFonts w:cstheme="minorHAnsi"/>
+        </w:rPr>
+      </w:pPr>
+    </w:p>
+    <w:p>
+      <w:pPr>
+        <w:rPr>
+          <w:rFonts w:cstheme="minorHAnsi"/>
+        </w:rPr>
+      </w:pPr>
+    </w:p>
+    <w:p>
+      <w:pPr>
+        <w:rPr>
+          <w:rFonts w:cstheme="minorHAnsi"/>
+        </w:rPr>
+      </w:pPr>
+    </w:p>
+    <w:p>
+      <w:pPr>
+        <w:rPr>
+          <w:rFonts w:cstheme="minorHAnsi"/>
+        </w:rPr>
+      </w:pPr>
+    </w:p>
+    <w:p>
+      <w:pPr>
+        <w:rPr>
+          <w:rFonts w:cstheme="minorHAnsi"/>
+        </w:rPr>
+      </w:pPr>
+    </w:p>
+    <w:p>
+      <w:pPr>
+        <w:rPr>
+          <w:rFonts w:cstheme="minorHAnsi"/>
+        </w:rPr>
+      </w:pPr>
+    </w:p>
+    <w:p>
+      <w:pPr>
+        <w:rPr>
+          <w:rFonts w:cstheme="minorHAnsi"/>
+        </w:rPr>
+      </w:pPr>
+    </w:p>
+    <w:p>
+      <w:pPr>
+        <w:rPr>
+          <w:rFonts w:cstheme="minorHAnsi"/>
+        </w:rPr>
+      </w:pPr>
+    </w:p>
+    <w:p>
+      <w:pPr>
+        <w:rPr>
+          <w:rFonts w:cstheme="minorHAnsi"/>
+        </w:rPr>
+      </w:pPr>
+    </w:p>
+    <w:p>
+      <w:pPr>
+        <w:rPr>
+          <w:rFonts w:cstheme="minorHAnsi"/>
+        </w:rPr>
+      </w:pPr>
     </w:p>
     <w:p>
       <w:pPr>
@@ -10183,7 +10411,6 @@
           <w:rFonts w:cstheme="minorHAnsi"/>
           <w:noProof/>
         </w:rPr>
-        <w:lastRenderedPageBreak/>
         <w:drawing>
           <wp:inline distT="0" distB="0" distL="0" distR="0" wp14:anchorId="7CBC7120" wp14:editId="5B500926">
             <wp:extent cx="5943600" cy="3274695"/>
@@ -10258,6 +10485,7 @@
           <w:rFonts w:cstheme="minorHAnsi"/>
           <w:noProof/>
         </w:rPr>
+        <w:lastRenderedPageBreak/>
         <w:drawing>
           <wp:inline distT="0" distB="0" distL="0" distR="0" wp14:anchorId="79553826" wp14:editId="761AE37D">
             <wp:extent cx="5943600" cy="3274695"/>
@@ -10332,7 +10560,6 @@
           <w:rFonts w:cstheme="minorHAnsi"/>
           <w:noProof/>
         </w:rPr>
-        <w:lastRenderedPageBreak/>
         <w:drawing>
           <wp:inline distT="0" distB="0" distL="0" distR="0" wp14:anchorId="40687A12" wp14:editId="68B4CB7B">
             <wp:extent cx="5943600" cy="3274695"/>
@@ -10421,6 +10648,7 @@
           <w:rFonts w:cstheme="minorHAnsi"/>
           <w:noProof/>
         </w:rPr>
+        <w:lastRenderedPageBreak/>
         <w:drawing>
           <wp:inline distT="0" distB="0" distL="0" distR="0" wp14:anchorId="1A1AF7C5" wp14:editId="1EE02BBC">
             <wp:extent cx="5943600" cy="3686175"/>
@@ -10499,10 +10727,338 @@
         <w:rPr>
           <w:rFonts w:asciiTheme="minorHAnsi" w:hAnsiTheme="minorHAnsi" w:cstheme="minorHAnsi"/>
         </w:rPr>
+        <w:t>Discussion And Planned Work</w:t>
+      </w:r>
+      <w:bookmarkEnd w:id="17"/>
+    </w:p>
+    <w:p>
+      <w:pPr>
+        <w:pStyle w:val="Heading4"/>
+        <w:rPr>
+          <w:rFonts w:cstheme="minorHAnsi"/>
+        </w:rPr>
+      </w:pPr>
+      <w:r>
+        <w:rPr>
+          <w:rFonts w:cstheme="minorHAnsi"/>
+        </w:rPr>
+        <w:t>Discussion</w:t>
+      </w:r>
+    </w:p>
+    <w:p>
+      <w:pPr>
+        <w:rPr>
+          <w:rFonts w:cstheme="minorHAnsi"/>
+        </w:rPr>
+      </w:pPr>
+      <w:r>
+        <w:rPr>
+          <w:rFonts w:cstheme="minorHAnsi"/>
+        </w:rPr>
+        <w:t>This study investigated whether fine</w:t>
+      </w:r>
+      <w:r>
+        <w:rPr>
+          <w:rFonts w:cstheme="minorHAnsi"/>
+        </w:rPr>
+        <w:t>-</w:t>
+      </w:r>
+      <w:r>
+        <w:rPr>
+          <w:rFonts w:cstheme="minorHAnsi"/>
+        </w:rPr>
+        <w:t>tuning LLMs on AI</w:t>
+      </w:r>
+      <w:r>
+        <w:rPr>
+          <w:rFonts w:cstheme="minorHAnsi"/>
+        </w:rPr>
+        <w:t>-</w:t>
+      </w:r>
+      <w:r>
+        <w:rPr>
+          <w:rFonts w:cstheme="minorHAnsi"/>
+        </w:rPr>
+        <w:t>generated data causes measurable linguistic degradation, and whether these patterns generalize across model sizes. The results consistently confirm the hypothesis: AI</w:t>
+      </w:r>
+      <w:r>
+        <w:rPr>
+          <w:rFonts w:cstheme="minorHAnsi"/>
+        </w:rPr>
+        <w:t>-</w:t>
+      </w:r>
+      <w:r>
+        <w:rPr>
+          <w:rFonts w:cstheme="minorHAnsi"/>
+        </w:rPr>
+        <w:t>trained models showed significant collapse across all diversity metrics.</w:t>
+      </w:r>
+    </w:p>
+    <w:p>
+      <w:pPr>
+        <w:rPr>
+          <w:rFonts w:cstheme="minorHAnsi"/>
+        </w:rPr>
+      </w:pPr>
+      <w:r>
+        <w:rPr>
+          <w:rFonts w:cstheme="minorHAnsi"/>
+        </w:rPr>
+        <w:t>A significant finding is the degradation level in Llama</w:t>
+      </w:r>
+      <w:r>
+        <w:rPr>
+          <w:rFonts w:cstheme="minorHAnsi"/>
+        </w:rPr>
+        <w:t>-</w:t>
+      </w:r>
+      <w:r>
+        <w:rPr>
+          <w:rFonts w:cstheme="minorHAnsi"/>
+        </w:rPr>
+        <w:t>3.2</w:t>
+      </w:r>
+      <w:r>
+        <w:rPr>
+          <w:rFonts w:cstheme="minorHAnsi"/>
+        </w:rPr>
+        <w:t>-</w:t>
+      </w:r>
+      <w:r>
+        <w:rPr>
+          <w:rFonts w:cstheme="minorHAnsi"/>
+        </w:rPr>
+        <w:t>1B when trained on AI</w:t>
+      </w:r>
+      <w:r>
+        <w:rPr>
+          <w:rFonts w:cstheme="minorHAnsi"/>
+        </w:rPr>
+        <w:t>-</w:t>
+      </w:r>
+      <w:r>
+        <w:rPr>
+          <w:rFonts w:cstheme="minorHAnsi"/>
+        </w:rPr>
+        <w:t xml:space="preserve">generated data </w:t>
+      </w:r>
+      <w:r>
+        <w:rPr>
+          <w:rFonts w:cstheme="minorHAnsi"/>
+        </w:rPr>
+        <w:t>-</w:t>
+      </w:r>
+      <w:r>
+        <w:rPr>
+          <w:rFonts w:cstheme="minorHAnsi"/>
+        </w:rPr>
+        <w:t xml:space="preserve"> a 28</w:t>
+      </w:r>
+      <w:r>
+        <w:rPr>
+          <w:rFonts w:cstheme="minorHAnsi"/>
+        </w:rPr>
+        <w:t>-</w:t>
+      </w:r>
+      <w:r>
+        <w:rPr>
+          <w:rFonts w:cstheme="minorHAnsi"/>
+        </w:rPr>
+        <w:t xml:space="preserve">32% decline in lexical diversity metrics (Cohen's d = 9.37), indicating this is a structural shift rather than statistical noise. This aligns with Shumailov et al. [1] and Herel &amp; </w:t>
+      </w:r>
+      <w:proofErr w:type="spellStart"/>
+      <w:r>
+        <w:rPr>
+          <w:rFonts w:cstheme="minorHAnsi"/>
+        </w:rPr>
+        <w:t>Mikolov</w:t>
+      </w:r>
+      <w:proofErr w:type="spellEnd"/>
+      <w:r>
+        <w:rPr>
+          <w:rFonts w:cstheme="minorHAnsi"/>
+        </w:rPr>
+        <w:t xml:space="preserve"> [3], who predicted that synthetic training causes models to over</w:t>
+      </w:r>
+      <w:r>
+        <w:rPr>
+          <w:rFonts w:cstheme="minorHAnsi"/>
+        </w:rPr>
+        <w:t>-</w:t>
+      </w:r>
+      <w:r>
+        <w:rPr>
+          <w:rFonts w:cstheme="minorHAnsi"/>
+        </w:rPr>
+        <w:t>index on high</w:t>
+      </w:r>
+      <w:r>
+        <w:rPr>
+          <w:rFonts w:cstheme="minorHAnsi"/>
+        </w:rPr>
+        <w:t>-</w:t>
+      </w:r>
+      <w:r>
+        <w:rPr>
+          <w:rFonts w:cstheme="minorHAnsi"/>
+        </w:rPr>
+        <w:t>probability, repetitive outputs. The sharp perplexity drop (7.03 → 3.07) further confirms that the model became highly "confident" but in a narrower linguistic space.</w:t>
+      </w:r>
+    </w:p>
+    <w:p>
+      <w:pPr>
+        <w:rPr>
+          <w:rFonts w:cstheme="minorHAnsi"/>
+        </w:rPr>
+      </w:pPr>
+      <w:r>
+        <w:rPr>
+          <w:rFonts w:cstheme="minorHAnsi"/>
+        </w:rPr>
+        <w:t>Mistral</w:t>
+      </w:r>
+      <w:r>
+        <w:rPr>
+          <w:rFonts w:cstheme="minorHAnsi"/>
+        </w:rPr>
+        <w:t>-</w:t>
+      </w:r>
+      <w:r>
+        <w:rPr>
+          <w:rFonts w:cstheme="minorHAnsi"/>
+        </w:rPr>
+        <w:t>7B showed the same collapse but at a lower magnitude (16</w:t>
+      </w:r>
+      <w:r>
+        <w:rPr>
+          <w:rFonts w:cstheme="minorHAnsi"/>
+        </w:rPr>
+        <w:t>-</w:t>
+      </w:r>
+      <w:r>
+        <w:rPr>
+          <w:rFonts w:cstheme="minorHAnsi"/>
+        </w:rPr>
+        <w:t>24% degradation), suggesting larger models retain more of their diversity even after fine</w:t>
+      </w:r>
+      <w:r>
+        <w:rPr>
+          <w:rFonts w:cstheme="minorHAnsi"/>
+        </w:rPr>
+        <w:t>-</w:t>
+      </w:r>
+      <w:r>
+        <w:rPr>
+          <w:rFonts w:cstheme="minorHAnsi"/>
+        </w:rPr>
+        <w:t xml:space="preserve">tuning on degraded data [5][6]. This finding has practical implications </w:t>
+      </w:r>
+      <w:r>
+        <w:rPr>
+          <w:rFonts w:cstheme="minorHAnsi"/>
+        </w:rPr>
+        <w:t>-</w:t>
+      </w:r>
+      <w:r>
+        <w:rPr>
+          <w:rFonts w:cstheme="minorHAnsi"/>
+        </w:rPr>
+        <w:t xml:space="preserve"> model scale may guard against collapse but does not prevent it.</w:t>
+      </w:r>
+    </w:p>
+    <w:p>
+      <w:pPr>
+        <w:rPr>
+          <w:rFonts w:cstheme="minorHAnsi"/>
+        </w:rPr>
+      </w:pPr>
+      <w:r>
+        <w:rPr>
+          <w:rFonts w:cstheme="minorHAnsi"/>
+        </w:rPr>
         <w:lastRenderedPageBreak/>
-        <w:t>Discussion And Planned Work</w:t>
-      </w:r>
-      <w:bookmarkEnd w:id="17"/>
+        <w:t>The mixed</w:t>
+      </w:r>
+      <w:r>
+        <w:rPr>
+          <w:rFonts w:cstheme="minorHAnsi"/>
+        </w:rPr>
+        <w:t>-</w:t>
+      </w:r>
+      <w:r>
+        <w:rPr>
+          <w:rFonts w:cstheme="minorHAnsi"/>
+        </w:rPr>
+        <w:t>dataset results are the most novel contribution of this study. In Llama, mixed training showed only marginal degradation relative to human</w:t>
+      </w:r>
+      <w:r>
+        <w:rPr>
+          <w:rFonts w:cstheme="minorHAnsi"/>
+        </w:rPr>
+        <w:t>-</w:t>
+      </w:r>
+      <w:r>
+        <w:rPr>
+          <w:rFonts w:cstheme="minorHAnsi"/>
+        </w:rPr>
+        <w:t>trained models. In Mistral, mixed training matched or exceeded human</w:t>
+      </w:r>
+      <w:r>
+        <w:rPr>
+          <w:rFonts w:cstheme="minorHAnsi"/>
+        </w:rPr>
+        <w:t>-</w:t>
+      </w:r>
+      <w:r>
+        <w:rPr>
+          <w:rFonts w:cstheme="minorHAnsi"/>
+        </w:rPr>
+        <w:t xml:space="preserve">trained performance across all metrics </w:t>
+      </w:r>
+      <w:r>
+        <w:rPr>
+          <w:rFonts w:cstheme="minorHAnsi"/>
+        </w:rPr>
+        <w:t>-</w:t>
+      </w:r>
+      <w:r>
+        <w:rPr>
+          <w:rFonts w:cstheme="minorHAnsi"/>
+        </w:rPr>
+        <w:t xml:space="preserve"> suggesting that in larger models, 50% human data is sufficient to anchor the model's linguistic distribution and prevent collapse entirely. This is consistent with Amin et al. [8], who showed that even weak human data substantially resists collapse.</w:t>
+      </w:r>
+    </w:p>
+    <w:p>
+      <w:pPr>
+        <w:rPr>
+          <w:rFonts w:cstheme="minorHAnsi"/>
+        </w:rPr>
+      </w:pPr>
+      <w:r>
+        <w:rPr>
+          <w:rFonts w:cstheme="minorHAnsi"/>
+        </w:rPr>
+        <w:t>These findings have practical implications. As AI</w:t>
+      </w:r>
+      <w:r>
+        <w:rPr>
+          <w:rFonts w:cstheme="minorHAnsi"/>
+        </w:rPr>
+        <w:t>-</w:t>
+      </w:r>
+      <w:r>
+        <w:rPr>
+          <w:rFonts w:cstheme="minorHAnsi"/>
+        </w:rPr>
+        <w:t>generated content proliferates online, future training datasets will inevitably contain synthetic text. Our results suggest that maintaining even a 50% human data ratio may be sufficient to preserve output quality, a more achievable threshold than filtering all synthetic content.</w:t>
+      </w:r>
+    </w:p>
+    <w:p>
+      <w:pPr>
+        <w:rPr>
+          <w:rFonts w:cstheme="minorHAnsi"/>
+        </w:rPr>
+      </w:pPr>
     </w:p>
     <w:p>
       <w:pPr>
@@ -10515,20 +11071,20 @@
         <w:rPr>
           <w:rFonts w:cstheme="minorHAnsi"/>
         </w:rPr>
-        <w:t>Discussion</w:t>
-      </w:r>
-    </w:p>
-    <w:p>
-      <w:pPr>
-        <w:rPr>
-          <w:rFonts w:cstheme="minorHAnsi"/>
-        </w:rPr>
-      </w:pPr>
-      <w:r>
-        <w:rPr>
-          <w:rFonts w:cstheme="minorHAnsi"/>
-        </w:rPr>
-        <w:t>This study investigated whether fine</w:t>
+        <w:t>Planned Work</w:t>
+      </w:r>
+    </w:p>
+    <w:p>
+      <w:pPr>
+        <w:rPr>
+          <w:rFonts w:cstheme="minorHAnsi"/>
+        </w:rPr>
+      </w:pPr>
+      <w:r>
+        <w:rPr>
+          <w:rFonts w:cstheme="minorHAnsi"/>
+        </w:rPr>
+        <w:t xml:space="preserve">This phase established the experimental framework and confirmed collapse across two model architectures. The following phases will extend these findings by applying factual diversity metrics (hallucination detection, entity coverage) to complement the lexical analysis, and by executing recursive training experiments </w:t>
       </w:r>
       <w:r>
         <w:rPr>
@@ -10540,7 +11096,7 @@
         <w:rPr>
           <w:rFonts w:cstheme="minorHAnsi"/>
         </w:rPr>
-        <w:t>tuning LLMs on AI</w:t>
+        <w:t xml:space="preserve"> training Gen 2 models on Gen 1 AI output </w:t>
       </w:r>
       <w:r>
         <w:rPr>
@@ -10552,362 +11108,6 @@
         <w:rPr>
           <w:rFonts w:cstheme="minorHAnsi"/>
         </w:rPr>
-        <w:t>generated data causes measurable linguistic degradation, and whether these patterns generalize across model sizes. The results consistently confirm the hypothesis: AI</w:t>
-      </w:r>
-      <w:r>
-        <w:rPr>
-          <w:rFonts w:cstheme="minorHAnsi"/>
-        </w:rPr>
-        <w:t>-</w:t>
-      </w:r>
-      <w:r>
-        <w:rPr>
-          <w:rFonts w:cstheme="minorHAnsi"/>
-        </w:rPr>
-        <w:t xml:space="preserve">trained models showed significant collapse across all </w:t>
-      </w:r>
-      <w:proofErr w:type="gramStart"/>
-      <w:r>
-        <w:rPr>
-          <w:rFonts w:cstheme="minorHAnsi"/>
-        </w:rPr>
-        <w:t>diversity</w:t>
-      </w:r>
-      <w:proofErr w:type="gramEnd"/>
-      <w:r>
-        <w:rPr>
-          <w:rFonts w:cstheme="minorHAnsi"/>
-        </w:rPr>
-        <w:t xml:space="preserve"> metrics.</w:t>
-      </w:r>
-    </w:p>
-    <w:p>
-      <w:pPr>
-        <w:rPr>
-          <w:rFonts w:cstheme="minorHAnsi"/>
-        </w:rPr>
-      </w:pPr>
-      <w:r>
-        <w:rPr>
-          <w:rFonts w:cstheme="minorHAnsi"/>
-        </w:rPr>
-        <w:t>A significant finding is the degradation level in Llama</w:t>
-      </w:r>
-      <w:r>
-        <w:rPr>
-          <w:rFonts w:cstheme="minorHAnsi"/>
-        </w:rPr>
-        <w:t>-</w:t>
-      </w:r>
-      <w:r>
-        <w:rPr>
-          <w:rFonts w:cstheme="minorHAnsi"/>
-        </w:rPr>
-        <w:t>3.2</w:t>
-      </w:r>
-      <w:r>
-        <w:rPr>
-          <w:rFonts w:cstheme="minorHAnsi"/>
-        </w:rPr>
-        <w:t>-</w:t>
-      </w:r>
-      <w:r>
-        <w:rPr>
-          <w:rFonts w:cstheme="minorHAnsi"/>
-        </w:rPr>
-        <w:t>1B when trained on AI</w:t>
-      </w:r>
-      <w:r>
-        <w:rPr>
-          <w:rFonts w:cstheme="minorHAnsi"/>
-        </w:rPr>
-        <w:t>-</w:t>
-      </w:r>
-      <w:r>
-        <w:rPr>
-          <w:rFonts w:cstheme="minorHAnsi"/>
-        </w:rPr>
-        <w:t xml:space="preserve">generated data </w:t>
-      </w:r>
-      <w:r>
-        <w:rPr>
-          <w:rFonts w:cstheme="minorHAnsi"/>
-        </w:rPr>
-        <w:t>-</w:t>
-      </w:r>
-      <w:r>
-        <w:rPr>
-          <w:rFonts w:cstheme="minorHAnsi"/>
-        </w:rPr>
-        <w:t xml:space="preserve"> a 28</w:t>
-      </w:r>
-      <w:r>
-        <w:rPr>
-          <w:rFonts w:cstheme="minorHAnsi"/>
-        </w:rPr>
-        <w:t>-</w:t>
-      </w:r>
-      <w:r>
-        <w:rPr>
-          <w:rFonts w:cstheme="minorHAnsi"/>
-        </w:rPr>
-        <w:t xml:space="preserve">32% decline in lexical diversity metrics (Cohen's d = 9.37), indicating this is a structural shift rather than statistical noise. This aligns with Shumailov et al. [1] and Herel &amp; </w:t>
-      </w:r>
-      <w:proofErr w:type="spellStart"/>
-      <w:r>
-        <w:rPr>
-          <w:rFonts w:cstheme="minorHAnsi"/>
-        </w:rPr>
-        <w:t>Mikolov</w:t>
-      </w:r>
-      <w:proofErr w:type="spellEnd"/>
-      <w:r>
-        <w:rPr>
-          <w:rFonts w:cstheme="minorHAnsi"/>
-        </w:rPr>
-        <w:t xml:space="preserve"> [3], who predicted that synthetic training causes models to over</w:t>
-      </w:r>
-      <w:r>
-        <w:rPr>
-          <w:rFonts w:cstheme="minorHAnsi"/>
-        </w:rPr>
-        <w:t>-</w:t>
-      </w:r>
-      <w:r>
-        <w:rPr>
-          <w:rFonts w:cstheme="minorHAnsi"/>
-        </w:rPr>
-        <w:t>index on high</w:t>
-      </w:r>
-      <w:r>
-        <w:rPr>
-          <w:rFonts w:cstheme="minorHAnsi"/>
-        </w:rPr>
-        <w:t>-</w:t>
-      </w:r>
-      <w:r>
-        <w:rPr>
-          <w:rFonts w:cstheme="minorHAnsi"/>
-        </w:rPr>
-        <w:t>probability, repetitive outputs. The sharp perplexity drop (7.03 → 3.07) further confirms that the model became highly "confident" but in a narrower linguistic space.</w:t>
-      </w:r>
-    </w:p>
-    <w:p>
-      <w:pPr>
-        <w:rPr>
-          <w:rFonts w:cstheme="minorHAnsi"/>
-        </w:rPr>
-      </w:pPr>
-      <w:r>
-        <w:rPr>
-          <w:rFonts w:cstheme="minorHAnsi"/>
-        </w:rPr>
-        <w:t>Mistral</w:t>
-      </w:r>
-      <w:r>
-        <w:rPr>
-          <w:rFonts w:cstheme="minorHAnsi"/>
-        </w:rPr>
-        <w:t>-</w:t>
-      </w:r>
-      <w:r>
-        <w:rPr>
-          <w:rFonts w:cstheme="minorHAnsi"/>
-        </w:rPr>
-        <w:t>7B showed the same collapse but at a lower magnitude (16</w:t>
-      </w:r>
-      <w:r>
-        <w:rPr>
-          <w:rFonts w:cstheme="minorHAnsi"/>
-        </w:rPr>
-        <w:t>-</w:t>
-      </w:r>
-      <w:r>
-        <w:rPr>
-          <w:rFonts w:cstheme="minorHAnsi"/>
-        </w:rPr>
-        <w:t>24% degradation), suggesting larger models retain more of their diversity even after fine</w:t>
-      </w:r>
-      <w:r>
-        <w:rPr>
-          <w:rFonts w:cstheme="minorHAnsi"/>
-        </w:rPr>
-        <w:t>-</w:t>
-      </w:r>
-      <w:r>
-        <w:rPr>
-          <w:rFonts w:cstheme="minorHAnsi"/>
-        </w:rPr>
-        <w:t xml:space="preserve">tuning on degraded data [5][6]. This finding has practical implications </w:t>
-      </w:r>
-      <w:r>
-        <w:rPr>
-          <w:rFonts w:cstheme="minorHAnsi"/>
-        </w:rPr>
-        <w:t>-</w:t>
-      </w:r>
-      <w:r>
-        <w:rPr>
-          <w:rFonts w:cstheme="minorHAnsi"/>
-        </w:rPr>
-        <w:t xml:space="preserve"> model </w:t>
-      </w:r>
-      <w:proofErr w:type="gramStart"/>
-      <w:r>
-        <w:rPr>
-          <w:rFonts w:cstheme="minorHAnsi"/>
-        </w:rPr>
-        <w:t>scale</w:t>
-      </w:r>
-      <w:proofErr w:type="gramEnd"/>
-      <w:r>
-        <w:rPr>
-          <w:rFonts w:cstheme="minorHAnsi"/>
-        </w:rPr>
-        <w:t xml:space="preserve"> may guard against collapse but does not prevent it.</w:t>
-      </w:r>
-    </w:p>
-    <w:p>
-      <w:pPr>
-        <w:rPr>
-          <w:rFonts w:cstheme="minorHAnsi"/>
-        </w:rPr>
-      </w:pPr>
-      <w:r>
-        <w:rPr>
-          <w:rFonts w:cstheme="minorHAnsi"/>
-        </w:rPr>
-        <w:t>The mixed</w:t>
-      </w:r>
-      <w:r>
-        <w:rPr>
-          <w:rFonts w:cstheme="minorHAnsi"/>
-        </w:rPr>
-        <w:t>-</w:t>
-      </w:r>
-      <w:r>
-        <w:rPr>
-          <w:rFonts w:cstheme="minorHAnsi"/>
-        </w:rPr>
-        <w:t>dataset results are the most novel contribution of this study. In Llama, mixed training showed only marginal degradation relative to human</w:t>
-      </w:r>
-      <w:r>
-        <w:rPr>
-          <w:rFonts w:cstheme="minorHAnsi"/>
-        </w:rPr>
-        <w:t>-</w:t>
-      </w:r>
-      <w:r>
-        <w:rPr>
-          <w:rFonts w:cstheme="minorHAnsi"/>
-        </w:rPr>
-        <w:t>trained models. In Mistral, mixed training matched or exceeded human</w:t>
-      </w:r>
-      <w:r>
-        <w:rPr>
-          <w:rFonts w:cstheme="minorHAnsi"/>
-        </w:rPr>
-        <w:t>-</w:t>
-      </w:r>
-      <w:r>
-        <w:rPr>
-          <w:rFonts w:cstheme="minorHAnsi"/>
-        </w:rPr>
-        <w:t xml:space="preserve">trained performance across all metrics </w:t>
-      </w:r>
-      <w:r>
-        <w:rPr>
-          <w:rFonts w:cstheme="minorHAnsi"/>
-        </w:rPr>
-        <w:t>-</w:t>
-      </w:r>
-      <w:r>
-        <w:rPr>
-          <w:rFonts w:cstheme="minorHAnsi"/>
-        </w:rPr>
-        <w:t xml:space="preserve"> suggesting that in larger models, 50% human data is sufficient to anchor the model's linguistic distribution and prevent collapse entirely. This is consistent with Amin et al. [8], who showed that even weak human data substantially resists collapse.</w:t>
-      </w:r>
-    </w:p>
-    <w:p>
-      <w:pPr>
-        <w:rPr>
-          <w:rFonts w:cstheme="minorHAnsi"/>
-        </w:rPr>
-      </w:pPr>
-      <w:r>
-        <w:rPr>
-          <w:rFonts w:cstheme="minorHAnsi"/>
-        </w:rPr>
-        <w:t>These findings have practical implications. As AI</w:t>
-      </w:r>
-      <w:r>
-        <w:rPr>
-          <w:rFonts w:cstheme="minorHAnsi"/>
-        </w:rPr>
-        <w:t>-</w:t>
-      </w:r>
-      <w:r>
-        <w:rPr>
-          <w:rFonts w:cstheme="minorHAnsi"/>
-        </w:rPr>
-        <w:t>generated content proliferates online, future training datasets will inevitably contain synthetic text. Our results suggest that maintaining even a 50% human data ratio may be sufficient to preserve output quality, a more achievable threshold than filtering all synthetic content.</w:t>
-      </w:r>
-    </w:p>
-    <w:p>
-      <w:pPr>
-        <w:rPr>
-          <w:rFonts w:cstheme="minorHAnsi"/>
-        </w:rPr>
-      </w:pPr>
-    </w:p>
-    <w:p>
-      <w:pPr>
-        <w:pStyle w:val="Heading4"/>
-        <w:rPr>
-          <w:rFonts w:cstheme="minorHAnsi"/>
-        </w:rPr>
-      </w:pPr>
-      <w:r>
-        <w:rPr>
-          <w:rFonts w:cstheme="minorHAnsi"/>
-        </w:rPr>
-        <w:t>Planned Work</w:t>
-      </w:r>
-    </w:p>
-    <w:p>
-      <w:pPr>
-        <w:rPr>
-          <w:rFonts w:cstheme="minorHAnsi"/>
-        </w:rPr>
-      </w:pPr>
-      <w:r>
-        <w:rPr>
-          <w:rFonts w:cstheme="minorHAnsi"/>
-        </w:rPr>
-        <w:t xml:space="preserve">This phase established the experimental framework and confirmed collapse across two model architectures. The following phases will extend these findings by applying factual diversity metrics (hallucination detection, entity coverage) to complement the lexical analysis, and by executing recursive training experiments </w:t>
-      </w:r>
-      <w:r>
-        <w:rPr>
-          <w:rFonts w:cstheme="minorHAnsi"/>
-        </w:rPr>
-        <w:t>-</w:t>
-      </w:r>
-      <w:r>
-        <w:rPr>
-          <w:rFonts w:cstheme="minorHAnsi"/>
-        </w:rPr>
-        <w:t xml:space="preserve"> training Gen 2 models on Gen 1 AI output </w:t>
-      </w:r>
-      <w:r>
-        <w:rPr>
-          <w:rFonts w:cstheme="minorHAnsi"/>
-        </w:rPr>
-        <w:t>-</w:t>
-      </w:r>
-      <w:r>
-        <w:rPr>
-          <w:rFonts w:cstheme="minorHAnsi"/>
-        </w:rPr>
         <w:t xml:space="preserve"> to test whether collapse accelerates across generations.</w:t>
       </w:r>
     </w:p>
@@ -10923,7 +11123,6 @@
         <w:rPr>
           <w:rFonts w:asciiTheme="minorHAnsi" w:hAnsiTheme="minorHAnsi" w:cstheme="minorHAnsi"/>
         </w:rPr>
-        <w:lastRenderedPageBreak/>
         <w:t>Acknowledgements</w:t>
       </w:r>
       <w:bookmarkEnd w:id="18"/>
@@ -11153,49 +11352,7 @@
         <w:rPr>
           <w:rFonts w:cstheme="minorHAnsi"/>
         </w:rPr>
-        <w:t xml:space="preserve">, S. (2018). Which training </w:t>
-      </w:r>
-      <w:proofErr w:type="gramStart"/>
-      <w:r>
-        <w:rPr>
-          <w:rFonts w:cstheme="minorHAnsi"/>
-        </w:rPr>
-        <w:t>methods for</w:t>
-      </w:r>
-      <w:proofErr w:type="gramEnd"/>
-      <w:r>
-        <w:rPr>
-          <w:rFonts w:cstheme="minorHAnsi"/>
-        </w:rPr>
-        <w:t xml:space="preserve"> </w:t>
-      </w:r>
-      <w:proofErr w:type="gramStart"/>
-      <w:r>
-        <w:rPr>
-          <w:rFonts w:cstheme="minorHAnsi"/>
-        </w:rPr>
-        <w:t>GANs do</w:t>
-      </w:r>
-      <w:proofErr w:type="gramEnd"/>
-      <w:r>
-        <w:rPr>
-          <w:rFonts w:cstheme="minorHAnsi"/>
-        </w:rPr>
-        <w:t xml:space="preserve"> </w:t>
-      </w:r>
-      <w:proofErr w:type="gramStart"/>
-      <w:r>
-        <w:rPr>
-          <w:rFonts w:cstheme="minorHAnsi"/>
-        </w:rPr>
-        <w:t>actually converge</w:t>
-      </w:r>
-      <w:proofErr w:type="gramEnd"/>
-      <w:r>
-        <w:rPr>
-          <w:rFonts w:cstheme="minorHAnsi"/>
-        </w:rPr>
-        <w:t xml:space="preserve">? In </w:t>
+        <w:t xml:space="preserve">, S. (2018). Which training methods for GANs do actually converge? In </w:t>
       </w:r>
       <w:r>
         <w:rPr>
@@ -11231,6 +11388,7 @@
         <w:rPr>
           <w:rFonts w:cstheme="minorHAnsi"/>
         </w:rPr>
+        <w:lastRenderedPageBreak/>
         <w:t>[</w:t>
       </w:r>
       <w:r>
@@ -11537,7 +11695,6 @@
         <w:rPr>
           <w:rFonts w:cstheme="minorHAnsi"/>
         </w:rPr>
-        <w:lastRenderedPageBreak/>
         <w:t xml:space="preserve">[9] </w:t>
       </w:r>
       <w:r>
@@ -11733,6 +11890,155 @@
     </w:lvl>
   </w:abstractNum>
   <w:abstractNum w:abstractNumId="1" w15:restartNumberingAfterBreak="0">
+    <w:nsid w:val="015242A4"/>
+    <w:multiLevelType w:val="multilevel"/>
+    <w:tmpl w:val="7E949470"/>
+    <w:lvl w:ilvl="0">
+      <w:start w:val="1"/>
+      <w:numFmt w:val="bullet"/>
+      <w:lvlText w:val=""/>
+      <w:lvlJc w:val="left"/>
+      <w:pPr>
+        <w:tabs>
+          <w:tab w:val="num" w:pos="720"/>
+        </w:tabs>
+        <w:ind w:left="720" w:hanging="360"/>
+      </w:pPr>
+      <w:rPr>
+        <w:rFonts w:ascii="Symbol" w:hAnsi="Symbol" w:hint="default"/>
+        <w:sz w:val="20"/>
+      </w:rPr>
+    </w:lvl>
+    <w:lvl w:ilvl="1">
+      <w:start w:val="1"/>
+      <w:numFmt w:val="bullet"/>
+      <w:lvlText w:val=""/>
+      <w:lvlJc w:val="left"/>
+      <w:pPr>
+        <w:tabs>
+          <w:tab w:val="num" w:pos="1440"/>
+        </w:tabs>
+        <w:ind w:left="1440" w:hanging="360"/>
+      </w:pPr>
+      <w:rPr>
+        <w:rFonts w:ascii="Symbol" w:hAnsi="Symbol" w:hint="default"/>
+        <w:sz w:val="20"/>
+      </w:rPr>
+    </w:lvl>
+    <w:lvl w:ilvl="2" w:tentative="1">
+      <w:start w:val="1"/>
+      <w:numFmt w:val="bullet"/>
+      <w:lvlText w:val=""/>
+      <w:lvlJc w:val="left"/>
+      <w:pPr>
+        <w:tabs>
+          <w:tab w:val="num" w:pos="2160"/>
+        </w:tabs>
+        <w:ind w:left="2160" w:hanging="360"/>
+      </w:pPr>
+      <w:rPr>
+        <w:rFonts w:ascii="Symbol" w:hAnsi="Symbol" w:hint="default"/>
+        <w:sz w:val="20"/>
+      </w:rPr>
+    </w:lvl>
+    <w:lvl w:ilvl="3" w:tentative="1">
+      <w:start w:val="1"/>
+      <w:numFmt w:val="bullet"/>
+      <w:lvlText w:val=""/>
+      <w:lvlJc w:val="left"/>
+      <w:pPr>
+        <w:tabs>
+          <w:tab w:val="num" w:pos="2880"/>
+        </w:tabs>
+        <w:ind w:left="2880" w:hanging="360"/>
+      </w:pPr>
+      <w:rPr>
+        <w:rFonts w:ascii="Symbol" w:hAnsi="Symbol" w:hint="default"/>
+        <w:sz w:val="20"/>
+      </w:rPr>
+    </w:lvl>
+    <w:lvl w:ilvl="4" w:tentative="1">
+      <w:start w:val="1"/>
+      <w:numFmt w:val="bullet"/>
+      <w:lvlText w:val=""/>
+      <w:lvlJc w:val="left"/>
+      <w:pPr>
+        <w:tabs>
+          <w:tab w:val="num" w:pos="3600"/>
+        </w:tabs>
+        <w:ind w:left="3600" w:hanging="360"/>
+      </w:pPr>
+      <w:rPr>
+        <w:rFonts w:ascii="Symbol" w:hAnsi="Symbol" w:hint="default"/>
+        <w:sz w:val="20"/>
+      </w:rPr>
+    </w:lvl>
+    <w:lvl w:ilvl="5" w:tentative="1">
+      <w:start w:val="1"/>
+      <w:numFmt w:val="bullet"/>
+      <w:lvlText w:val=""/>
+      <w:lvlJc w:val="left"/>
+      <w:pPr>
+        <w:tabs>
+          <w:tab w:val="num" w:pos="4320"/>
+        </w:tabs>
+        <w:ind w:left="4320" w:hanging="360"/>
+      </w:pPr>
+      <w:rPr>
+        <w:rFonts w:ascii="Symbol" w:hAnsi="Symbol" w:hint="default"/>
+        <w:sz w:val="20"/>
+      </w:rPr>
+    </w:lvl>
+    <w:lvl w:ilvl="6" w:tentative="1">
+      <w:start w:val="1"/>
+      <w:numFmt w:val="bullet"/>
+      <w:lvlText w:val=""/>
+      <w:lvlJc w:val="left"/>
+      <w:pPr>
+        <w:tabs>
+          <w:tab w:val="num" w:pos="5040"/>
+        </w:tabs>
+        <w:ind w:left="5040" w:hanging="360"/>
+      </w:pPr>
+      <w:rPr>
+        <w:rFonts w:ascii="Symbol" w:hAnsi="Symbol" w:hint="default"/>
+        <w:sz w:val="20"/>
+      </w:rPr>
+    </w:lvl>
+    <w:lvl w:ilvl="7" w:tentative="1">
+      <w:start w:val="1"/>
+      <w:numFmt w:val="bullet"/>
+      <w:lvlText w:val=""/>
+      <w:lvlJc w:val="left"/>
+      <w:pPr>
+        <w:tabs>
+          <w:tab w:val="num" w:pos="5760"/>
+        </w:tabs>
+        <w:ind w:left="5760" w:hanging="360"/>
+      </w:pPr>
+      <w:rPr>
+        <w:rFonts w:ascii="Symbol" w:hAnsi="Symbol" w:hint="default"/>
+        <w:sz w:val="20"/>
+      </w:rPr>
+    </w:lvl>
+    <w:lvl w:ilvl="8" w:tentative="1">
+      <w:start w:val="1"/>
+      <w:numFmt w:val="bullet"/>
+      <w:lvlText w:val=""/>
+      <w:lvlJc w:val="left"/>
+      <w:pPr>
+        <w:tabs>
+          <w:tab w:val="num" w:pos="6480"/>
+        </w:tabs>
+        <w:ind w:left="6480" w:hanging="360"/>
+      </w:pPr>
+      <w:rPr>
+        <w:rFonts w:ascii="Symbol" w:hAnsi="Symbol" w:hint="default"/>
+        <w:sz w:val="20"/>
+      </w:rPr>
+    </w:lvl>
+  </w:abstractNum>
+  <w:abstractNum w:abstractNumId="2" w15:restartNumberingAfterBreak="0">
     <w:nsid w:val="07394988"/>
     <w:multiLevelType w:val="multilevel"/>
     <w:tmpl w:val="71D449BE"/>
@@ -11845,7 +12151,7 @@
       </w:pPr>
     </w:lvl>
   </w:abstractNum>
-  <w:abstractNum w:abstractNumId="2" w15:restartNumberingAfterBreak="0">
+  <w:abstractNum w:abstractNumId="3" w15:restartNumberingAfterBreak="0">
     <w:nsid w:val="077B17F5"/>
     <w:multiLevelType w:val="multilevel"/>
     <w:tmpl w:val="7E4477DA"/>
@@ -11994,7 +12300,7 @@
       </w:rPr>
     </w:lvl>
   </w:abstractNum>
-  <w:abstractNum w:abstractNumId="3" w15:restartNumberingAfterBreak="0">
+  <w:abstractNum w:abstractNumId="4" w15:restartNumberingAfterBreak="0">
     <w:nsid w:val="07C363F9"/>
     <w:multiLevelType w:val="multilevel"/>
     <w:tmpl w:val="4894B2DC"/>
@@ -12143,7 +12449,7 @@
       </w:rPr>
     </w:lvl>
   </w:abstractNum>
-  <w:abstractNum w:abstractNumId="4" w15:restartNumberingAfterBreak="0">
+  <w:abstractNum w:abstractNumId="5" w15:restartNumberingAfterBreak="0">
     <w:nsid w:val="087D5893"/>
     <w:multiLevelType w:val="multilevel"/>
     <w:tmpl w:val="6BF2C044"/>
@@ -12292,7 +12598,7 @@
       </w:rPr>
     </w:lvl>
   </w:abstractNum>
-  <w:abstractNum w:abstractNumId="5" w15:restartNumberingAfterBreak="0">
+  <w:abstractNum w:abstractNumId="6" w15:restartNumberingAfterBreak="0">
     <w:nsid w:val="0A26060E"/>
     <w:multiLevelType w:val="multilevel"/>
     <w:tmpl w:val="EF96F300"/>
@@ -12441,7 +12747,7 @@
       </w:rPr>
     </w:lvl>
   </w:abstractNum>
-  <w:abstractNum w:abstractNumId="6" w15:restartNumberingAfterBreak="0">
+  <w:abstractNum w:abstractNumId="7" w15:restartNumberingAfterBreak="0">
     <w:nsid w:val="0A7844BA"/>
     <w:multiLevelType w:val="multilevel"/>
     <w:tmpl w:val="9EDA77E2"/>
@@ -12590,7 +12896,7 @@
       </w:rPr>
     </w:lvl>
   </w:abstractNum>
-  <w:abstractNum w:abstractNumId="7" w15:restartNumberingAfterBreak="0">
+  <w:abstractNum w:abstractNumId="8" w15:restartNumberingAfterBreak="0">
     <w:nsid w:val="0B416F38"/>
     <w:multiLevelType w:val="multilevel"/>
     <w:tmpl w:val="2562A0FC"/>
@@ -12739,7 +13045,7 @@
       </w:rPr>
     </w:lvl>
   </w:abstractNum>
-  <w:abstractNum w:abstractNumId="8" w15:restartNumberingAfterBreak="0">
+  <w:abstractNum w:abstractNumId="9" w15:restartNumberingAfterBreak="0">
     <w:nsid w:val="0B853223"/>
     <w:multiLevelType w:val="multilevel"/>
     <w:tmpl w:val="45727B5C"/>
@@ -12888,7 +13194,7 @@
       </w:rPr>
     </w:lvl>
   </w:abstractNum>
-  <w:abstractNum w:abstractNumId="9" w15:restartNumberingAfterBreak="0">
+  <w:abstractNum w:abstractNumId="10" w15:restartNumberingAfterBreak="0">
     <w:nsid w:val="0CA41ADF"/>
     <w:multiLevelType w:val="multilevel"/>
     <w:tmpl w:val="24D0AE5C"/>
@@ -13037,7 +13343,7 @@
       </w:rPr>
     </w:lvl>
   </w:abstractNum>
-  <w:abstractNum w:abstractNumId="10" w15:restartNumberingAfterBreak="0">
+  <w:abstractNum w:abstractNumId="11" w15:restartNumberingAfterBreak="0">
     <w:nsid w:val="0CA96BDA"/>
     <w:multiLevelType w:val="multilevel"/>
     <w:tmpl w:val="D494E7F0"/>
@@ -13186,7 +13492,7 @@
       </w:rPr>
     </w:lvl>
   </w:abstractNum>
-  <w:abstractNum w:abstractNumId="11" w15:restartNumberingAfterBreak="0">
+  <w:abstractNum w:abstractNumId="12" w15:restartNumberingAfterBreak="0">
     <w:nsid w:val="0E5D2CE4"/>
     <w:multiLevelType w:val="multilevel"/>
     <w:tmpl w:val="B8866FD2"/>
@@ -13335,7 +13641,7 @@
       </w:rPr>
     </w:lvl>
   </w:abstractNum>
-  <w:abstractNum w:abstractNumId="12" w15:restartNumberingAfterBreak="0">
+  <w:abstractNum w:abstractNumId="13" w15:restartNumberingAfterBreak="0">
     <w:nsid w:val="0F7074E2"/>
     <w:multiLevelType w:val="multilevel"/>
     <w:tmpl w:val="ACE4224E"/>
@@ -13484,7 +13790,7 @@
       </w:rPr>
     </w:lvl>
   </w:abstractNum>
-  <w:abstractNum w:abstractNumId="13" w15:restartNumberingAfterBreak="0">
+  <w:abstractNum w:abstractNumId="14" w15:restartNumberingAfterBreak="0">
     <w:nsid w:val="10A71518"/>
     <w:multiLevelType w:val="multilevel"/>
     <w:tmpl w:val="FA6A6B7A"/>
@@ -13633,7 +13939,7 @@
       </w:rPr>
     </w:lvl>
   </w:abstractNum>
-  <w:abstractNum w:abstractNumId="14" w15:restartNumberingAfterBreak="0">
+  <w:abstractNum w:abstractNumId="15" w15:restartNumberingAfterBreak="0">
     <w:nsid w:val="116D3F81"/>
     <w:multiLevelType w:val="multilevel"/>
     <w:tmpl w:val="CD1063D6"/>
@@ -13782,7 +14088,7 @@
       </w:rPr>
     </w:lvl>
   </w:abstractNum>
-  <w:abstractNum w:abstractNumId="15" w15:restartNumberingAfterBreak="0">
+  <w:abstractNum w:abstractNumId="16" w15:restartNumberingAfterBreak="0">
     <w:nsid w:val="13EC6DB1"/>
     <w:multiLevelType w:val="multilevel"/>
     <w:tmpl w:val="F1B2ED04"/>
@@ -13895,7 +14201,7 @@
       </w:pPr>
     </w:lvl>
   </w:abstractNum>
-  <w:abstractNum w:abstractNumId="16" w15:restartNumberingAfterBreak="0">
+  <w:abstractNum w:abstractNumId="17" w15:restartNumberingAfterBreak="0">
     <w:nsid w:val="143B4E59"/>
     <w:multiLevelType w:val="multilevel"/>
     <w:tmpl w:val="E34432B2"/>
@@ -14044,7 +14350,7 @@
       </w:rPr>
     </w:lvl>
   </w:abstractNum>
-  <w:abstractNum w:abstractNumId="17" w15:restartNumberingAfterBreak="0">
+  <w:abstractNum w:abstractNumId="18" w15:restartNumberingAfterBreak="0">
     <w:nsid w:val="14F65BF0"/>
     <w:multiLevelType w:val="multilevel"/>
     <w:tmpl w:val="863C1454"/>
@@ -14193,7 +14499,7 @@
       </w:rPr>
     </w:lvl>
   </w:abstractNum>
-  <w:abstractNum w:abstractNumId="18" w15:restartNumberingAfterBreak="0">
+  <w:abstractNum w:abstractNumId="19" w15:restartNumberingAfterBreak="0">
     <w:nsid w:val="17A9727A"/>
     <w:multiLevelType w:val="multilevel"/>
     <w:tmpl w:val="25DA6F58"/>
@@ -14306,7 +14612,7 @@
       </w:pPr>
     </w:lvl>
   </w:abstractNum>
-  <w:abstractNum w:abstractNumId="19" w15:restartNumberingAfterBreak="0">
+  <w:abstractNum w:abstractNumId="20" w15:restartNumberingAfterBreak="0">
     <w:nsid w:val="19423FB8"/>
     <w:multiLevelType w:val="multilevel"/>
     <w:tmpl w:val="912A6F8C"/>
@@ -14455,7 +14761,7 @@
       </w:rPr>
     </w:lvl>
   </w:abstractNum>
-  <w:abstractNum w:abstractNumId="20" w15:restartNumberingAfterBreak="0">
+  <w:abstractNum w:abstractNumId="21" w15:restartNumberingAfterBreak="0">
     <w:nsid w:val="1B7931B9"/>
     <w:multiLevelType w:val="multilevel"/>
     <w:tmpl w:val="66FC58C8"/>
@@ -14568,7 +14874,7 @@
       </w:pPr>
     </w:lvl>
   </w:abstractNum>
-  <w:abstractNum w:abstractNumId="21" w15:restartNumberingAfterBreak="0">
+  <w:abstractNum w:abstractNumId="22" w15:restartNumberingAfterBreak="0">
     <w:nsid w:val="1D4F0FF8"/>
     <w:multiLevelType w:val="multilevel"/>
     <w:tmpl w:val="A2C05236"/>
@@ -14681,7 +14987,7 @@
       </w:pPr>
     </w:lvl>
   </w:abstractNum>
-  <w:abstractNum w:abstractNumId="22" w15:restartNumberingAfterBreak="0">
+  <w:abstractNum w:abstractNumId="23" w15:restartNumberingAfterBreak="0">
     <w:nsid w:val="1E5011CC"/>
     <w:multiLevelType w:val="multilevel"/>
     <w:tmpl w:val="FB0466AA"/>
@@ -14830,7 +15136,7 @@
       </w:rPr>
     </w:lvl>
   </w:abstractNum>
-  <w:abstractNum w:abstractNumId="23" w15:restartNumberingAfterBreak="0">
+  <w:abstractNum w:abstractNumId="24" w15:restartNumberingAfterBreak="0">
     <w:nsid w:val="1EA97677"/>
     <w:multiLevelType w:val="multilevel"/>
     <w:tmpl w:val="186AF79E"/>
@@ -14979,7 +15285,7 @@
       </w:rPr>
     </w:lvl>
   </w:abstractNum>
-  <w:abstractNum w:abstractNumId="24" w15:restartNumberingAfterBreak="0">
+  <w:abstractNum w:abstractNumId="25" w15:restartNumberingAfterBreak="0">
     <w:nsid w:val="1F0128C4"/>
     <w:multiLevelType w:val="multilevel"/>
     <w:tmpl w:val="276CAA6A"/>
@@ -15092,7 +15398,7 @@
       </w:pPr>
     </w:lvl>
   </w:abstractNum>
-  <w:abstractNum w:abstractNumId="25" w15:restartNumberingAfterBreak="0">
+  <w:abstractNum w:abstractNumId="26" w15:restartNumberingAfterBreak="0">
     <w:nsid w:val="1F3730C0"/>
     <w:multiLevelType w:val="multilevel"/>
     <w:tmpl w:val="0334509C"/>
@@ -15241,7 +15547,7 @@
       </w:rPr>
     </w:lvl>
   </w:abstractNum>
-  <w:abstractNum w:abstractNumId="26" w15:restartNumberingAfterBreak="0">
+  <w:abstractNum w:abstractNumId="27" w15:restartNumberingAfterBreak="0">
     <w:nsid w:val="226A7A6C"/>
     <w:multiLevelType w:val="multilevel"/>
     <w:tmpl w:val="C3FC414C"/>
@@ -15390,7 +15696,7 @@
       </w:rPr>
     </w:lvl>
   </w:abstractNum>
-  <w:abstractNum w:abstractNumId="27" w15:restartNumberingAfterBreak="0">
+  <w:abstractNum w:abstractNumId="28" w15:restartNumberingAfterBreak="0">
     <w:nsid w:val="231F2109"/>
     <w:multiLevelType w:val="multilevel"/>
     <w:tmpl w:val="17A4632C"/>
@@ -15503,7 +15809,7 @@
       </w:pPr>
     </w:lvl>
   </w:abstractNum>
-  <w:abstractNum w:abstractNumId="28" w15:restartNumberingAfterBreak="0">
+  <w:abstractNum w:abstractNumId="29" w15:restartNumberingAfterBreak="0">
     <w:nsid w:val="243131F1"/>
     <w:multiLevelType w:val="multilevel"/>
     <w:tmpl w:val="60A64BAA"/>
@@ -15616,7 +15922,7 @@
       </w:pPr>
     </w:lvl>
   </w:abstractNum>
-  <w:abstractNum w:abstractNumId="29" w15:restartNumberingAfterBreak="0">
+  <w:abstractNum w:abstractNumId="30" w15:restartNumberingAfterBreak="0">
     <w:nsid w:val="24645365"/>
     <w:multiLevelType w:val="multilevel"/>
     <w:tmpl w:val="0C14DCD2"/>
@@ -15765,7 +16071,7 @@
       </w:rPr>
     </w:lvl>
   </w:abstractNum>
-  <w:abstractNum w:abstractNumId="30" w15:restartNumberingAfterBreak="0">
+  <w:abstractNum w:abstractNumId="31" w15:restartNumberingAfterBreak="0">
     <w:nsid w:val="24807506"/>
     <w:multiLevelType w:val="multilevel"/>
     <w:tmpl w:val="622CA188"/>
@@ -15914,7 +16220,7 @@
       </w:rPr>
     </w:lvl>
   </w:abstractNum>
-  <w:abstractNum w:abstractNumId="31" w15:restartNumberingAfterBreak="0">
+  <w:abstractNum w:abstractNumId="32" w15:restartNumberingAfterBreak="0">
     <w:nsid w:val="248A7388"/>
     <w:multiLevelType w:val="multilevel"/>
     <w:tmpl w:val="0308A866"/>
@@ -16063,7 +16369,7 @@
       </w:rPr>
     </w:lvl>
   </w:abstractNum>
-  <w:abstractNum w:abstractNumId="32" w15:restartNumberingAfterBreak="0">
+  <w:abstractNum w:abstractNumId="33" w15:restartNumberingAfterBreak="0">
     <w:nsid w:val="27093B49"/>
     <w:multiLevelType w:val="multilevel"/>
     <w:tmpl w:val="31A637E2"/>
@@ -16212,7 +16518,7 @@
       </w:rPr>
     </w:lvl>
   </w:abstractNum>
-  <w:abstractNum w:abstractNumId="33" w15:restartNumberingAfterBreak="0">
+  <w:abstractNum w:abstractNumId="34" w15:restartNumberingAfterBreak="0">
     <w:nsid w:val="288E0D98"/>
     <w:multiLevelType w:val="multilevel"/>
     <w:tmpl w:val="69A09AC4"/>
@@ -16361,7 +16667,7 @@
       </w:rPr>
     </w:lvl>
   </w:abstractNum>
-  <w:abstractNum w:abstractNumId="34" w15:restartNumberingAfterBreak="0">
+  <w:abstractNum w:abstractNumId="35" w15:restartNumberingAfterBreak="0">
     <w:nsid w:val="28DF302F"/>
     <w:multiLevelType w:val="multilevel"/>
     <w:tmpl w:val="57AAA64E"/>
@@ -16510,7 +16816,7 @@
       </w:rPr>
     </w:lvl>
   </w:abstractNum>
-  <w:abstractNum w:abstractNumId="35" w15:restartNumberingAfterBreak="0">
+  <w:abstractNum w:abstractNumId="36" w15:restartNumberingAfterBreak="0">
     <w:nsid w:val="2A524986"/>
     <w:multiLevelType w:val="multilevel"/>
     <w:tmpl w:val="A058C0D0"/>
@@ -16659,7 +16965,7 @@
       </w:rPr>
     </w:lvl>
   </w:abstractNum>
-  <w:abstractNum w:abstractNumId="36" w15:restartNumberingAfterBreak="0">
+  <w:abstractNum w:abstractNumId="37" w15:restartNumberingAfterBreak="0">
     <w:nsid w:val="2A6F1DAA"/>
     <w:multiLevelType w:val="hybridMultilevel"/>
     <w:tmpl w:val="927400E4"/>
@@ -16748,7 +17054,7 @@
       </w:pPr>
     </w:lvl>
   </w:abstractNum>
-  <w:abstractNum w:abstractNumId="37" w15:restartNumberingAfterBreak="0">
+  <w:abstractNum w:abstractNumId="38" w15:restartNumberingAfterBreak="0">
     <w:nsid w:val="2AF37763"/>
     <w:multiLevelType w:val="multilevel"/>
     <w:tmpl w:val="AE183EDA"/>
@@ -16897,7 +17203,7 @@
       </w:rPr>
     </w:lvl>
   </w:abstractNum>
-  <w:abstractNum w:abstractNumId="38" w15:restartNumberingAfterBreak="0">
+  <w:abstractNum w:abstractNumId="39" w15:restartNumberingAfterBreak="0">
     <w:nsid w:val="2B5D413E"/>
     <w:multiLevelType w:val="multilevel"/>
     <w:tmpl w:val="63AC32B0"/>
@@ -17046,7 +17352,7 @@
       </w:rPr>
     </w:lvl>
   </w:abstractNum>
-  <w:abstractNum w:abstractNumId="39" w15:restartNumberingAfterBreak="0">
+  <w:abstractNum w:abstractNumId="40" w15:restartNumberingAfterBreak="0">
     <w:nsid w:val="2C514BD0"/>
     <w:multiLevelType w:val="multilevel"/>
     <w:tmpl w:val="7C46141E"/>
@@ -17195,7 +17501,7 @@
       </w:rPr>
     </w:lvl>
   </w:abstractNum>
-  <w:abstractNum w:abstractNumId="40" w15:restartNumberingAfterBreak="0">
+  <w:abstractNum w:abstractNumId="41" w15:restartNumberingAfterBreak="0">
     <w:nsid w:val="2CF31527"/>
     <w:multiLevelType w:val="multilevel"/>
     <w:tmpl w:val="71F40FCC"/>
@@ -17344,7 +17650,7 @@
       </w:rPr>
     </w:lvl>
   </w:abstractNum>
-  <w:abstractNum w:abstractNumId="41" w15:restartNumberingAfterBreak="0">
+  <w:abstractNum w:abstractNumId="42" w15:restartNumberingAfterBreak="0">
     <w:nsid w:val="2D0258DA"/>
     <w:multiLevelType w:val="multilevel"/>
     <w:tmpl w:val="CC883A00"/>
@@ -17493,7 +17799,7 @@
       </w:rPr>
     </w:lvl>
   </w:abstractNum>
-  <w:abstractNum w:abstractNumId="42" w15:restartNumberingAfterBreak="0">
+  <w:abstractNum w:abstractNumId="43" w15:restartNumberingAfterBreak="0">
     <w:nsid w:val="2D5A2347"/>
     <w:multiLevelType w:val="multilevel"/>
     <w:tmpl w:val="32BA72A2"/>
@@ -17642,7 +17948,7 @@
       </w:rPr>
     </w:lvl>
   </w:abstractNum>
-  <w:abstractNum w:abstractNumId="43" w15:restartNumberingAfterBreak="0">
+  <w:abstractNum w:abstractNumId="44" w15:restartNumberingAfterBreak="0">
     <w:nsid w:val="2EDB53A4"/>
     <w:multiLevelType w:val="multilevel"/>
     <w:tmpl w:val="14C89CA0"/>
@@ -17791,7 +18097,7 @@
       </w:rPr>
     </w:lvl>
   </w:abstractNum>
-  <w:abstractNum w:abstractNumId="44" w15:restartNumberingAfterBreak="0">
+  <w:abstractNum w:abstractNumId="45" w15:restartNumberingAfterBreak="0">
     <w:nsid w:val="30211722"/>
     <w:multiLevelType w:val="multilevel"/>
     <w:tmpl w:val="6A48CCC2"/>
@@ -17940,7 +18246,7 @@
       </w:rPr>
     </w:lvl>
   </w:abstractNum>
-  <w:abstractNum w:abstractNumId="45" w15:restartNumberingAfterBreak="0">
+  <w:abstractNum w:abstractNumId="46" w15:restartNumberingAfterBreak="0">
     <w:nsid w:val="3454424E"/>
     <w:multiLevelType w:val="hybridMultilevel"/>
     <w:tmpl w:val="0B44A61E"/>
@@ -18029,7 +18335,7 @@
       </w:pPr>
     </w:lvl>
   </w:abstractNum>
-  <w:abstractNum w:abstractNumId="46" w15:restartNumberingAfterBreak="0">
+  <w:abstractNum w:abstractNumId="47" w15:restartNumberingAfterBreak="0">
     <w:nsid w:val="34CF1E17"/>
     <w:multiLevelType w:val="multilevel"/>
     <w:tmpl w:val="36B2AF50"/>
@@ -18178,7 +18484,7 @@
       </w:rPr>
     </w:lvl>
   </w:abstractNum>
-  <w:abstractNum w:abstractNumId="47" w15:restartNumberingAfterBreak="0">
+  <w:abstractNum w:abstractNumId="48" w15:restartNumberingAfterBreak="0">
     <w:nsid w:val="37E80373"/>
     <w:multiLevelType w:val="multilevel"/>
     <w:tmpl w:val="E3D4E370"/>
@@ -18291,7 +18597,7 @@
       </w:pPr>
     </w:lvl>
   </w:abstractNum>
-  <w:abstractNum w:abstractNumId="48" w15:restartNumberingAfterBreak="0">
+  <w:abstractNum w:abstractNumId="49" w15:restartNumberingAfterBreak="0">
     <w:nsid w:val="395C42D0"/>
     <w:multiLevelType w:val="hybridMultilevel"/>
     <w:tmpl w:val="806EA054"/>
@@ -18381,7 +18687,7 @@
       </w:pPr>
     </w:lvl>
   </w:abstractNum>
-  <w:abstractNum w:abstractNumId="49" w15:restartNumberingAfterBreak="0">
+  <w:abstractNum w:abstractNumId="50" w15:restartNumberingAfterBreak="0">
     <w:nsid w:val="3AF7683C"/>
     <w:multiLevelType w:val="multilevel"/>
     <w:tmpl w:val="14C8C090"/>
@@ -18530,7 +18836,7 @@
       </w:rPr>
     </w:lvl>
   </w:abstractNum>
-  <w:abstractNum w:abstractNumId="50" w15:restartNumberingAfterBreak="0">
+  <w:abstractNum w:abstractNumId="51" w15:restartNumberingAfterBreak="0">
     <w:nsid w:val="3BD21E7B"/>
     <w:multiLevelType w:val="multilevel"/>
     <w:tmpl w:val="24B8EEF2"/>
@@ -18679,7 +18985,7 @@
       </w:rPr>
     </w:lvl>
   </w:abstractNum>
-  <w:abstractNum w:abstractNumId="51" w15:restartNumberingAfterBreak="0">
+  <w:abstractNum w:abstractNumId="52" w15:restartNumberingAfterBreak="0">
     <w:nsid w:val="3C345DD8"/>
     <w:multiLevelType w:val="multilevel"/>
     <w:tmpl w:val="C3B6D8D2"/>
@@ -18828,7 +19134,7 @@
       </w:rPr>
     </w:lvl>
   </w:abstractNum>
-  <w:abstractNum w:abstractNumId="52" w15:restartNumberingAfterBreak="0">
+  <w:abstractNum w:abstractNumId="53" w15:restartNumberingAfterBreak="0">
     <w:nsid w:val="3D065F61"/>
     <w:multiLevelType w:val="multilevel"/>
     <w:tmpl w:val="C2BAD178"/>
@@ -18977,7 +19283,7 @@
       </w:rPr>
     </w:lvl>
   </w:abstractNum>
-  <w:abstractNum w:abstractNumId="53" w15:restartNumberingAfterBreak="0">
+  <w:abstractNum w:abstractNumId="54" w15:restartNumberingAfterBreak="0">
     <w:nsid w:val="3E3C43C2"/>
     <w:multiLevelType w:val="multilevel"/>
     <w:tmpl w:val="57F01B04"/>
@@ -19126,7 +19432,7 @@
       </w:rPr>
     </w:lvl>
   </w:abstractNum>
-  <w:abstractNum w:abstractNumId="54" w15:restartNumberingAfterBreak="0">
+  <w:abstractNum w:abstractNumId="55" w15:restartNumberingAfterBreak="0">
     <w:nsid w:val="3EA340C9"/>
     <w:multiLevelType w:val="multilevel"/>
     <w:tmpl w:val="3EA23D9C"/>
@@ -19275,7 +19581,7 @@
       </w:rPr>
     </w:lvl>
   </w:abstractNum>
-  <w:abstractNum w:abstractNumId="55" w15:restartNumberingAfterBreak="0">
+  <w:abstractNum w:abstractNumId="56" w15:restartNumberingAfterBreak="0">
     <w:nsid w:val="3F322CAA"/>
     <w:multiLevelType w:val="multilevel"/>
     <w:tmpl w:val="4634C6D2"/>
@@ -19424,7 +19730,7 @@
       </w:rPr>
     </w:lvl>
   </w:abstractNum>
-  <w:abstractNum w:abstractNumId="56" w15:restartNumberingAfterBreak="0">
+  <w:abstractNum w:abstractNumId="57" w15:restartNumberingAfterBreak="0">
     <w:nsid w:val="40F36D23"/>
     <w:multiLevelType w:val="multilevel"/>
     <w:tmpl w:val="5F08133C"/>
@@ -19537,7 +19843,7 @@
       </w:pPr>
     </w:lvl>
   </w:abstractNum>
-  <w:abstractNum w:abstractNumId="57" w15:restartNumberingAfterBreak="0">
+  <w:abstractNum w:abstractNumId="58" w15:restartNumberingAfterBreak="0">
     <w:nsid w:val="413C5882"/>
     <w:multiLevelType w:val="multilevel"/>
     <w:tmpl w:val="8FA8A428"/>
@@ -19686,7 +19992,7 @@
       </w:rPr>
     </w:lvl>
   </w:abstractNum>
-  <w:abstractNum w:abstractNumId="58" w15:restartNumberingAfterBreak="0">
+  <w:abstractNum w:abstractNumId="59" w15:restartNumberingAfterBreak="0">
     <w:nsid w:val="43876099"/>
     <w:multiLevelType w:val="multilevel"/>
     <w:tmpl w:val="66FC58C8"/>
@@ -19799,7 +20105,7 @@
       </w:pPr>
     </w:lvl>
   </w:abstractNum>
-  <w:abstractNum w:abstractNumId="59" w15:restartNumberingAfterBreak="0">
+  <w:abstractNum w:abstractNumId="60" w15:restartNumberingAfterBreak="0">
     <w:nsid w:val="4488635F"/>
     <w:multiLevelType w:val="multilevel"/>
     <w:tmpl w:val="F2043C5E"/>
@@ -19948,7 +20254,7 @@
       </w:rPr>
     </w:lvl>
   </w:abstractNum>
-  <w:abstractNum w:abstractNumId="60" w15:restartNumberingAfterBreak="0">
+  <w:abstractNum w:abstractNumId="61" w15:restartNumberingAfterBreak="0">
     <w:nsid w:val="46F73524"/>
     <w:multiLevelType w:val="multilevel"/>
     <w:tmpl w:val="E7D6C050"/>
@@ -20097,7 +20403,7 @@
       </w:rPr>
     </w:lvl>
   </w:abstractNum>
-  <w:abstractNum w:abstractNumId="61" w15:restartNumberingAfterBreak="0">
+  <w:abstractNum w:abstractNumId="62" w15:restartNumberingAfterBreak="0">
     <w:nsid w:val="47AF4836"/>
     <w:multiLevelType w:val="multilevel"/>
     <w:tmpl w:val="E556D5B4"/>
@@ -20246,7 +20552,7 @@
       </w:rPr>
     </w:lvl>
   </w:abstractNum>
-  <w:abstractNum w:abstractNumId="62" w15:restartNumberingAfterBreak="0">
+  <w:abstractNum w:abstractNumId="63" w15:restartNumberingAfterBreak="0">
     <w:nsid w:val="49C95D8B"/>
     <w:multiLevelType w:val="multilevel"/>
     <w:tmpl w:val="CCD47B98"/>
@@ -20395,7 +20701,7 @@
       </w:rPr>
     </w:lvl>
   </w:abstractNum>
-  <w:abstractNum w:abstractNumId="63" w15:restartNumberingAfterBreak="0">
+  <w:abstractNum w:abstractNumId="64" w15:restartNumberingAfterBreak="0">
     <w:nsid w:val="4BF70692"/>
     <w:multiLevelType w:val="multilevel"/>
     <w:tmpl w:val="7556F278"/>
@@ -20544,7 +20850,7 @@
       </w:rPr>
     </w:lvl>
   </w:abstractNum>
-  <w:abstractNum w:abstractNumId="64" w15:restartNumberingAfterBreak="0">
+  <w:abstractNum w:abstractNumId="65" w15:restartNumberingAfterBreak="0">
     <w:nsid w:val="4C0D66BA"/>
     <w:multiLevelType w:val="multilevel"/>
     <w:tmpl w:val="7C66BCBE"/>
@@ -20693,7 +20999,7 @@
       </w:rPr>
     </w:lvl>
   </w:abstractNum>
-  <w:abstractNum w:abstractNumId="65" w15:restartNumberingAfterBreak="0">
+  <w:abstractNum w:abstractNumId="66" w15:restartNumberingAfterBreak="0">
     <w:nsid w:val="4CFD5091"/>
     <w:multiLevelType w:val="multilevel"/>
     <w:tmpl w:val="FF180AF6"/>
@@ -20842,7 +21148,7 @@
       </w:rPr>
     </w:lvl>
   </w:abstractNum>
-  <w:abstractNum w:abstractNumId="66" w15:restartNumberingAfterBreak="0">
+  <w:abstractNum w:abstractNumId="67" w15:restartNumberingAfterBreak="0">
     <w:nsid w:val="4D5625F3"/>
     <w:multiLevelType w:val="multilevel"/>
     <w:tmpl w:val="3490D17C"/>
@@ -20991,7 +21297,7 @@
       </w:rPr>
     </w:lvl>
   </w:abstractNum>
-  <w:abstractNum w:abstractNumId="67" w15:restartNumberingAfterBreak="0">
+  <w:abstractNum w:abstractNumId="68" w15:restartNumberingAfterBreak="0">
     <w:nsid w:val="4D882D81"/>
     <w:multiLevelType w:val="multilevel"/>
     <w:tmpl w:val="F81CCB8A"/>
@@ -21104,7 +21410,7 @@
       </w:pPr>
     </w:lvl>
   </w:abstractNum>
-  <w:abstractNum w:abstractNumId="68" w15:restartNumberingAfterBreak="0">
+  <w:abstractNum w:abstractNumId="69" w15:restartNumberingAfterBreak="0">
     <w:nsid w:val="4DF2025C"/>
     <w:multiLevelType w:val="multilevel"/>
     <w:tmpl w:val="5AB8BB72"/>
@@ -21253,7 +21559,7 @@
       </w:rPr>
     </w:lvl>
   </w:abstractNum>
-  <w:abstractNum w:abstractNumId="69" w15:restartNumberingAfterBreak="0">
+  <w:abstractNum w:abstractNumId="70" w15:restartNumberingAfterBreak="0">
     <w:nsid w:val="4E5C59AF"/>
     <w:multiLevelType w:val="multilevel"/>
     <w:tmpl w:val="9DB4AE98"/>
@@ -21402,7 +21708,7 @@
       </w:rPr>
     </w:lvl>
   </w:abstractNum>
-  <w:abstractNum w:abstractNumId="70" w15:restartNumberingAfterBreak="0">
+  <w:abstractNum w:abstractNumId="71" w15:restartNumberingAfterBreak="0">
     <w:nsid w:val="50C678EF"/>
     <w:multiLevelType w:val="multilevel"/>
     <w:tmpl w:val="7DDAA8A2"/>
@@ -21515,7 +21821,7 @@
       </w:pPr>
     </w:lvl>
   </w:abstractNum>
-  <w:abstractNum w:abstractNumId="71" w15:restartNumberingAfterBreak="0">
+  <w:abstractNum w:abstractNumId="72" w15:restartNumberingAfterBreak="0">
     <w:nsid w:val="537042D7"/>
     <w:multiLevelType w:val="multilevel"/>
     <w:tmpl w:val="E9ECA83E"/>
@@ -21664,7 +21970,7 @@
       </w:rPr>
     </w:lvl>
   </w:abstractNum>
-  <w:abstractNum w:abstractNumId="72" w15:restartNumberingAfterBreak="0">
+  <w:abstractNum w:abstractNumId="73" w15:restartNumberingAfterBreak="0">
     <w:nsid w:val="53BC1470"/>
     <w:multiLevelType w:val="hybridMultilevel"/>
     <w:tmpl w:val="83DADF68"/>
@@ -21750,7 +22056,7 @@
       </w:pPr>
     </w:lvl>
   </w:abstractNum>
-  <w:abstractNum w:abstractNumId="73" w15:restartNumberingAfterBreak="0">
+  <w:abstractNum w:abstractNumId="74" w15:restartNumberingAfterBreak="0">
     <w:nsid w:val="5471299B"/>
     <w:multiLevelType w:val="hybridMultilevel"/>
     <w:tmpl w:val="CF963B28"/>
@@ -21839,7 +22145,7 @@
       </w:pPr>
     </w:lvl>
   </w:abstractNum>
-  <w:abstractNum w:abstractNumId="74" w15:restartNumberingAfterBreak="0">
+  <w:abstractNum w:abstractNumId="75" w15:restartNumberingAfterBreak="0">
     <w:nsid w:val="56D27F0C"/>
     <w:multiLevelType w:val="multilevel"/>
     <w:tmpl w:val="A9BE920E"/>
@@ -21988,7 +22294,7 @@
       </w:rPr>
     </w:lvl>
   </w:abstractNum>
-  <w:abstractNum w:abstractNumId="75" w15:restartNumberingAfterBreak="0">
+  <w:abstractNum w:abstractNumId="76" w15:restartNumberingAfterBreak="0">
     <w:nsid w:val="577157F8"/>
     <w:multiLevelType w:val="multilevel"/>
     <w:tmpl w:val="20EA22CE"/>
@@ -22137,7 +22443,7 @@
       </w:rPr>
     </w:lvl>
   </w:abstractNum>
-  <w:abstractNum w:abstractNumId="76" w15:restartNumberingAfterBreak="0">
+  <w:abstractNum w:abstractNumId="77" w15:restartNumberingAfterBreak="0">
     <w:nsid w:val="58EF23CD"/>
     <w:multiLevelType w:val="multilevel"/>
     <w:tmpl w:val="6212A672"/>
@@ -22286,7 +22592,7 @@
       </w:rPr>
     </w:lvl>
   </w:abstractNum>
-  <w:abstractNum w:abstractNumId="77" w15:restartNumberingAfterBreak="0">
+  <w:abstractNum w:abstractNumId="78" w15:restartNumberingAfterBreak="0">
     <w:nsid w:val="5B017042"/>
     <w:multiLevelType w:val="multilevel"/>
     <w:tmpl w:val="C7605410"/>
@@ -22435,7 +22741,7 @@
       </w:rPr>
     </w:lvl>
   </w:abstractNum>
-  <w:abstractNum w:abstractNumId="78" w15:restartNumberingAfterBreak="0">
+  <w:abstractNum w:abstractNumId="79" w15:restartNumberingAfterBreak="0">
     <w:nsid w:val="5BE65140"/>
     <w:multiLevelType w:val="multilevel"/>
     <w:tmpl w:val="8C589A38"/>
@@ -22584,7 +22890,7 @@
       </w:rPr>
     </w:lvl>
   </w:abstractNum>
-  <w:abstractNum w:abstractNumId="79" w15:restartNumberingAfterBreak="0">
+  <w:abstractNum w:abstractNumId="80" w15:restartNumberingAfterBreak="0">
     <w:nsid w:val="5C766D29"/>
     <w:multiLevelType w:val="multilevel"/>
     <w:tmpl w:val="325A124A"/>
@@ -22733,7 +23039,7 @@
       </w:rPr>
     </w:lvl>
   </w:abstractNum>
-  <w:abstractNum w:abstractNumId="80" w15:restartNumberingAfterBreak="0">
+  <w:abstractNum w:abstractNumId="81" w15:restartNumberingAfterBreak="0">
     <w:nsid w:val="5CD11074"/>
     <w:multiLevelType w:val="multilevel"/>
     <w:tmpl w:val="C7FE0E24"/>
@@ -22846,7 +23152,7 @@
       </w:pPr>
     </w:lvl>
   </w:abstractNum>
-  <w:abstractNum w:abstractNumId="81" w15:restartNumberingAfterBreak="0">
+  <w:abstractNum w:abstractNumId="82" w15:restartNumberingAfterBreak="0">
     <w:nsid w:val="5E953540"/>
     <w:multiLevelType w:val="multilevel"/>
     <w:tmpl w:val="0A5E1582"/>
@@ -22959,7 +23265,7 @@
       </w:pPr>
     </w:lvl>
   </w:abstractNum>
-  <w:abstractNum w:abstractNumId="82" w15:restartNumberingAfterBreak="0">
+  <w:abstractNum w:abstractNumId="83" w15:restartNumberingAfterBreak="0">
     <w:nsid w:val="5FBE4264"/>
     <w:multiLevelType w:val="multilevel"/>
     <w:tmpl w:val="55A63350"/>
@@ -23108,7 +23414,7 @@
       </w:rPr>
     </w:lvl>
   </w:abstractNum>
-  <w:abstractNum w:abstractNumId="83" w15:restartNumberingAfterBreak="0">
+  <w:abstractNum w:abstractNumId="84" w15:restartNumberingAfterBreak="0">
     <w:nsid w:val="5FD4155D"/>
     <w:multiLevelType w:val="multilevel"/>
     <w:tmpl w:val="69DEEF5C"/>
@@ -23257,7 +23563,156 @@
       </w:rPr>
     </w:lvl>
   </w:abstractNum>
-  <w:abstractNum w:abstractNumId="84" w15:restartNumberingAfterBreak="0">
+  <w:abstractNum w:abstractNumId="85" w15:restartNumberingAfterBreak="0">
+    <w:nsid w:val="60195BC9"/>
+    <w:multiLevelType w:val="multilevel"/>
+    <w:tmpl w:val="F2C65B0E"/>
+    <w:lvl w:ilvl="0">
+      <w:start w:val="1"/>
+      <w:numFmt w:val="bullet"/>
+      <w:lvlText w:val=""/>
+      <w:lvlJc w:val="left"/>
+      <w:pPr>
+        <w:tabs>
+          <w:tab w:val="num" w:pos="720"/>
+        </w:tabs>
+        <w:ind w:left="720" w:hanging="360"/>
+      </w:pPr>
+      <w:rPr>
+        <w:rFonts w:ascii="Symbol" w:hAnsi="Symbol" w:hint="default"/>
+        <w:sz w:val="20"/>
+      </w:rPr>
+    </w:lvl>
+    <w:lvl w:ilvl="1">
+      <w:start w:val="1"/>
+      <w:numFmt w:val="bullet"/>
+      <w:lvlText w:val=""/>
+      <w:lvlJc w:val="left"/>
+      <w:pPr>
+        <w:tabs>
+          <w:tab w:val="num" w:pos="1440"/>
+        </w:tabs>
+        <w:ind w:left="1440" w:hanging="360"/>
+      </w:pPr>
+      <w:rPr>
+        <w:rFonts w:ascii="Symbol" w:hAnsi="Symbol" w:hint="default"/>
+        <w:sz w:val="20"/>
+      </w:rPr>
+    </w:lvl>
+    <w:lvl w:ilvl="2" w:tentative="1">
+      <w:start w:val="1"/>
+      <w:numFmt w:val="bullet"/>
+      <w:lvlText w:val=""/>
+      <w:lvlJc w:val="left"/>
+      <w:pPr>
+        <w:tabs>
+          <w:tab w:val="num" w:pos="2160"/>
+        </w:tabs>
+        <w:ind w:left="2160" w:hanging="360"/>
+      </w:pPr>
+      <w:rPr>
+        <w:rFonts w:ascii="Symbol" w:hAnsi="Symbol" w:hint="default"/>
+        <w:sz w:val="20"/>
+      </w:rPr>
+    </w:lvl>
+    <w:lvl w:ilvl="3" w:tentative="1">
+      <w:start w:val="1"/>
+      <w:numFmt w:val="bullet"/>
+      <w:lvlText w:val=""/>
+      <w:lvlJc w:val="left"/>
+      <w:pPr>
+        <w:tabs>
+          <w:tab w:val="num" w:pos="2880"/>
+        </w:tabs>
+        <w:ind w:left="2880" w:hanging="360"/>
+      </w:pPr>
+      <w:rPr>
+        <w:rFonts w:ascii="Symbol" w:hAnsi="Symbol" w:hint="default"/>
+        <w:sz w:val="20"/>
+      </w:rPr>
+    </w:lvl>
+    <w:lvl w:ilvl="4" w:tentative="1">
+      <w:start w:val="1"/>
+      <w:numFmt w:val="bullet"/>
+      <w:lvlText w:val=""/>
+      <w:lvlJc w:val="left"/>
+      <w:pPr>
+        <w:tabs>
+          <w:tab w:val="num" w:pos="3600"/>
+        </w:tabs>
+        <w:ind w:left="3600" w:hanging="360"/>
+      </w:pPr>
+      <w:rPr>
+        <w:rFonts w:ascii="Symbol" w:hAnsi="Symbol" w:hint="default"/>
+        <w:sz w:val="20"/>
+      </w:rPr>
+    </w:lvl>
+    <w:lvl w:ilvl="5" w:tentative="1">
+      <w:start w:val="1"/>
+      <w:numFmt w:val="bullet"/>
+      <w:lvlText w:val=""/>
+      <w:lvlJc w:val="left"/>
+      <w:pPr>
+        <w:tabs>
+          <w:tab w:val="num" w:pos="4320"/>
+        </w:tabs>
+        <w:ind w:left="4320" w:hanging="360"/>
+      </w:pPr>
+      <w:rPr>
+        <w:rFonts w:ascii="Symbol" w:hAnsi="Symbol" w:hint="default"/>
+        <w:sz w:val="20"/>
+      </w:rPr>
+    </w:lvl>
+    <w:lvl w:ilvl="6" w:tentative="1">
+      <w:start w:val="1"/>
+      <w:numFmt w:val="bullet"/>
+      <w:lvlText w:val=""/>
+      <w:lvlJc w:val="left"/>
+      <w:pPr>
+        <w:tabs>
+          <w:tab w:val="num" w:pos="5040"/>
+        </w:tabs>
+        <w:ind w:left="5040" w:hanging="360"/>
+      </w:pPr>
+      <w:rPr>
+        <w:rFonts w:ascii="Symbol" w:hAnsi="Symbol" w:hint="default"/>
+        <w:sz w:val="20"/>
+      </w:rPr>
+    </w:lvl>
+    <w:lvl w:ilvl="7" w:tentative="1">
+      <w:start w:val="1"/>
+      <w:numFmt w:val="bullet"/>
+      <w:lvlText w:val=""/>
+      <w:lvlJc w:val="left"/>
+      <w:pPr>
+        <w:tabs>
+          <w:tab w:val="num" w:pos="5760"/>
+        </w:tabs>
+        <w:ind w:left="5760" w:hanging="360"/>
+      </w:pPr>
+      <w:rPr>
+        <w:rFonts w:ascii="Symbol" w:hAnsi="Symbol" w:hint="default"/>
+        <w:sz w:val="20"/>
+      </w:rPr>
+    </w:lvl>
+    <w:lvl w:ilvl="8" w:tentative="1">
+      <w:start w:val="1"/>
+      <w:numFmt w:val="bullet"/>
+      <w:lvlText w:val=""/>
+      <w:lvlJc w:val="left"/>
+      <w:pPr>
+        <w:tabs>
+          <w:tab w:val="num" w:pos="6480"/>
+        </w:tabs>
+        <w:ind w:left="6480" w:hanging="360"/>
+      </w:pPr>
+      <w:rPr>
+        <w:rFonts w:ascii="Symbol" w:hAnsi="Symbol" w:hint="default"/>
+        <w:sz w:val="20"/>
+      </w:rPr>
+    </w:lvl>
+  </w:abstractNum>
+  <w:abstractNum w:abstractNumId="86" w15:restartNumberingAfterBreak="0">
     <w:nsid w:val="60E168CE"/>
     <w:multiLevelType w:val="multilevel"/>
     <w:tmpl w:val="0CDE20D4"/>
@@ -23406,7 +23861,7 @@
       </w:rPr>
     </w:lvl>
   </w:abstractNum>
-  <w:abstractNum w:abstractNumId="85" w15:restartNumberingAfterBreak="0">
+  <w:abstractNum w:abstractNumId="87" w15:restartNumberingAfterBreak="0">
     <w:nsid w:val="61A8317D"/>
     <w:multiLevelType w:val="multilevel"/>
     <w:tmpl w:val="786E977E"/>
@@ -23555,7 +24010,7 @@
       </w:rPr>
     </w:lvl>
   </w:abstractNum>
-  <w:abstractNum w:abstractNumId="86" w15:restartNumberingAfterBreak="0">
+  <w:abstractNum w:abstractNumId="88" w15:restartNumberingAfterBreak="0">
     <w:nsid w:val="62B1719B"/>
     <w:multiLevelType w:val="multilevel"/>
     <w:tmpl w:val="1EF4F83A"/>
@@ -23668,7 +24123,7 @@
       </w:pPr>
     </w:lvl>
   </w:abstractNum>
-  <w:abstractNum w:abstractNumId="87" w15:restartNumberingAfterBreak="0">
+  <w:abstractNum w:abstractNumId="89" w15:restartNumberingAfterBreak="0">
     <w:nsid w:val="6A0E63C7"/>
     <w:multiLevelType w:val="multilevel"/>
     <w:tmpl w:val="29D65E90"/>
@@ -23781,7 +24236,7 @@
       </w:pPr>
     </w:lvl>
   </w:abstractNum>
-  <w:abstractNum w:abstractNumId="88" w15:restartNumberingAfterBreak="0">
+  <w:abstractNum w:abstractNumId="90" w15:restartNumberingAfterBreak="0">
     <w:nsid w:val="6A6C74D4"/>
     <w:multiLevelType w:val="multilevel"/>
     <w:tmpl w:val="539E5BC4"/>
@@ -23930,7 +24385,7 @@
       </w:rPr>
     </w:lvl>
   </w:abstractNum>
-  <w:abstractNum w:abstractNumId="89" w15:restartNumberingAfterBreak="0">
+  <w:abstractNum w:abstractNumId="91" w15:restartNumberingAfterBreak="0">
     <w:nsid w:val="6BEB5B6E"/>
     <w:multiLevelType w:val="multilevel"/>
     <w:tmpl w:val="AD16ADA2"/>
@@ -24079,7 +24534,7 @@
       </w:rPr>
     </w:lvl>
   </w:abstractNum>
-  <w:abstractNum w:abstractNumId="90" w15:restartNumberingAfterBreak="0">
+  <w:abstractNum w:abstractNumId="92" w15:restartNumberingAfterBreak="0">
     <w:nsid w:val="6EBC6396"/>
     <w:multiLevelType w:val="multilevel"/>
     <w:tmpl w:val="5DC00240"/>
@@ -24228,7 +24683,7 @@
       </w:rPr>
     </w:lvl>
   </w:abstractNum>
-  <w:abstractNum w:abstractNumId="91" w15:restartNumberingAfterBreak="0">
+  <w:abstractNum w:abstractNumId="93" w15:restartNumberingAfterBreak="0">
     <w:nsid w:val="70984741"/>
     <w:multiLevelType w:val="multilevel"/>
     <w:tmpl w:val="B7C0DB42"/>
@@ -24377,7 +24832,7 @@
       </w:rPr>
     </w:lvl>
   </w:abstractNum>
-  <w:abstractNum w:abstractNumId="92" w15:restartNumberingAfterBreak="0">
+  <w:abstractNum w:abstractNumId="94" w15:restartNumberingAfterBreak="0">
     <w:nsid w:val="70A66FC9"/>
     <w:multiLevelType w:val="multilevel"/>
     <w:tmpl w:val="74625442"/>
@@ -24526,7 +24981,7 @@
       </w:rPr>
     </w:lvl>
   </w:abstractNum>
-  <w:abstractNum w:abstractNumId="93" w15:restartNumberingAfterBreak="0">
+  <w:abstractNum w:abstractNumId="95" w15:restartNumberingAfterBreak="0">
     <w:nsid w:val="70F2444A"/>
     <w:multiLevelType w:val="multilevel"/>
     <w:tmpl w:val="1736EA64"/>
@@ -24639,7 +25094,7 @@
       </w:pPr>
     </w:lvl>
   </w:abstractNum>
-  <w:abstractNum w:abstractNumId="94" w15:restartNumberingAfterBreak="0">
+  <w:abstractNum w:abstractNumId="96" w15:restartNumberingAfterBreak="0">
     <w:nsid w:val="734A2F1F"/>
     <w:multiLevelType w:val="multilevel"/>
     <w:tmpl w:val="089227A6"/>
@@ -24788,7 +25243,7 @@
       </w:rPr>
     </w:lvl>
   </w:abstractNum>
-  <w:abstractNum w:abstractNumId="95" w15:restartNumberingAfterBreak="0">
+  <w:abstractNum w:abstractNumId="97" w15:restartNumberingAfterBreak="0">
     <w:nsid w:val="73D57EFD"/>
     <w:multiLevelType w:val="multilevel"/>
     <w:tmpl w:val="FAECE386"/>
@@ -24937,7 +25392,7 @@
       </w:rPr>
     </w:lvl>
   </w:abstractNum>
-  <w:abstractNum w:abstractNumId="96" w15:restartNumberingAfterBreak="0">
+  <w:abstractNum w:abstractNumId="98" w15:restartNumberingAfterBreak="0">
     <w:nsid w:val="75075F90"/>
     <w:multiLevelType w:val="hybridMultilevel"/>
     <w:tmpl w:val="6BDC4574"/>
@@ -25026,7 +25481,7 @@
       </w:pPr>
     </w:lvl>
   </w:abstractNum>
-  <w:abstractNum w:abstractNumId="97" w15:restartNumberingAfterBreak="0">
+  <w:abstractNum w:abstractNumId="99" w15:restartNumberingAfterBreak="0">
     <w:nsid w:val="75296430"/>
     <w:multiLevelType w:val="multilevel"/>
     <w:tmpl w:val="B01229E0"/>
@@ -25139,7 +25594,7 @@
       </w:pPr>
     </w:lvl>
   </w:abstractNum>
-  <w:abstractNum w:abstractNumId="98" w15:restartNumberingAfterBreak="0">
+  <w:abstractNum w:abstractNumId="100" w15:restartNumberingAfterBreak="0">
     <w:nsid w:val="754823EC"/>
     <w:multiLevelType w:val="multilevel"/>
     <w:tmpl w:val="8B6AF7A8"/>
@@ -25288,7 +25743,7 @@
       </w:rPr>
     </w:lvl>
   </w:abstractNum>
-  <w:abstractNum w:abstractNumId="99" w15:restartNumberingAfterBreak="0">
+  <w:abstractNum w:abstractNumId="101" w15:restartNumberingAfterBreak="0">
     <w:nsid w:val="75730546"/>
     <w:multiLevelType w:val="multilevel"/>
     <w:tmpl w:val="1FB261D0"/>
@@ -25437,7 +25892,7 @@
       </w:rPr>
     </w:lvl>
   </w:abstractNum>
-  <w:abstractNum w:abstractNumId="100" w15:restartNumberingAfterBreak="0">
+  <w:abstractNum w:abstractNumId="102" w15:restartNumberingAfterBreak="0">
     <w:nsid w:val="76AC7016"/>
     <w:multiLevelType w:val="multilevel"/>
     <w:tmpl w:val="B2CCCE04"/>
@@ -25586,7 +26041,7 @@
       </w:rPr>
     </w:lvl>
   </w:abstractNum>
-  <w:abstractNum w:abstractNumId="101" w15:restartNumberingAfterBreak="0">
+  <w:abstractNum w:abstractNumId="103" w15:restartNumberingAfterBreak="0">
     <w:nsid w:val="77100324"/>
     <w:multiLevelType w:val="multilevel"/>
     <w:tmpl w:val="3AF88C54"/>
@@ -25735,7 +26190,7 @@
       </w:rPr>
     </w:lvl>
   </w:abstractNum>
-  <w:abstractNum w:abstractNumId="102" w15:restartNumberingAfterBreak="0">
+  <w:abstractNum w:abstractNumId="104" w15:restartNumberingAfterBreak="0">
     <w:nsid w:val="7722377E"/>
     <w:multiLevelType w:val="multilevel"/>
     <w:tmpl w:val="2E1093F0"/>
@@ -25884,7 +26339,7 @@
       </w:rPr>
     </w:lvl>
   </w:abstractNum>
-  <w:abstractNum w:abstractNumId="103" w15:restartNumberingAfterBreak="0">
+  <w:abstractNum w:abstractNumId="105" w15:restartNumberingAfterBreak="0">
     <w:nsid w:val="782A395C"/>
     <w:multiLevelType w:val="multilevel"/>
     <w:tmpl w:val="719A7A28"/>
@@ -26033,7 +26488,7 @@
       </w:rPr>
     </w:lvl>
   </w:abstractNum>
-  <w:abstractNum w:abstractNumId="104" w15:restartNumberingAfterBreak="0">
+  <w:abstractNum w:abstractNumId="106" w15:restartNumberingAfterBreak="0">
     <w:nsid w:val="79D646B8"/>
     <w:multiLevelType w:val="multilevel"/>
     <w:tmpl w:val="929CF600"/>
@@ -26182,7 +26637,7 @@
       </w:rPr>
     </w:lvl>
   </w:abstractNum>
-  <w:abstractNum w:abstractNumId="105" w15:restartNumberingAfterBreak="0">
+  <w:abstractNum w:abstractNumId="107" w15:restartNumberingAfterBreak="0">
     <w:nsid w:val="7B856689"/>
     <w:multiLevelType w:val="multilevel"/>
     <w:tmpl w:val="DC067742"/>
@@ -26295,7 +26750,7 @@
       </w:pPr>
     </w:lvl>
   </w:abstractNum>
-  <w:abstractNum w:abstractNumId="106" w15:restartNumberingAfterBreak="0">
+  <w:abstractNum w:abstractNumId="108" w15:restartNumberingAfterBreak="0">
     <w:nsid w:val="7C7E34C5"/>
     <w:multiLevelType w:val="hybridMultilevel"/>
     <w:tmpl w:val="065C72EC"/>
@@ -26384,7 +26839,7 @@
       </w:pPr>
     </w:lvl>
   </w:abstractNum>
-  <w:abstractNum w:abstractNumId="107" w15:restartNumberingAfterBreak="0">
+  <w:abstractNum w:abstractNumId="109" w15:restartNumberingAfterBreak="0">
     <w:nsid w:val="7EE44CE9"/>
     <w:multiLevelType w:val="multilevel"/>
     <w:tmpl w:val="93D4968E"/>
@@ -26533,7 +26988,7 @@
       </w:rPr>
     </w:lvl>
   </w:abstractNum>
-  <w:abstractNum w:abstractNumId="108" w15:restartNumberingAfterBreak="0">
+  <w:abstractNum w:abstractNumId="110" w15:restartNumberingAfterBreak="0">
     <w:nsid w:val="7FD600F8"/>
     <w:multiLevelType w:val="multilevel"/>
     <w:tmpl w:val="BC00C094"/>
@@ -26683,331 +27138,337 @@
     </w:lvl>
   </w:abstractNum>
   <w:num w:numId="1" w16cid:durableId="1179660449">
+    <w:abstractNumId w:val="15"/>
+  </w:num>
+  <w:num w:numId="2" w16cid:durableId="1459879940">
+    <w:abstractNumId w:val="7"/>
+  </w:num>
+  <w:num w:numId="3" w16cid:durableId="1055130413">
+    <w:abstractNumId w:val="70"/>
+  </w:num>
+  <w:num w:numId="4" w16cid:durableId="248736793">
+    <w:abstractNumId w:val="102"/>
+  </w:num>
+  <w:num w:numId="5" w16cid:durableId="1822228661">
+    <w:abstractNumId w:val="50"/>
+  </w:num>
+  <w:num w:numId="6" w16cid:durableId="1653175230">
+    <w:abstractNumId w:val="54"/>
+  </w:num>
+  <w:num w:numId="7" w16cid:durableId="985282010">
+    <w:abstractNumId w:val="27"/>
+  </w:num>
+  <w:num w:numId="8" w16cid:durableId="1118524987">
+    <w:abstractNumId w:val="36"/>
+  </w:num>
+  <w:num w:numId="9" w16cid:durableId="129633178">
+    <w:abstractNumId w:val="67"/>
+  </w:num>
+  <w:num w:numId="10" w16cid:durableId="1827355922">
+    <w:abstractNumId w:val="56"/>
+  </w:num>
+  <w:num w:numId="11" w16cid:durableId="1372804390">
+    <w:abstractNumId w:val="35"/>
+  </w:num>
+  <w:num w:numId="12" w16cid:durableId="1605839281">
+    <w:abstractNumId w:val="72"/>
+  </w:num>
+  <w:num w:numId="13" w16cid:durableId="508983788">
+    <w:abstractNumId w:val="16"/>
+  </w:num>
+  <w:num w:numId="14" w16cid:durableId="1949119948">
+    <w:abstractNumId w:val="34"/>
+  </w:num>
+  <w:num w:numId="15" w16cid:durableId="571233725">
+    <w:abstractNumId w:val="18"/>
+  </w:num>
+  <w:num w:numId="16" w16cid:durableId="1339499990">
+    <w:abstractNumId w:val="11"/>
+  </w:num>
+  <w:num w:numId="17" w16cid:durableId="988093884">
+    <w:abstractNumId w:val="53"/>
+  </w:num>
+  <w:num w:numId="18" w16cid:durableId="519439636">
+    <w:abstractNumId w:val="97"/>
+  </w:num>
+  <w:num w:numId="19" w16cid:durableId="2145465952">
+    <w:abstractNumId w:val="104"/>
+  </w:num>
+  <w:num w:numId="20" w16cid:durableId="27875893">
+    <w:abstractNumId w:val="99"/>
+  </w:num>
+  <w:num w:numId="21" w16cid:durableId="1612054729">
+    <w:abstractNumId w:val="81"/>
+  </w:num>
+  <w:num w:numId="22" w16cid:durableId="217014819">
+    <w:abstractNumId w:val="19"/>
+  </w:num>
+  <w:num w:numId="23" w16cid:durableId="58945110">
+    <w:abstractNumId w:val="40"/>
+  </w:num>
+  <w:num w:numId="24" w16cid:durableId="955983789">
+    <w:abstractNumId w:val="2"/>
+  </w:num>
+  <w:num w:numId="25" w16cid:durableId="1659844384">
+    <w:abstractNumId w:val="66"/>
+  </w:num>
+  <w:num w:numId="26" w16cid:durableId="1596554331">
+    <w:abstractNumId w:val="76"/>
+  </w:num>
+  <w:num w:numId="27" w16cid:durableId="821698623">
+    <w:abstractNumId w:val="57"/>
+  </w:num>
+  <w:num w:numId="28" w16cid:durableId="438917775">
+    <w:abstractNumId w:val="65"/>
+  </w:num>
+  <w:num w:numId="29" w16cid:durableId="1675915068">
+    <w:abstractNumId w:val="101"/>
+  </w:num>
+  <w:num w:numId="30" w16cid:durableId="1739010472">
+    <w:abstractNumId w:val="20"/>
+  </w:num>
+  <w:num w:numId="31" w16cid:durableId="247613942">
+    <w:abstractNumId w:val="47"/>
+  </w:num>
+  <w:num w:numId="32" w16cid:durableId="404955412">
+    <w:abstractNumId w:val="17"/>
+  </w:num>
+  <w:num w:numId="33" w16cid:durableId="219291841">
+    <w:abstractNumId w:val="55"/>
+  </w:num>
+  <w:num w:numId="34" w16cid:durableId="5837897">
+    <w:abstractNumId w:val="62"/>
+  </w:num>
+  <w:num w:numId="35" w16cid:durableId="717436071">
+    <w:abstractNumId w:val="78"/>
+  </w:num>
+  <w:num w:numId="36" w16cid:durableId="1103721760">
+    <w:abstractNumId w:val="38"/>
+  </w:num>
+  <w:num w:numId="37" w16cid:durableId="740441483">
+    <w:abstractNumId w:val="12"/>
+  </w:num>
+  <w:num w:numId="38" w16cid:durableId="1825511526">
+    <w:abstractNumId w:val="63"/>
+  </w:num>
+  <w:num w:numId="39" w16cid:durableId="167793832">
+    <w:abstractNumId w:val="29"/>
+  </w:num>
+  <w:num w:numId="40" w16cid:durableId="1219395019">
+    <w:abstractNumId w:val="75"/>
+  </w:num>
+  <w:num w:numId="41" w16cid:durableId="1933314906">
+    <w:abstractNumId w:val="39"/>
+  </w:num>
+  <w:num w:numId="42" w16cid:durableId="1820340413">
+    <w:abstractNumId w:val="32"/>
+  </w:num>
+  <w:num w:numId="43" w16cid:durableId="1126704732">
+    <w:abstractNumId w:val="96"/>
+  </w:num>
+  <w:num w:numId="44" w16cid:durableId="1362513624">
+    <w:abstractNumId w:val="64"/>
+  </w:num>
+  <w:num w:numId="45" w16cid:durableId="2081563487">
+    <w:abstractNumId w:val="90"/>
+  </w:num>
+  <w:num w:numId="46" w16cid:durableId="1996757481">
+    <w:abstractNumId w:val="71"/>
+  </w:num>
+  <w:num w:numId="47" w16cid:durableId="1643000594">
     <w:abstractNumId w:val="14"/>
   </w:num>
-  <w:num w:numId="2" w16cid:durableId="1459879940">
-    <w:abstractNumId w:val="6"/>
+  <w:num w:numId="48" w16cid:durableId="1992054597">
+    <w:abstractNumId w:val="105"/>
   </w:num>
-  <w:num w:numId="3" w16cid:durableId="1055130413">
+  <w:num w:numId="49" w16cid:durableId="588540761">
+    <w:abstractNumId w:val="43"/>
+  </w:num>
+  <w:num w:numId="50" w16cid:durableId="1308899677">
+    <w:abstractNumId w:val="5"/>
+  </w:num>
+  <w:num w:numId="51" w16cid:durableId="655032958">
+    <w:abstractNumId w:val="73"/>
+  </w:num>
+  <w:num w:numId="52" w16cid:durableId="1614435522">
+    <w:abstractNumId w:val="107"/>
+  </w:num>
+  <w:num w:numId="53" w16cid:durableId="142504537">
+    <w:abstractNumId w:val="83"/>
+  </w:num>
+  <w:num w:numId="54" w16cid:durableId="2109883224">
+    <w:abstractNumId w:val="26"/>
+  </w:num>
+  <w:num w:numId="55" w16cid:durableId="1548638930">
     <w:abstractNumId w:val="69"/>
   </w:num>
-  <w:num w:numId="4" w16cid:durableId="248736793">
-    <w:abstractNumId w:val="100"/>
-  </w:num>
-  <w:num w:numId="5" w16cid:durableId="1822228661">
-    <w:abstractNumId w:val="49"/>
-  </w:num>
-  <w:num w:numId="6" w16cid:durableId="1653175230">
-    <w:abstractNumId w:val="53"/>
-  </w:num>
-  <w:num w:numId="7" w16cid:durableId="985282010">
-    <w:abstractNumId w:val="26"/>
-  </w:num>
-  <w:num w:numId="8" w16cid:durableId="1118524987">
-    <w:abstractNumId w:val="35"/>
-  </w:num>
-  <w:num w:numId="9" w16cid:durableId="129633178">
-    <w:abstractNumId w:val="66"/>
-  </w:num>
-  <w:num w:numId="10" w16cid:durableId="1827355922">
-    <w:abstractNumId w:val="55"/>
-  </w:num>
-  <w:num w:numId="11" w16cid:durableId="1372804390">
-    <w:abstractNumId w:val="34"/>
-  </w:num>
-  <w:num w:numId="12" w16cid:durableId="1605839281">
-    <w:abstractNumId w:val="71"/>
-  </w:num>
-  <w:num w:numId="13" w16cid:durableId="508983788">
-    <w:abstractNumId w:val="15"/>
-  </w:num>
-  <w:num w:numId="14" w16cid:durableId="1949119948">
-    <w:abstractNumId w:val="33"/>
-  </w:num>
-  <w:num w:numId="15" w16cid:durableId="571233725">
-    <w:abstractNumId w:val="17"/>
-  </w:num>
-  <w:num w:numId="16" w16cid:durableId="1339499990">
-    <w:abstractNumId w:val="10"/>
-  </w:num>
-  <w:num w:numId="17" w16cid:durableId="988093884">
-    <w:abstractNumId w:val="52"/>
-  </w:num>
-  <w:num w:numId="18" w16cid:durableId="519439636">
-    <w:abstractNumId w:val="95"/>
-  </w:num>
-  <w:num w:numId="19" w16cid:durableId="2145465952">
-    <w:abstractNumId w:val="102"/>
-  </w:num>
-  <w:num w:numId="20" w16cid:durableId="27875893">
-    <w:abstractNumId w:val="97"/>
-  </w:num>
-  <w:num w:numId="21" w16cid:durableId="1612054729">
-    <w:abstractNumId w:val="80"/>
-  </w:num>
-  <w:num w:numId="22" w16cid:durableId="217014819">
-    <w:abstractNumId w:val="18"/>
-  </w:num>
-  <w:num w:numId="23" w16cid:durableId="58945110">
-    <w:abstractNumId w:val="39"/>
-  </w:num>
-  <w:num w:numId="24" w16cid:durableId="955983789">
-    <w:abstractNumId w:val="1"/>
-  </w:num>
-  <w:num w:numId="25" w16cid:durableId="1659844384">
-    <w:abstractNumId w:val="65"/>
-  </w:num>
-  <w:num w:numId="26" w16cid:durableId="1596554331">
-    <w:abstractNumId w:val="75"/>
-  </w:num>
-  <w:num w:numId="27" w16cid:durableId="821698623">
-    <w:abstractNumId w:val="56"/>
-  </w:num>
-  <w:num w:numId="28" w16cid:durableId="438917775">
-    <w:abstractNumId w:val="64"/>
-  </w:num>
-  <w:num w:numId="29" w16cid:durableId="1675915068">
-    <w:abstractNumId w:val="99"/>
-  </w:num>
-  <w:num w:numId="30" w16cid:durableId="1739010472">
-    <w:abstractNumId w:val="19"/>
-  </w:num>
-  <w:num w:numId="31" w16cid:durableId="247613942">
-    <w:abstractNumId w:val="46"/>
-  </w:num>
-  <w:num w:numId="32" w16cid:durableId="404955412">
-    <w:abstractNumId w:val="16"/>
-  </w:num>
-  <w:num w:numId="33" w16cid:durableId="219291841">
-    <w:abstractNumId w:val="54"/>
-  </w:num>
-  <w:num w:numId="34" w16cid:durableId="5837897">
-    <w:abstractNumId w:val="61"/>
-  </w:num>
-  <w:num w:numId="35" w16cid:durableId="717436071">
-    <w:abstractNumId w:val="77"/>
-  </w:num>
-  <w:num w:numId="36" w16cid:durableId="1103721760">
-    <w:abstractNumId w:val="37"/>
-  </w:num>
-  <w:num w:numId="37" w16cid:durableId="740441483">
-    <w:abstractNumId w:val="11"/>
-  </w:num>
-  <w:num w:numId="38" w16cid:durableId="1825511526">
-    <w:abstractNumId w:val="62"/>
-  </w:num>
-  <w:num w:numId="39" w16cid:durableId="167793832">
-    <w:abstractNumId w:val="28"/>
-  </w:num>
-  <w:num w:numId="40" w16cid:durableId="1219395019">
-    <w:abstractNumId w:val="74"/>
-  </w:num>
-  <w:num w:numId="41" w16cid:durableId="1933314906">
-    <w:abstractNumId w:val="38"/>
-  </w:num>
-  <w:num w:numId="42" w16cid:durableId="1820340413">
-    <w:abstractNumId w:val="31"/>
-  </w:num>
-  <w:num w:numId="43" w16cid:durableId="1126704732">
-    <w:abstractNumId w:val="94"/>
-  </w:num>
-  <w:num w:numId="44" w16cid:durableId="1362513624">
-    <w:abstractNumId w:val="63"/>
-  </w:num>
-  <w:num w:numId="45" w16cid:durableId="2081563487">
-    <w:abstractNumId w:val="88"/>
-  </w:num>
-  <w:num w:numId="46" w16cid:durableId="1996757481">
-    <w:abstractNumId w:val="70"/>
-  </w:num>
-  <w:num w:numId="47" w16cid:durableId="1643000594">
-    <w:abstractNumId w:val="13"/>
-  </w:num>
-  <w:num w:numId="48" w16cid:durableId="1992054597">
-    <w:abstractNumId w:val="103"/>
-  </w:num>
-  <w:num w:numId="49" w16cid:durableId="588540761">
-    <w:abstractNumId w:val="42"/>
-  </w:num>
-  <w:num w:numId="50" w16cid:durableId="1308899677">
-    <w:abstractNumId w:val="4"/>
-  </w:num>
-  <w:num w:numId="51" w16cid:durableId="655032958">
-    <w:abstractNumId w:val="72"/>
-  </w:num>
-  <w:num w:numId="52" w16cid:durableId="1614435522">
-    <w:abstractNumId w:val="105"/>
-  </w:num>
-  <w:num w:numId="53" w16cid:durableId="142504537">
-    <w:abstractNumId w:val="82"/>
-  </w:num>
-  <w:num w:numId="54" w16cid:durableId="2109883224">
-    <w:abstractNumId w:val="25"/>
-  </w:num>
-  <w:num w:numId="55" w16cid:durableId="1548638930">
-    <w:abstractNumId w:val="68"/>
-  </w:num>
   <w:num w:numId="56" w16cid:durableId="1430657547">
-    <w:abstractNumId w:val="90"/>
+    <w:abstractNumId w:val="92"/>
   </w:num>
   <w:num w:numId="57" w16cid:durableId="664820925">
-    <w:abstractNumId w:val="86"/>
+    <w:abstractNumId w:val="88"/>
   </w:num>
   <w:num w:numId="58" w16cid:durableId="1354722071">
     <w:abstractNumId w:val="0"/>
   </w:num>
   <w:num w:numId="59" w16cid:durableId="521895665">
-    <w:abstractNumId w:val="43"/>
+    <w:abstractNumId w:val="44"/>
   </w:num>
   <w:num w:numId="60" w16cid:durableId="1157303776">
+    <w:abstractNumId w:val="52"/>
+  </w:num>
+  <w:num w:numId="61" w16cid:durableId="823202564">
+    <w:abstractNumId w:val="109"/>
+  </w:num>
+  <w:num w:numId="62" w16cid:durableId="2053995942">
+    <w:abstractNumId w:val="68"/>
+  </w:num>
+  <w:num w:numId="63" w16cid:durableId="1894802655">
+    <w:abstractNumId w:val="6"/>
+  </w:num>
+  <w:num w:numId="64" w16cid:durableId="613559521">
+    <w:abstractNumId w:val="4"/>
+  </w:num>
+  <w:num w:numId="65" w16cid:durableId="417295105">
+    <w:abstractNumId w:val="93"/>
+  </w:num>
+  <w:num w:numId="66" w16cid:durableId="641615853">
+    <w:abstractNumId w:val="61"/>
+  </w:num>
+  <w:num w:numId="67" w16cid:durableId="833839637">
+    <w:abstractNumId w:val="22"/>
+  </w:num>
+  <w:num w:numId="68" w16cid:durableId="655651359">
+    <w:abstractNumId w:val="8"/>
+  </w:num>
+  <w:num w:numId="69" w16cid:durableId="2121335978">
+    <w:abstractNumId w:val="80"/>
+  </w:num>
+  <w:num w:numId="70" w16cid:durableId="1993630215">
+    <w:abstractNumId w:val="24"/>
+  </w:num>
+  <w:num w:numId="71" w16cid:durableId="526142363">
+    <w:abstractNumId w:val="87"/>
+  </w:num>
+  <w:num w:numId="72" w16cid:durableId="784544987">
+    <w:abstractNumId w:val="13"/>
+  </w:num>
+  <w:num w:numId="73" w16cid:durableId="1497844578">
+    <w:abstractNumId w:val="86"/>
+  </w:num>
+  <w:num w:numId="74" w16cid:durableId="1883859669">
+    <w:abstractNumId w:val="45"/>
+  </w:num>
+  <w:num w:numId="75" w16cid:durableId="1063137126">
     <w:abstractNumId w:val="51"/>
   </w:num>
-  <w:num w:numId="61" w16cid:durableId="823202564">
-    <w:abstractNumId w:val="107"/>
+  <w:num w:numId="76" w16cid:durableId="140998932">
+    <w:abstractNumId w:val="9"/>
   </w:num>
-  <w:num w:numId="62" w16cid:durableId="2053995942">
-    <w:abstractNumId w:val="67"/>
+  <w:num w:numId="77" w16cid:durableId="5596073">
+    <w:abstractNumId w:val="77"/>
   </w:num>
-  <w:num w:numId="63" w16cid:durableId="1894802655">
-    <w:abstractNumId w:val="5"/>
+  <w:num w:numId="78" w16cid:durableId="1061178945">
+    <w:abstractNumId w:val="31"/>
   </w:num>
-  <w:num w:numId="64" w16cid:durableId="613559521">
+  <w:num w:numId="79" w16cid:durableId="1680037146">
+    <w:abstractNumId w:val="91"/>
+  </w:num>
+  <w:num w:numId="80" w16cid:durableId="524944127">
+    <w:abstractNumId w:val="25"/>
+  </w:num>
+  <w:num w:numId="81" w16cid:durableId="2039237707">
+    <w:abstractNumId w:val="30"/>
+  </w:num>
+  <w:num w:numId="82" w16cid:durableId="1907452170">
+    <w:abstractNumId w:val="23"/>
+  </w:num>
+  <w:num w:numId="83" w16cid:durableId="612596680">
+    <w:abstractNumId w:val="33"/>
+  </w:num>
+  <w:num w:numId="84" w16cid:durableId="1493057037">
+    <w:abstractNumId w:val="95"/>
+  </w:num>
+  <w:num w:numId="85" w16cid:durableId="831916144">
+    <w:abstractNumId w:val="41"/>
+  </w:num>
+  <w:num w:numId="86" w16cid:durableId="271519247">
+    <w:abstractNumId w:val="58"/>
+  </w:num>
+  <w:num w:numId="87" w16cid:durableId="995962251">
+    <w:abstractNumId w:val="10"/>
+  </w:num>
+  <w:num w:numId="88" w16cid:durableId="1902400747">
+    <w:abstractNumId w:val="79"/>
+  </w:num>
+  <w:num w:numId="89" w16cid:durableId="1394280940">
+    <w:abstractNumId w:val="110"/>
+  </w:num>
+  <w:num w:numId="90" w16cid:durableId="815033178">
+    <w:abstractNumId w:val="49"/>
+  </w:num>
+  <w:num w:numId="91" w16cid:durableId="1508909397">
+    <w:abstractNumId w:val="108"/>
+  </w:num>
+  <w:num w:numId="92" w16cid:durableId="1335566906">
+    <w:abstractNumId w:val="98"/>
+  </w:num>
+  <w:num w:numId="93" w16cid:durableId="967010773">
+    <w:abstractNumId w:val="74"/>
+  </w:num>
+  <w:num w:numId="94" w16cid:durableId="689333195">
+    <w:abstractNumId w:val="60"/>
+  </w:num>
+  <w:num w:numId="95" w16cid:durableId="2064331959">
+    <w:abstractNumId w:val="48"/>
+  </w:num>
+  <w:num w:numId="96" w16cid:durableId="1053508107">
     <w:abstractNumId w:val="3"/>
   </w:num>
-  <w:num w:numId="65" w16cid:durableId="417295105">
-    <w:abstractNumId w:val="91"/>
+  <w:num w:numId="97" w16cid:durableId="1624656807">
+    <w:abstractNumId w:val="94"/>
   </w:num>
-  <w:num w:numId="66" w16cid:durableId="641615853">
-    <w:abstractNumId w:val="60"/>
+  <w:num w:numId="98" w16cid:durableId="930773475">
+    <w:abstractNumId w:val="82"/>
   </w:num>
-  <w:num w:numId="67" w16cid:durableId="833839637">
+  <w:num w:numId="99" w16cid:durableId="60251421">
+    <w:abstractNumId w:val="106"/>
+  </w:num>
+  <w:num w:numId="100" w16cid:durableId="1788043942">
+    <w:abstractNumId w:val="103"/>
+  </w:num>
+  <w:num w:numId="101" w16cid:durableId="1440026394">
+    <w:abstractNumId w:val="46"/>
+  </w:num>
+  <w:num w:numId="102" w16cid:durableId="822814824">
+    <w:abstractNumId w:val="37"/>
+  </w:num>
+  <w:num w:numId="103" w16cid:durableId="1016922420">
+    <w:abstractNumId w:val="42"/>
+  </w:num>
+  <w:num w:numId="104" w16cid:durableId="489758148">
+    <w:abstractNumId w:val="84"/>
+  </w:num>
+  <w:num w:numId="105" w16cid:durableId="1929845277">
+    <w:abstractNumId w:val="28"/>
+  </w:num>
+  <w:num w:numId="106" w16cid:durableId="1325165875">
+    <w:abstractNumId w:val="100"/>
+  </w:num>
+  <w:num w:numId="107" w16cid:durableId="588468068">
+    <w:abstractNumId w:val="89"/>
+  </w:num>
+  <w:num w:numId="108" w16cid:durableId="1108037688">
     <w:abstractNumId w:val="21"/>
   </w:num>
-  <w:num w:numId="68" w16cid:durableId="655651359">
-    <w:abstractNumId w:val="7"/>
-  </w:num>
-  <w:num w:numId="69" w16cid:durableId="2121335978">
-    <w:abstractNumId w:val="79"/>
-  </w:num>
-  <w:num w:numId="70" w16cid:durableId="1993630215">
-    <w:abstractNumId w:val="23"/>
-  </w:num>
-  <w:num w:numId="71" w16cid:durableId="526142363">
-    <w:abstractNumId w:val="85"/>
-  </w:num>
-  <w:num w:numId="72" w16cid:durableId="784544987">
-    <w:abstractNumId w:val="12"/>
-  </w:num>
-  <w:num w:numId="73" w16cid:durableId="1497844578">
-    <w:abstractNumId w:val="84"/>
-  </w:num>
-  <w:num w:numId="74" w16cid:durableId="1883859669">
-    <w:abstractNumId w:val="44"/>
-  </w:num>
-  <w:num w:numId="75" w16cid:durableId="1063137126">
-    <w:abstractNumId w:val="50"/>
-  </w:num>
-  <w:num w:numId="76" w16cid:durableId="140998932">
-    <w:abstractNumId w:val="8"/>
-  </w:num>
-  <w:num w:numId="77" w16cid:durableId="5596073">
-    <w:abstractNumId w:val="76"/>
-  </w:num>
-  <w:num w:numId="78" w16cid:durableId="1061178945">
-    <w:abstractNumId w:val="30"/>
-  </w:num>
-  <w:num w:numId="79" w16cid:durableId="1680037146">
-    <w:abstractNumId w:val="89"/>
-  </w:num>
-  <w:num w:numId="80" w16cid:durableId="524944127">
-    <w:abstractNumId w:val="24"/>
-  </w:num>
-  <w:num w:numId="81" w16cid:durableId="2039237707">
-    <w:abstractNumId w:val="29"/>
-  </w:num>
-  <w:num w:numId="82" w16cid:durableId="1907452170">
-    <w:abstractNumId w:val="22"/>
-  </w:num>
-  <w:num w:numId="83" w16cid:durableId="612596680">
-    <w:abstractNumId w:val="32"/>
-  </w:num>
-  <w:num w:numId="84" w16cid:durableId="1493057037">
-    <w:abstractNumId w:val="93"/>
-  </w:num>
-  <w:num w:numId="85" w16cid:durableId="831916144">
-    <w:abstractNumId w:val="40"/>
-  </w:num>
-  <w:num w:numId="86" w16cid:durableId="271519247">
-    <w:abstractNumId w:val="57"/>
-  </w:num>
-  <w:num w:numId="87" w16cid:durableId="995962251">
-    <w:abstractNumId w:val="9"/>
-  </w:num>
-  <w:num w:numId="88" w16cid:durableId="1902400747">
-    <w:abstractNumId w:val="78"/>
-  </w:num>
-  <w:num w:numId="89" w16cid:durableId="1394280940">
-    <w:abstractNumId w:val="108"/>
-  </w:num>
-  <w:num w:numId="90" w16cid:durableId="815033178">
-    <w:abstractNumId w:val="48"/>
-  </w:num>
-  <w:num w:numId="91" w16cid:durableId="1508909397">
-    <w:abstractNumId w:val="106"/>
-  </w:num>
-  <w:num w:numId="92" w16cid:durableId="1335566906">
-    <w:abstractNumId w:val="96"/>
-  </w:num>
-  <w:num w:numId="93" w16cid:durableId="967010773">
-    <w:abstractNumId w:val="73"/>
-  </w:num>
-  <w:num w:numId="94" w16cid:durableId="689333195">
+  <w:num w:numId="109" w16cid:durableId="339241689">
     <w:abstractNumId w:val="59"/>
   </w:num>
-  <w:num w:numId="95" w16cid:durableId="2064331959">
-    <w:abstractNumId w:val="47"/>
+  <w:num w:numId="110" w16cid:durableId="459154620">
+    <w:abstractNumId w:val="1"/>
   </w:num>
-  <w:num w:numId="96" w16cid:durableId="1053508107">
-    <w:abstractNumId w:val="2"/>
-  </w:num>
-  <w:num w:numId="97" w16cid:durableId="1624656807">
-    <w:abstractNumId w:val="92"/>
-  </w:num>
-  <w:num w:numId="98" w16cid:durableId="930773475">
-    <w:abstractNumId w:val="81"/>
-  </w:num>
-  <w:num w:numId="99" w16cid:durableId="60251421">
-    <w:abstractNumId w:val="104"/>
-  </w:num>
-  <w:num w:numId="100" w16cid:durableId="1788043942">
-    <w:abstractNumId w:val="101"/>
-  </w:num>
-  <w:num w:numId="101" w16cid:durableId="1440026394">
-    <w:abstractNumId w:val="45"/>
-  </w:num>
-  <w:num w:numId="102" w16cid:durableId="822814824">
-    <w:abstractNumId w:val="36"/>
-  </w:num>
-  <w:num w:numId="103" w16cid:durableId="1016922420">
-    <w:abstractNumId w:val="41"/>
-  </w:num>
-  <w:num w:numId="104" w16cid:durableId="489758148">
-    <w:abstractNumId w:val="83"/>
-  </w:num>
-  <w:num w:numId="105" w16cid:durableId="1929845277">
-    <w:abstractNumId w:val="27"/>
-  </w:num>
-  <w:num w:numId="106" w16cid:durableId="1325165875">
-    <w:abstractNumId w:val="98"/>
-  </w:num>
-  <w:num w:numId="107" w16cid:durableId="588468068">
-    <w:abstractNumId w:val="87"/>
-  </w:num>
-  <w:num w:numId="108" w16cid:durableId="1108037688">
-    <w:abstractNumId w:val="20"/>
-  </w:num>
-  <w:num w:numId="109" w16cid:durableId="339241689">
-    <w:abstractNumId w:val="58"/>
+  <w:num w:numId="111" w16cid:durableId="1150026384">
+    <w:abstractNumId w:val="85"/>
   </w:num>
 </w:numbering>
 </file>
@@ -27614,7 +28075,6 @@
   <w:style w:type="character" w:default="1" w:styleId="DefaultParagraphFont">
     <w:name w:val="Default Paragraph Font"/>
     <w:uiPriority w:val="1"/>
-    <w:semiHidden/>
     <w:unhideWhenUsed/>
   </w:style>
   <w:style w:type="table" w:default="1" w:styleId="TableNormal">

</xml_diff>

<commit_message>
Update StatisticalAnalysis notebook and remarks
Populate StatisticalAnalysis.ipynb with executed analysis outputs and visualizations: added computed statistics (Type-Token Ratio, vocabulary size, bigram diversity), effect size (Cohen's d), mixed-dataset degradation summary, printed summaries, and saved results_comparison.png. Also update docs/LLM Collapse Paper - Sharon remarks.docx to include Sharon's remarks/reviewer feedback.
</commit_message>
<xml_diff>
--- a/docs/LLM Collapse Paper - Sharon remarks.docx
+++ b/docs/LLM Collapse Paper - Sharon remarks.docx
@@ -4468,35 +4468,7 @@
         <w:rPr>
           <w:rFonts w:cstheme="minorHAnsi"/>
         </w:rPr>
-        <w:t xml:space="preserve"> Generate responses per model using factual prompts covering biographical, historical, and cultural domains. An automated pipeline extracts factual claims and verifies them against knowledge bases (</w:t>
-      </w:r>
-      <w:proofErr w:type="spellStart"/>
-      <w:r>
-        <w:rPr>
-          <w:rFonts w:cstheme="minorHAnsi"/>
-        </w:rPr>
-        <w:t>Wikidata</w:t>
-      </w:r>
-      <w:proofErr w:type="spellEnd"/>
-      <w:r>
-        <w:rPr>
-          <w:rFonts w:cstheme="minorHAnsi"/>
-        </w:rPr>
-        <w:t xml:space="preserve">, Google Knowledge Graph). Custom datasets target rare facts often lost during collapse, building on established benchmarks like </w:t>
-      </w:r>
-      <w:proofErr w:type="spellStart"/>
-      <w:r>
-        <w:rPr>
-          <w:rFonts w:cstheme="minorHAnsi"/>
-        </w:rPr>
-        <w:t>FactScore</w:t>
-      </w:r>
-      <w:proofErr w:type="spellEnd"/>
-      <w:r>
-        <w:rPr>
-          <w:rFonts w:cstheme="minorHAnsi"/>
-        </w:rPr>
-        <w:t xml:space="preserve"> (contains human</w:t>
+        <w:t xml:space="preserve"> Generate responses per model using factual prompts covering biographical, historical, and cultural domains. An automated pipeline extracts factual claims and verifies them against knowledge bases (Wikidata, Google Knowledge Graph). Custom datasets target rare facts often lost during collapse, building on established benchmarks like FactScore (contains human</w:t>
       </w:r>
       <w:r>
         <w:rPr>
@@ -6232,21 +6204,7 @@
         <w:rPr>
           <w:rFonts w:cstheme="minorHAnsi"/>
         </w:rPr>
-        <w:t xml:space="preserve">All model training was conducted using Google </w:t>
-      </w:r>
-      <w:proofErr w:type="spellStart"/>
-      <w:r>
-        <w:rPr>
-          <w:rFonts w:cstheme="minorHAnsi"/>
-        </w:rPr>
-        <w:t>Colab</w:t>
-      </w:r>
-      <w:proofErr w:type="spellEnd"/>
-      <w:r>
-        <w:rPr>
-          <w:rFonts w:cstheme="minorHAnsi"/>
-        </w:rPr>
-        <w:t xml:space="preserve"> Pro with NVIDIA A100 GPU (40GB VRAM) to ensure consistent computational environment across all training runs. </w:t>
+        <w:t xml:space="preserve">All model training was conducted using Google Colab Pro with NVIDIA A100 GPU (40GB VRAM) to ensure consistent computational environment across all training runs. </w:t>
       </w:r>
     </w:p>
     <w:p>
@@ -6922,72 +6880,46 @@
           <w:b/>
           <w:bCs/>
         </w:rPr>
-        <w:t xml:space="preserve">tuning Method: </w:t>
-      </w:r>
-      <w:proofErr w:type="spellStart"/>
+        <w:t>tuning Method: LoRA (Low</w:t>
+      </w:r>
       <w:r>
         <w:rPr>
           <w:rFonts w:cstheme="minorHAnsi"/>
           <w:b/>
           <w:bCs/>
         </w:rPr>
-        <w:t>LoRA</w:t>
-      </w:r>
-      <w:proofErr w:type="spellEnd"/>
+        <w:t>-</w:t>
+      </w:r>
       <w:r>
         <w:rPr>
           <w:rFonts w:cstheme="minorHAnsi"/>
           <w:b/>
           <w:bCs/>
         </w:rPr>
-        <w:t xml:space="preserve"> (Low</w:t>
-      </w:r>
-      <w:r>
-        <w:rPr>
-          <w:rFonts w:cstheme="minorHAnsi"/>
-          <w:b/>
-          <w:bCs/>
+        <w:t>Rank Adaptation)</w:t>
+      </w:r>
+    </w:p>
+    <w:p>
+      <w:pPr>
+        <w:rPr>
+          <w:rFonts w:cstheme="minorHAnsi"/>
+        </w:rPr>
+      </w:pPr>
+      <w:r>
+        <w:rPr>
+          <w:rFonts w:cstheme="minorHAnsi"/>
+        </w:rPr>
+        <w:t>LoRA enables efficient fine</w:t>
+      </w:r>
+      <w:r>
+        <w:rPr>
+          <w:rFonts w:cstheme="minorHAnsi"/>
         </w:rPr>
         <w:t>-</w:t>
       </w:r>
       <w:r>
         <w:rPr>
           <w:rFonts w:cstheme="minorHAnsi"/>
-          <w:b/>
-          <w:bCs/>
-        </w:rPr>
-        <w:t>Rank Adaptation)</w:t>
-      </w:r>
-    </w:p>
-    <w:p>
-      <w:pPr>
-        <w:rPr>
-          <w:rFonts w:cstheme="minorHAnsi"/>
-        </w:rPr>
-      </w:pPr>
-      <w:proofErr w:type="spellStart"/>
-      <w:r>
-        <w:rPr>
-          <w:rFonts w:cstheme="minorHAnsi"/>
-        </w:rPr>
-        <w:t>LoRA</w:t>
-      </w:r>
-      <w:proofErr w:type="spellEnd"/>
-      <w:r>
-        <w:rPr>
-          <w:rFonts w:cstheme="minorHAnsi"/>
-        </w:rPr>
-        <w:t xml:space="preserve"> enables efficient fine</w:t>
-      </w:r>
-      <w:r>
-        <w:rPr>
-          <w:rFonts w:cstheme="minorHAnsi"/>
-        </w:rPr>
-        <w:t>-</w:t>
-      </w:r>
-      <w:r>
-        <w:rPr>
-          <w:rFonts w:cstheme="minorHAnsi"/>
         </w:rPr>
         <w:t xml:space="preserve">tuning by training only a small subset of model parameters (0.19%) while keeping the base model unchanged. This reduces computational costs while maintaining performance. </w:t>
       </w:r>
@@ -6995,21 +6927,7 @@
         <w:rPr>
           <w:rFonts w:cstheme="minorHAnsi"/>
         </w:rPr>
-        <w:t xml:space="preserve">Identical </w:t>
-      </w:r>
-      <w:proofErr w:type="spellStart"/>
-      <w:r>
-        <w:rPr>
-          <w:rFonts w:cstheme="minorHAnsi"/>
-        </w:rPr>
-        <w:t>LoRA</w:t>
-      </w:r>
-      <w:proofErr w:type="spellEnd"/>
-      <w:r>
-        <w:rPr>
-          <w:rFonts w:cstheme="minorHAnsi"/>
-        </w:rPr>
-        <w:t xml:space="preserve"> configuration was applied across all three datasets (human, AI, mixed) to ensure that observed differences originated solely from dataset quality rather than training methodology.</w:t>
+        <w:t>Identical LoRA configuration was applied across all three datasets (human, AI, mixed) to ensure that observed differences originated solely from dataset quality rather than training methodology.</w:t>
       </w:r>
     </w:p>
     <w:p>
@@ -7096,23 +7014,13 @@
           <w:rFonts w:cstheme="minorHAnsi"/>
         </w:rPr>
       </w:pPr>
-      <w:proofErr w:type="spellStart"/>
       <w:r>
         <w:rPr>
           <w:rFonts w:cstheme="minorHAnsi"/>
           <w:b/>
           <w:bCs/>
         </w:rPr>
-        <w:t>LoRA</w:t>
-      </w:r>
-      <w:proofErr w:type="spellEnd"/>
-      <w:r>
-        <w:rPr>
-          <w:rFonts w:cstheme="minorHAnsi"/>
-          <w:b/>
-          <w:bCs/>
-        </w:rPr>
-        <w:t xml:space="preserve"> Configuration:</w:t>
+        <w:t>LoRA Configuration:</w:t>
       </w:r>
     </w:p>
     <w:p>
@@ -7292,16 +7200,8 @@
         <w:rPr>
           <w:rFonts w:cstheme="minorHAnsi"/>
         </w:rPr>
-        <w:t xml:space="preserve">Optimizer: </w:t>
-      </w:r>
-      <w:proofErr w:type="spellStart"/>
-      <w:r>
-        <w:rPr>
-          <w:rFonts w:cstheme="minorHAnsi"/>
-        </w:rPr>
-        <w:t>AdamW</w:t>
-      </w:r>
-      <w:proofErr w:type="spellEnd"/>
+        <w:t>Optimizer: AdamW</w:t>
+      </w:r>
     </w:p>
     <w:p>
       <w:pPr>
@@ -7829,49 +7729,7 @@
         <w:rPr>
           <w:lang w:bidi="he-IL"/>
         </w:rPr>
-        <w:t>Self-BLEU = mean BLEU(</w:t>
-      </w:r>
-      <w:proofErr w:type="spellStart"/>
-      <w:r>
-        <w:rPr>
-          <w:lang w:bidi="he-IL"/>
-        </w:rPr>
-        <w:t>output_i</w:t>
-      </w:r>
-      <w:proofErr w:type="spellEnd"/>
-      <w:r>
-        <w:rPr>
-          <w:lang w:bidi="he-IL"/>
-        </w:rPr>
-        <w:t>, {</w:t>
-      </w:r>
-      <w:proofErr w:type="spellStart"/>
-      <w:r>
-        <w:rPr>
-          <w:lang w:bidi="he-IL"/>
-        </w:rPr>
-        <w:t>output_j</w:t>
-      </w:r>
-      <w:proofErr w:type="spellEnd"/>
-      <w:r>
-        <w:rPr>
-          <w:lang w:bidi="he-IL"/>
-        </w:rPr>
-        <w:t xml:space="preserve"> | j ≠ </w:t>
-      </w:r>
-      <w:proofErr w:type="spellStart"/>
-      <w:r>
-        <w:rPr>
-          <w:lang w:bidi="he-IL"/>
-        </w:rPr>
-        <w:t>i</w:t>
-      </w:r>
-      <w:proofErr w:type="spellEnd"/>
-      <w:r>
-        <w:rPr>
-          <w:lang w:bidi="he-IL"/>
-        </w:rPr>
-        <w:t>})</w:t>
+        <w:t>Self-BLEU = mean BLEU(output_i, {output_j | j ≠ i})</w:t>
       </w:r>
     </w:p>
     <w:p>
@@ -10213,209 +10071,15 @@
           <w:rFonts w:cstheme="minorHAnsi"/>
         </w:rPr>
       </w:pPr>
-    </w:p>
-    <w:p>
-      <w:pPr>
-        <w:rPr>
-          <w:rFonts w:cstheme="minorHAnsi"/>
-        </w:rPr>
-      </w:pPr>
-    </w:p>
-    <w:p>
-      <w:pPr>
-        <w:rPr>
-          <w:rFonts w:cstheme="minorHAnsi"/>
-        </w:rPr>
-      </w:pPr>
-    </w:p>
-    <w:p>
-      <w:pPr>
-        <w:rPr>
-          <w:rFonts w:cstheme="minorHAnsi"/>
-        </w:rPr>
-      </w:pPr>
-    </w:p>
-    <w:p>
-      <w:pPr>
-        <w:rPr>
-          <w:rFonts w:cstheme="minorHAnsi"/>
-        </w:rPr>
-      </w:pPr>
-    </w:p>
-    <w:p>
-      <w:pPr>
-        <w:rPr>
-          <w:rFonts w:cstheme="minorHAnsi"/>
-        </w:rPr>
-      </w:pPr>
-    </w:p>
-    <w:p>
-      <w:pPr>
-        <w:rPr>
-          <w:rFonts w:cstheme="minorHAnsi"/>
-        </w:rPr>
-      </w:pPr>
-    </w:p>
-    <w:p>
-      <w:pPr>
-        <w:rPr>
-          <w:rFonts w:cstheme="minorHAnsi"/>
-        </w:rPr>
-      </w:pPr>
-    </w:p>
-    <w:p>
-      <w:pPr>
-        <w:rPr>
-          <w:rFonts w:cstheme="minorHAnsi"/>
-        </w:rPr>
-      </w:pPr>
-    </w:p>
-    <w:p>
-      <w:pPr>
-        <w:rPr>
-          <w:rFonts w:cstheme="minorHAnsi"/>
-        </w:rPr>
-      </w:pPr>
-    </w:p>
-    <w:p>
-      <w:pPr>
-        <w:rPr>
-          <w:rFonts w:cstheme="minorHAnsi"/>
-        </w:rPr>
-      </w:pPr>
-    </w:p>
-    <w:p>
-      <w:pPr>
-        <w:rPr>
-          <w:rFonts w:cstheme="minorHAnsi"/>
-        </w:rPr>
-      </w:pPr>
-    </w:p>
-    <w:p>
-      <w:pPr>
-        <w:rPr>
-          <w:rFonts w:cstheme="minorHAnsi"/>
-        </w:rPr>
-      </w:pPr>
-    </w:p>
-    <w:p>
-      <w:pPr>
-        <w:rPr>
-          <w:rFonts w:cstheme="minorHAnsi"/>
-        </w:rPr>
-      </w:pPr>
-    </w:p>
-    <w:p>
-      <w:pPr>
-        <w:rPr>
-          <w:rFonts w:cstheme="minorHAnsi"/>
-        </w:rPr>
-      </w:pPr>
-    </w:p>
-    <w:p>
-      <w:pPr>
-        <w:rPr>
-          <w:rFonts w:cstheme="minorHAnsi"/>
-        </w:rPr>
-      </w:pPr>
-    </w:p>
-    <w:p>
-      <w:pPr>
-        <w:rPr>
-          <w:rFonts w:cstheme="minorHAnsi"/>
-        </w:rPr>
-      </w:pPr>
-    </w:p>
-    <w:p>
-      <w:pPr>
-        <w:rPr>
-          <w:rFonts w:cstheme="minorHAnsi"/>
-        </w:rPr>
-      </w:pPr>
-    </w:p>
-    <w:p>
-      <w:pPr>
-        <w:rPr>
-          <w:rFonts w:cstheme="minorHAnsi"/>
-        </w:rPr>
-      </w:pPr>
-    </w:p>
-    <w:p>
-      <w:pPr>
-        <w:rPr>
-          <w:rFonts w:cstheme="minorHAnsi"/>
-        </w:rPr>
-      </w:pPr>
-    </w:p>
-    <w:p>
-      <w:pPr>
-        <w:rPr>
-          <w:rFonts w:cstheme="minorHAnsi"/>
-        </w:rPr>
-      </w:pPr>
-    </w:p>
-    <w:p>
-      <w:pPr>
-        <w:rPr>
-          <w:rFonts w:cstheme="minorHAnsi"/>
-        </w:rPr>
-      </w:pPr>
-    </w:p>
-    <w:p>
-      <w:pPr>
-        <w:rPr>
-          <w:rFonts w:cstheme="minorHAnsi"/>
-        </w:rPr>
-      </w:pPr>
-    </w:p>
-    <w:p>
-      <w:pPr>
-        <w:rPr>
-          <w:rFonts w:cstheme="minorHAnsi"/>
-        </w:rPr>
-      </w:pPr>
-    </w:p>
-    <w:p>
-      <w:pPr>
-        <w:rPr>
-          <w:rFonts w:cstheme="minorHAnsi"/>
-        </w:rPr>
-      </w:pPr>
-    </w:p>
-    <w:p>
-      <w:pPr>
-        <w:rPr>
-          <w:rFonts w:cstheme="minorHAnsi"/>
-        </w:rPr>
-      </w:pPr>
-    </w:p>
-    <w:p>
-      <w:pPr>
-        <w:rPr>
-          <w:rFonts w:cstheme="minorHAnsi"/>
-          <w:b/>
-          <w:bCs/>
-        </w:rPr>
-      </w:pPr>
-    </w:p>
-    <w:p>
-      <w:pPr>
-        <w:rPr>
-          <w:rFonts w:cstheme="minorHAnsi"/>
-          <w:b/>
-          <w:bCs/>
-        </w:rPr>
-      </w:pPr>
-      <w:r>
-        <w:rPr>
-          <w:rFonts w:cstheme="minorHAnsi"/>
+      <w:r>
+        <w:rPr>
           <w:noProof/>
         </w:rPr>
         <w:drawing>
-          <wp:inline distT="0" distB="0" distL="0" distR="0" wp14:anchorId="7CBC7120" wp14:editId="5B500926">
-            <wp:extent cx="5943600" cy="3274695"/>
-            <wp:effectExtent l="0" t="0" r="0" b="1905"/>
-            <wp:docPr id="214272576" name="Picture 1"/>
+          <wp:inline distT="0" distB="0" distL="0" distR="0" wp14:anchorId="70EB4600" wp14:editId="43241660">
+            <wp:extent cx="5943600" cy="3279775"/>
+            <wp:effectExtent l="0" t="0" r="0" b="0"/>
+            <wp:docPr id="1967597655" name="Picture 1"/>
             <wp:cNvGraphicFramePr>
               <a:graphicFrameLocks xmlns:a="http://schemas.openxmlformats.org/drawingml/2006/main" noChangeAspect="1"/>
             </wp:cNvGraphicFramePr>
@@ -10423,7 +10087,7 @@
               <a:graphicData uri="http://schemas.openxmlformats.org/drawingml/2006/picture">
                 <pic:pic xmlns:pic="http://schemas.openxmlformats.org/drawingml/2006/picture">
                   <pic:nvPicPr>
-                    <pic:cNvPr id="0" name="Picture 10"/>
+                    <pic:cNvPr id="0" name="Picture 52"/>
                     <pic:cNvPicPr>
                       <a:picLocks noChangeAspect="1" noChangeArrowheads="1"/>
                     </pic:cNvPicPr>
@@ -10444,7 +10108,7 @@
                   <pic:spPr bwMode="auto">
                     <a:xfrm>
                       <a:off x="0" y="0"/>
-                      <a:ext cx="5943600" cy="3274695"/>
+                      <a:ext cx="5943600" cy="3279775"/>
                     </a:xfrm>
                     <a:prstGeom prst="rect">
                       <a:avLst/>
@@ -10471,26 +10135,39 @@
         <w:rPr>
           <w:rFonts w:cstheme="minorHAnsi"/>
         </w:rPr>
-        <w:t>Figure 1: Type-Token Ratio across training conditions. AI-trained models show vocabulary reduction in both architectures, with Llama-3.2-1B showing steeper decline (28.4%) compared to Mistral-7B (15.6%). Mixed-trained models remain close to human baseline.</w:t>
-      </w:r>
-    </w:p>
-    <w:p>
-      <w:pPr>
-        <w:rPr>
-          <w:rFonts w:cstheme="minorHAnsi"/>
-        </w:rPr>
-      </w:pPr>
-      <w:r>
-        <w:rPr>
-          <w:rFonts w:cstheme="minorHAnsi"/>
+        <w:t>Figure 1: Type-Token Ratio across training conditions. AI-trained models show vocabulary reduction in both architectures, with Llama-3.2-1B showing steeper decline (24.3%) compared to Mistral-7B (15.6%). Mixed-trained models remain close to human baseline.</w:t>
+      </w:r>
+    </w:p>
+    <w:p>
+      <w:pPr>
+        <w:rPr>
+          <w:rFonts w:cstheme="minorHAnsi"/>
+        </w:rPr>
+      </w:pPr>
+    </w:p>
+    <w:p>
+      <w:pPr>
+        <w:rPr>
+          <w:rFonts w:cstheme="minorHAnsi"/>
+        </w:rPr>
+      </w:pPr>
+    </w:p>
+    <w:p>
+      <w:pPr>
+        <w:rPr>
+          <w:rFonts w:cstheme="minorHAnsi"/>
+        </w:rPr>
+      </w:pPr>
+      <w:r>
+        <w:rPr>
           <w:noProof/>
         </w:rPr>
         <w:lastRenderedPageBreak/>
         <w:drawing>
-          <wp:inline distT="0" distB="0" distL="0" distR="0" wp14:anchorId="79553826" wp14:editId="761AE37D">
-            <wp:extent cx="5943600" cy="3274695"/>
-            <wp:effectExtent l="0" t="0" r="0" b="1905"/>
-            <wp:docPr id="1567394934" name="Picture 2"/>
+          <wp:inline distT="0" distB="0" distL="0" distR="0" wp14:anchorId="6283DFEB" wp14:editId="6D19D2EC">
+            <wp:extent cx="5943600" cy="3279775"/>
+            <wp:effectExtent l="0" t="0" r="0" b="0"/>
+            <wp:docPr id="661692974" name="Picture 2"/>
             <wp:cNvGraphicFramePr>
               <a:graphicFrameLocks xmlns:a="http://schemas.openxmlformats.org/drawingml/2006/main" noChangeAspect="1"/>
             </wp:cNvGraphicFramePr>
@@ -10498,7 +10175,7 @@
               <a:graphicData uri="http://schemas.openxmlformats.org/drawingml/2006/picture">
                 <pic:pic xmlns:pic="http://schemas.openxmlformats.org/drawingml/2006/picture">
                   <pic:nvPicPr>
-                    <pic:cNvPr id="0" name="Picture 12"/>
+                    <pic:cNvPr id="0" name="Picture 54"/>
                     <pic:cNvPicPr>
                       <a:picLocks noChangeAspect="1" noChangeArrowheads="1"/>
                     </pic:cNvPicPr>
@@ -10519,7 +10196,7 @@
                   <pic:spPr bwMode="auto">
                     <a:xfrm>
                       <a:off x="0" y="0"/>
-                      <a:ext cx="5943600" cy="3274695"/>
+                      <a:ext cx="5943600" cy="3279775"/>
                     </a:xfrm>
                     <a:prstGeom prst="rect">
                       <a:avLst/>
@@ -10546,25 +10223,24 @@
         <w:rPr>
           <w:rFonts w:cstheme="minorHAnsi"/>
         </w:rPr>
-        <w:t>Figure 2: Bigram Diversity across training conditions. AI training causes the sharpest collapse in Llama (32.4%), while Mistral shows moderate decline (23.7%). Mixed-trained models preserve phrasal diversity across both architectures.</w:t>
-      </w:r>
-    </w:p>
-    <w:p>
-      <w:pPr>
-        <w:rPr>
-          <w:rFonts w:cstheme="minorHAnsi"/>
-        </w:rPr>
-      </w:pPr>
-      <w:r>
-        <w:rPr>
-          <w:rFonts w:cstheme="minorHAnsi"/>
+        <w:t>Figure 2: Bigram Diversity across training conditions. AI training causes the sharpest collapse in Llama (25.5%), while Mistral shows moderate decline (22.3%). Mixed-trained models preserve phrasal diversity across both architectures.</w:t>
+      </w:r>
+    </w:p>
+    <w:p>
+      <w:pPr>
+        <w:rPr>
+          <w:rFonts w:cstheme="minorHAnsi"/>
+        </w:rPr>
+      </w:pPr>
+      <w:r>
+        <w:rPr>
           <w:noProof/>
         </w:rPr>
         <w:drawing>
-          <wp:inline distT="0" distB="0" distL="0" distR="0" wp14:anchorId="40687A12" wp14:editId="68B4CB7B">
-            <wp:extent cx="5943600" cy="3274695"/>
-            <wp:effectExtent l="0" t="0" r="0" b="1905"/>
-            <wp:docPr id="1018363562" name="Picture 3"/>
+          <wp:inline distT="0" distB="0" distL="0" distR="0" wp14:anchorId="153CF4A7" wp14:editId="14345872">
+            <wp:extent cx="5943600" cy="3279775"/>
+            <wp:effectExtent l="0" t="0" r="0" b="0"/>
+            <wp:docPr id="1592557440" name="Picture 3"/>
             <wp:cNvGraphicFramePr>
               <a:graphicFrameLocks xmlns:a="http://schemas.openxmlformats.org/drawingml/2006/main" noChangeAspect="1"/>
             </wp:cNvGraphicFramePr>
@@ -10572,7 +10248,7 @@
               <a:graphicData uri="http://schemas.openxmlformats.org/drawingml/2006/picture">
                 <pic:pic xmlns:pic="http://schemas.openxmlformats.org/drawingml/2006/picture">
                   <pic:nvPicPr>
-                    <pic:cNvPr id="0" name="Picture 14"/>
+                    <pic:cNvPr id="0" name="Picture 56"/>
                     <pic:cNvPicPr>
                       <a:picLocks noChangeAspect="1" noChangeArrowheads="1"/>
                     </pic:cNvPicPr>
@@ -10593,7 +10269,7 @@
                   <pic:spPr bwMode="auto">
                     <a:xfrm>
                       <a:off x="0" y="0"/>
-                      <a:ext cx="5943600" cy="3274695"/>
+                      <a:ext cx="5943600" cy="3279775"/>
                     </a:xfrm>
                     <a:prstGeom prst="rect">
                       <a:avLst/>
@@ -10620,40 +10296,25 @@
         <w:rPr>
           <w:rFonts w:cstheme="minorHAnsi"/>
         </w:rPr>
-        <w:t xml:space="preserve">Figure 3: Perplexity across training conditions. A sharp drop in the AI-trained condition indicates distributional narrowing </w:t>
-      </w:r>
-      <w:r>
-        <w:rPr>
-          <w:rFonts w:cstheme="minorHAnsi"/>
-        </w:rPr>
-        <w:t xml:space="preserve">- </w:t>
-      </w:r>
-      <w:r>
-        <w:rPr>
-          <w:rFonts w:cstheme="minorHAnsi"/>
-        </w:rPr>
-        <w:t>a key marker of collapse.</w:t>
-      </w:r>
-    </w:p>
-    <w:p>
-      <w:pPr>
-        <w:rPr>
-          <w:rFonts w:cstheme="minorHAnsi"/>
-          <w:b/>
-          <w:bCs/>
-        </w:rPr>
-      </w:pPr>
-      <w:r>
-        <w:rPr>
-          <w:rFonts w:cstheme="minorHAnsi"/>
+        <w:t>Figure 3: Distinct-3 (trigram diversity) across training conditions. The AI-trained condition shows the steepest drop in both models, with Llama declining 21.1% and Mistral 20.3%, reinforcing the collapse signal seen in TTR and Bigram Diversity.</w:t>
+      </w:r>
+    </w:p>
+    <w:p>
+      <w:pPr>
+        <w:rPr>
+          <w:rFonts w:cstheme="minorHAnsi"/>
+        </w:rPr>
+      </w:pPr>
+      <w:r>
+        <w:rPr>
           <w:noProof/>
         </w:rPr>
         <w:lastRenderedPageBreak/>
         <w:drawing>
-          <wp:inline distT="0" distB="0" distL="0" distR="0" wp14:anchorId="1A1AF7C5" wp14:editId="1EE02BBC">
-            <wp:extent cx="5943600" cy="3686175"/>
-            <wp:effectExtent l="0" t="0" r="0" b="9525"/>
-            <wp:docPr id="974737300" name="Picture 4"/>
+          <wp:inline distT="0" distB="0" distL="0" distR="0" wp14:anchorId="73665A44" wp14:editId="597963D6">
+            <wp:extent cx="5943600" cy="3279775"/>
+            <wp:effectExtent l="0" t="0" r="0" b="0"/>
+            <wp:docPr id="1688683116" name="Picture 4"/>
             <wp:cNvGraphicFramePr>
               <a:graphicFrameLocks xmlns:a="http://schemas.openxmlformats.org/drawingml/2006/main" noChangeAspect="1"/>
             </wp:cNvGraphicFramePr>
@@ -10661,7 +10322,7 @@
               <a:graphicData uri="http://schemas.openxmlformats.org/drawingml/2006/picture">
                 <pic:pic xmlns:pic="http://schemas.openxmlformats.org/drawingml/2006/picture">
                   <pic:nvPicPr>
-                    <pic:cNvPr id="0" name="Picture 16"/>
+                    <pic:cNvPr id="0" name="Picture 58"/>
                     <pic:cNvPicPr>
                       <a:picLocks noChangeAspect="1" noChangeArrowheads="1"/>
                     </pic:cNvPicPr>
@@ -10682,7 +10343,7 @@
                   <pic:spPr bwMode="auto">
                     <a:xfrm>
                       <a:off x="0" y="0"/>
-                      <a:ext cx="5943600" cy="3686175"/>
+                      <a:ext cx="5943600" cy="3279775"/>
                     </a:xfrm>
                     <a:prstGeom prst="rect">
                       <a:avLst/>
@@ -10698,21 +10359,105 @@
           </wp:inline>
         </w:drawing>
       </w:r>
-      <w:r>
-        <w:rPr>
-          <w:rFonts w:eastAsia="Times New Roman" w:cstheme="minorHAnsi"/>
+    </w:p>
+    <w:p>
+      <w:pPr>
+        <w:rPr>
+          <w:rFonts w:cstheme="minorHAnsi"/>
+        </w:rPr>
+      </w:pPr>
+      <w:r>
+        <w:rPr>
+          <w:rFonts w:cstheme="minorHAnsi"/>
+        </w:rPr>
+        <w:t xml:space="preserve">Figure 4: Perplexity across training conditions. A sharp drop in the AI-trained condition indicates distributional narrowing </w:t>
+      </w:r>
+      <w:r>
+        <w:rPr>
+          <w:rFonts w:cstheme="minorHAnsi"/>
+        </w:rPr>
+        <w:t>-</w:t>
+      </w:r>
+      <w:r>
+        <w:rPr>
+          <w:rFonts w:cstheme="minorHAnsi"/>
+        </w:rPr>
+        <w:t xml:space="preserve"> a key marker of collapse.</w:t>
+      </w:r>
+    </w:p>
+    <w:p>
+      <w:pPr>
+        <w:rPr>
+          <w:rFonts w:cstheme="minorHAnsi"/>
+        </w:rPr>
+      </w:pPr>
+      <w:r>
+        <w:rPr>
+          <w:noProof/>
+        </w:rPr>
+        <w:drawing>
+          <wp:inline distT="0" distB="0" distL="0" distR="0" wp14:anchorId="516A6C25" wp14:editId="048D0DCF">
+            <wp:extent cx="5943600" cy="3268345"/>
+            <wp:effectExtent l="0" t="0" r="0" b="8255"/>
+            <wp:docPr id="1141855669" name="Picture 5"/>
+            <wp:cNvGraphicFramePr>
+              <a:graphicFrameLocks xmlns:a="http://schemas.openxmlformats.org/drawingml/2006/main" noChangeAspect="1"/>
+            </wp:cNvGraphicFramePr>
+            <a:graphic xmlns:a="http://schemas.openxmlformats.org/drawingml/2006/main">
+              <a:graphicData uri="http://schemas.openxmlformats.org/drawingml/2006/picture">
+                <pic:pic xmlns:pic="http://schemas.openxmlformats.org/drawingml/2006/picture">
+                  <pic:nvPicPr>
+                    <pic:cNvPr id="0" name="Picture 60"/>
+                    <pic:cNvPicPr>
+                      <a:picLocks noChangeAspect="1" noChangeArrowheads="1"/>
+                    </pic:cNvPicPr>
+                  </pic:nvPicPr>
+                  <pic:blipFill>
+                    <a:blip r:embed="rId10">
+                      <a:extLst>
+                        <a:ext uri="{28A0092B-C50C-407E-A947-70E740481C1C}">
+                          <a14:useLocalDpi xmlns:a14="http://schemas.microsoft.com/office/drawing/2010/main" val="0"/>
+                        </a:ext>
+                      </a:extLst>
+                    </a:blip>
+                    <a:srcRect/>
+                    <a:stretch>
+                      <a:fillRect/>
+                    </a:stretch>
+                  </pic:blipFill>
+                  <pic:spPr bwMode="auto">
+                    <a:xfrm>
+                      <a:off x="0" y="0"/>
+                      <a:ext cx="5943600" cy="3268345"/>
+                    </a:xfrm>
+                    <a:prstGeom prst="rect">
+                      <a:avLst/>
+                    </a:prstGeom>
+                    <a:noFill/>
+                    <a:ln>
+                      <a:noFill/>
+                    </a:ln>
+                  </pic:spPr>
+                </pic:pic>
+              </a:graphicData>
+            </a:graphic>
+          </wp:inline>
+        </w:drawing>
+      </w:r>
+    </w:p>
+    <w:p>
+      <w:pPr>
+        <w:rPr>
+          <w:rFonts w:cstheme="minorHAnsi"/>
           <w:b/>
           <w:bCs/>
-          <w:kern w:val="0"/>
-          <w14:ligatures w14:val="none"/>
-        </w:rPr>
-        <w:t xml:space="preserve"> </w:t>
-      </w:r>
-      <w:r>
-        <w:rPr>
-          <w:rFonts w:cstheme="minorHAnsi"/>
-        </w:rPr>
-        <w:t>Figure 4: Degradation in AI-trained models vs. human baseline. Llama-3.2-1B degrades more severely, suggesting smaller models are more vulnerable to synthetic training data.</w:t>
+        </w:rPr>
+      </w:pPr>
+      <w:r>
+        <w:rPr>
+          <w:rFonts w:cstheme="minorHAnsi"/>
+        </w:rPr>
+        <w:t>Figure 5: Degradation in AI-trained models vs. human baseline across four diversity metrics. Llama-3.2-1B degrades more severely across all metrics, suggesting smaller models are more vulnerable to synthetic training data.</w:t>
       </w:r>
     </w:p>
     <w:p>
@@ -10727,6 +10472,7 @@
         <w:rPr>
           <w:rFonts w:asciiTheme="minorHAnsi" w:hAnsiTheme="minorHAnsi" w:cstheme="minorHAnsi"/>
         </w:rPr>
+        <w:lastRenderedPageBreak/>
         <w:t>Discussion And Planned Work</w:t>
       </w:r>
       <w:bookmarkEnd w:id="17"/>
@@ -10864,21 +10610,7 @@
         <w:rPr>
           <w:rFonts w:cstheme="minorHAnsi"/>
         </w:rPr>
-        <w:t xml:space="preserve">32% decline in lexical diversity metrics (Cohen's d = 9.37), indicating this is a structural shift rather than statistical noise. This aligns with Shumailov et al. [1] and Herel &amp; </w:t>
-      </w:r>
-      <w:proofErr w:type="spellStart"/>
-      <w:r>
-        <w:rPr>
-          <w:rFonts w:cstheme="minorHAnsi"/>
-        </w:rPr>
-        <w:t>Mikolov</w:t>
-      </w:r>
-      <w:proofErr w:type="spellEnd"/>
-      <w:r>
-        <w:rPr>
-          <w:rFonts w:cstheme="minorHAnsi"/>
-        </w:rPr>
-        <w:t xml:space="preserve"> [3], who predicted that synthetic training causes models to over</w:t>
+        <w:t>32% decline in lexical diversity metrics (Cohen's d = 9.37), indicating this is a structural shift rather than statistical noise. This aligns with Shumailov et al. [1] and Herel &amp; Mikolov [3], who predicted that synthetic training causes models to over</w:t>
       </w:r>
       <w:r>
         <w:rPr>
@@ -10976,140 +10708,201 @@
         <w:rPr>
           <w:rFonts w:cstheme="minorHAnsi"/>
         </w:rPr>
+        <w:t>The mixed</w:t>
+      </w:r>
+      <w:r>
+        <w:rPr>
+          <w:rFonts w:cstheme="minorHAnsi"/>
+        </w:rPr>
+        <w:t>-</w:t>
+      </w:r>
+      <w:r>
+        <w:rPr>
+          <w:rFonts w:cstheme="minorHAnsi"/>
+        </w:rPr>
+        <w:t>dataset results are the most novel contribution of this study. In Llama, mixed training showed only marginal degradation relative to human</w:t>
+      </w:r>
+      <w:r>
+        <w:rPr>
+          <w:rFonts w:cstheme="minorHAnsi"/>
+        </w:rPr>
+        <w:t>-</w:t>
+      </w:r>
+      <w:r>
+        <w:rPr>
+          <w:rFonts w:cstheme="minorHAnsi"/>
+        </w:rPr>
+        <w:t>trained models. In Mistral, mixed training matched or exceeded human</w:t>
+      </w:r>
+      <w:r>
+        <w:rPr>
+          <w:rFonts w:cstheme="minorHAnsi"/>
+        </w:rPr>
+        <w:t>-</w:t>
+      </w:r>
+      <w:r>
+        <w:rPr>
+          <w:rFonts w:cstheme="minorHAnsi"/>
+        </w:rPr>
+        <w:t xml:space="preserve">trained performance across all metrics </w:t>
+      </w:r>
+      <w:r>
+        <w:rPr>
+          <w:rFonts w:cstheme="minorHAnsi"/>
+        </w:rPr>
+        <w:t>-</w:t>
+      </w:r>
+      <w:r>
+        <w:rPr>
+          <w:rFonts w:cstheme="minorHAnsi"/>
+        </w:rPr>
+        <w:t xml:space="preserve"> suggesting that in larger models, 50% human data is sufficient to anchor the model's linguistic distribution and prevent collapse entirely. This is consistent with Amin et al. [8], who showed that even weak human data substantially resists collapse.</w:t>
+      </w:r>
+    </w:p>
+    <w:p>
+      <w:pPr>
+        <w:rPr>
+          <w:rFonts w:cstheme="minorHAnsi"/>
+        </w:rPr>
+      </w:pPr>
+      <w:r>
+        <w:rPr>
+          <w:rFonts w:cstheme="minorHAnsi"/>
+        </w:rPr>
+        <w:t>These findings have practical implications. As AI</w:t>
+      </w:r>
+      <w:r>
+        <w:rPr>
+          <w:rFonts w:cstheme="minorHAnsi"/>
+        </w:rPr>
+        <w:t>-</w:t>
+      </w:r>
+      <w:r>
+        <w:rPr>
+          <w:rFonts w:cstheme="minorHAnsi"/>
+        </w:rPr>
+        <w:t>generated content proliferates online, future training datasets will inevitably contain synthetic text. Our results suggest that maintaining even a 50% human data ratio may be sufficient to preserve output quality, a more achievable threshold than filtering all synthetic content.</w:t>
+      </w:r>
+    </w:p>
+    <w:p>
+      <w:pPr>
+        <w:rPr>
+          <w:rFonts w:cstheme="minorHAnsi"/>
+        </w:rPr>
+      </w:pPr>
+    </w:p>
+    <w:p>
+      <w:pPr>
+        <w:pStyle w:val="Heading4"/>
+        <w:rPr>
+          <w:rFonts w:cstheme="minorHAnsi"/>
+        </w:rPr>
+      </w:pPr>
+      <w:r>
+        <w:rPr>
+          <w:rFonts w:cstheme="minorHAnsi"/>
+        </w:rPr>
+        <w:t>Planned Work</w:t>
+      </w:r>
+    </w:p>
+    <w:p>
+      <w:pPr>
+        <w:rPr>
+          <w:rFonts w:cstheme="minorHAnsi"/>
+        </w:rPr>
+      </w:pPr>
+      <w:r>
+        <w:rPr>
+          <w:rFonts w:cstheme="minorHAnsi"/>
+        </w:rPr>
+        <w:t xml:space="preserve">This phase established the experimental framework and confirmed collapse across two model architectures. The following phases will extend these findings by applying factual diversity metrics (hallucination detection, entity coverage) to complement the lexical analysis, and by executing recursive training experiments </w:t>
+      </w:r>
+      <w:r>
+        <w:rPr>
+          <w:rFonts w:cstheme="minorHAnsi"/>
+        </w:rPr>
+        <w:t>-</w:t>
+      </w:r>
+      <w:r>
+        <w:rPr>
+          <w:rFonts w:cstheme="minorHAnsi"/>
+        </w:rPr>
+        <w:t xml:space="preserve"> training Gen 2 models on Gen 1 AI output </w:t>
+      </w:r>
+      <w:r>
+        <w:rPr>
+          <w:rFonts w:cstheme="minorHAnsi"/>
+        </w:rPr>
+        <w:t>-</w:t>
+      </w:r>
+      <w:r>
+        <w:rPr>
+          <w:rFonts w:cstheme="minorHAnsi"/>
+        </w:rPr>
+        <w:t xml:space="preserve"> to test whether collapse accelerates across generations.</w:t>
+      </w:r>
+    </w:p>
+    <w:p>
+      <w:pPr>
+        <w:pStyle w:val="Heading1"/>
+        <w:rPr>
+          <w:rFonts w:asciiTheme="minorHAnsi" w:hAnsiTheme="minorHAnsi" w:cstheme="minorHAnsi"/>
+        </w:rPr>
+      </w:pPr>
+      <w:bookmarkStart w:id="18" w:name="_Toc222500954"/>
+      <w:r>
+        <w:rPr>
+          <w:rFonts w:asciiTheme="minorHAnsi" w:hAnsiTheme="minorHAnsi" w:cstheme="minorHAnsi"/>
+        </w:rPr>
         <w:lastRenderedPageBreak/>
-        <w:t>The mixed</w:t>
-      </w:r>
-      <w:r>
-        <w:rPr>
-          <w:rFonts w:cstheme="minorHAnsi"/>
-        </w:rPr>
-        <w:t>-</w:t>
-      </w:r>
-      <w:r>
-        <w:rPr>
-          <w:rFonts w:cstheme="minorHAnsi"/>
-        </w:rPr>
-        <w:t>dataset results are the most novel contribution of this study. In Llama, mixed training showed only marginal degradation relative to human</w:t>
-      </w:r>
-      <w:r>
-        <w:rPr>
-          <w:rFonts w:cstheme="minorHAnsi"/>
-        </w:rPr>
-        <w:t>-</w:t>
-      </w:r>
-      <w:r>
-        <w:rPr>
-          <w:rFonts w:cstheme="minorHAnsi"/>
-        </w:rPr>
-        <w:t>trained models. In Mistral, mixed training matched or exceeded human</w:t>
-      </w:r>
-      <w:r>
-        <w:rPr>
-          <w:rFonts w:cstheme="minorHAnsi"/>
-        </w:rPr>
-        <w:t>-</w:t>
-      </w:r>
-      <w:r>
-        <w:rPr>
-          <w:rFonts w:cstheme="minorHAnsi"/>
-        </w:rPr>
-        <w:t xml:space="preserve">trained performance across all metrics </w:t>
-      </w:r>
-      <w:r>
-        <w:rPr>
-          <w:rFonts w:cstheme="minorHAnsi"/>
-        </w:rPr>
-        <w:t>-</w:t>
-      </w:r>
-      <w:r>
-        <w:rPr>
-          <w:rFonts w:cstheme="minorHAnsi"/>
-        </w:rPr>
-        <w:t xml:space="preserve"> suggesting that in larger models, 50% human data is sufficient to anchor the model's linguistic distribution and prevent collapse entirely. This is consistent with Amin et al. [8], who showed that even weak human data substantially resists collapse.</w:t>
-      </w:r>
-    </w:p>
-    <w:p>
-      <w:pPr>
-        <w:rPr>
-          <w:rFonts w:cstheme="minorHAnsi"/>
-        </w:rPr>
-      </w:pPr>
-      <w:r>
-        <w:rPr>
-          <w:rFonts w:cstheme="minorHAnsi"/>
-        </w:rPr>
-        <w:t>These findings have practical implications. As AI</w:t>
-      </w:r>
-      <w:r>
-        <w:rPr>
-          <w:rFonts w:cstheme="minorHAnsi"/>
-        </w:rPr>
-        <w:t>-</w:t>
-      </w:r>
-      <w:r>
-        <w:rPr>
-          <w:rFonts w:cstheme="minorHAnsi"/>
-        </w:rPr>
-        <w:t>generated content proliferates online, future training datasets will inevitably contain synthetic text. Our results suggest that maintaining even a 50% human data ratio may be sufficient to preserve output quality, a more achievable threshold than filtering all synthetic content.</w:t>
-      </w:r>
-    </w:p>
-    <w:p>
-      <w:pPr>
-        <w:rPr>
-          <w:rFonts w:cstheme="minorHAnsi"/>
-        </w:rPr>
-      </w:pPr>
-    </w:p>
-    <w:p>
-      <w:pPr>
-        <w:pStyle w:val="Heading4"/>
-        <w:rPr>
-          <w:rFonts w:cstheme="minorHAnsi"/>
-        </w:rPr>
-      </w:pPr>
-      <w:r>
-        <w:rPr>
-          <w:rFonts w:cstheme="minorHAnsi"/>
-        </w:rPr>
-        <w:t>Planned Work</w:t>
-      </w:r>
-    </w:p>
-    <w:p>
-      <w:pPr>
-        <w:rPr>
-          <w:rFonts w:cstheme="minorHAnsi"/>
-        </w:rPr>
-      </w:pPr>
-      <w:r>
-        <w:rPr>
-          <w:rFonts w:cstheme="minorHAnsi"/>
-        </w:rPr>
-        <w:t xml:space="preserve">This phase established the experimental framework and confirmed collapse across two model architectures. The following phases will extend these findings by applying factual diversity metrics (hallucination detection, entity coverage) to complement the lexical analysis, and by executing recursive training experiments </w:t>
-      </w:r>
-      <w:r>
-        <w:rPr>
-          <w:rFonts w:cstheme="minorHAnsi"/>
-        </w:rPr>
-        <w:t>-</w:t>
-      </w:r>
-      <w:r>
-        <w:rPr>
-          <w:rFonts w:cstheme="minorHAnsi"/>
-        </w:rPr>
-        <w:t xml:space="preserve"> training Gen 2 models on Gen 1 AI output </w:t>
-      </w:r>
-      <w:r>
-        <w:rPr>
-          <w:rFonts w:cstheme="minorHAnsi"/>
-        </w:rPr>
-        <w:t>-</w:t>
-      </w:r>
-      <w:r>
-        <w:rPr>
-          <w:rFonts w:cstheme="minorHAnsi"/>
-        </w:rPr>
-        <w:t xml:space="preserve"> to test whether collapse accelerates across generations.</w:t>
-      </w:r>
+        <w:t>Acknowledgements</w:t>
+      </w:r>
+      <w:bookmarkEnd w:id="18"/>
+    </w:p>
+    <w:p>
+      <w:pPr>
+        <w:rPr>
+          <w:rFonts w:cstheme="minorHAnsi"/>
+        </w:rPr>
+      </w:pPr>
+      <w:r>
+        <w:rPr>
+          <w:rFonts w:cstheme="minorHAnsi"/>
+        </w:rPr>
+        <w:t>I would like to express my gratitude to my supervisor, Dr. Sharon Yalov-Handzel (Head of the Intelligent Systems Program, Afeka Academic College of Engineering) for her professional guidance and support throughout this project.</w:t>
+      </w:r>
+    </w:p>
+    <w:p>
+      <w:pPr>
+        <w:rPr>
+          <w:rFonts w:cstheme="minorHAnsi"/>
+        </w:rPr>
+      </w:pPr>
+      <w:r>
+        <w:rPr>
+          <w:rFonts w:cstheme="minorHAnsi"/>
+        </w:rPr>
+        <w:t xml:space="preserve">I would also like to thank Afeka Academic College of Engineering for providing the </w:t>
+      </w:r>
+      <w:r>
+        <w:rPr>
+          <w:rFonts w:cstheme="minorHAnsi"/>
+        </w:rPr>
+        <w:t>computational</w:t>
+      </w:r>
+      <w:r>
+        <w:rPr>
+          <w:rFonts w:cstheme="minorHAnsi"/>
+        </w:rPr>
+        <w:t xml:space="preserve"> resources that supported this research.</w:t>
+      </w:r>
+    </w:p>
+    <w:p>
+      <w:pPr>
+        <w:rPr>
+          <w:rFonts w:cstheme="minorHAnsi"/>
+        </w:rPr>
+      </w:pPr>
     </w:p>
     <w:p>
       <w:pPr>
@@ -11118,100 +10911,11 @@
           <w:rFonts w:asciiTheme="minorHAnsi" w:hAnsiTheme="minorHAnsi" w:cstheme="minorHAnsi"/>
         </w:rPr>
       </w:pPr>
-      <w:bookmarkStart w:id="18" w:name="_Toc222500954"/>
+      <w:bookmarkStart w:id="19" w:name="_Toc222500955"/>
       <w:r>
         <w:rPr>
           <w:rFonts w:asciiTheme="minorHAnsi" w:hAnsiTheme="minorHAnsi" w:cstheme="minorHAnsi"/>
         </w:rPr>
-        <w:t>Acknowledgements</w:t>
-      </w:r>
-      <w:bookmarkEnd w:id="18"/>
-    </w:p>
-    <w:p>
-      <w:pPr>
-        <w:rPr>
-          <w:rFonts w:cstheme="minorHAnsi"/>
-        </w:rPr>
-      </w:pPr>
-      <w:r>
-        <w:rPr>
-          <w:rFonts w:cstheme="minorHAnsi"/>
-        </w:rPr>
-        <w:t xml:space="preserve">I would like to express my gratitude to my supervisor, Dr. Sharon Yalov-Handzel (Head of the Intelligent Systems Program, </w:t>
-      </w:r>
-      <w:proofErr w:type="spellStart"/>
-      <w:r>
-        <w:rPr>
-          <w:rFonts w:cstheme="minorHAnsi"/>
-        </w:rPr>
-        <w:t>Afeka</w:t>
-      </w:r>
-      <w:proofErr w:type="spellEnd"/>
-      <w:r>
-        <w:rPr>
-          <w:rFonts w:cstheme="minorHAnsi"/>
-        </w:rPr>
-        <w:t xml:space="preserve"> Academic College of Engineering) for her professional guidance and support throughout this project.</w:t>
-      </w:r>
-    </w:p>
-    <w:p>
-      <w:pPr>
-        <w:rPr>
-          <w:rFonts w:cstheme="minorHAnsi"/>
-        </w:rPr>
-      </w:pPr>
-      <w:r>
-        <w:rPr>
-          <w:rFonts w:cstheme="minorHAnsi"/>
-        </w:rPr>
-        <w:t xml:space="preserve">I would also like to thank </w:t>
-      </w:r>
-      <w:proofErr w:type="spellStart"/>
-      <w:r>
-        <w:rPr>
-          <w:rFonts w:cstheme="minorHAnsi"/>
-        </w:rPr>
-        <w:t>Afeka</w:t>
-      </w:r>
-      <w:proofErr w:type="spellEnd"/>
-      <w:r>
-        <w:rPr>
-          <w:rFonts w:cstheme="minorHAnsi"/>
-        </w:rPr>
-        <w:t xml:space="preserve"> Academic College of Engineering for providing the </w:t>
-      </w:r>
-      <w:r>
-        <w:rPr>
-          <w:rFonts w:cstheme="minorHAnsi"/>
-        </w:rPr>
-        <w:t>computational</w:t>
-      </w:r>
-      <w:r>
-        <w:rPr>
-          <w:rFonts w:cstheme="minorHAnsi"/>
-        </w:rPr>
-        <w:t xml:space="preserve"> resources that supported this research.</w:t>
-      </w:r>
-    </w:p>
-    <w:p>
-      <w:pPr>
-        <w:rPr>
-          <w:rFonts w:cstheme="minorHAnsi"/>
-        </w:rPr>
-      </w:pPr>
-    </w:p>
-    <w:p>
-      <w:pPr>
-        <w:pStyle w:val="Heading1"/>
-        <w:rPr>
-          <w:rFonts w:asciiTheme="minorHAnsi" w:hAnsiTheme="minorHAnsi" w:cstheme="minorHAnsi"/>
-        </w:rPr>
-      </w:pPr>
-      <w:bookmarkStart w:id="19" w:name="_Toc222500955"/>
-      <w:r>
-        <w:rPr>
-          <w:rFonts w:asciiTheme="minorHAnsi" w:hAnsiTheme="minorHAnsi" w:cstheme="minorHAnsi"/>
-        </w:rPr>
         <w:t>References</w:t>
       </w:r>
       <w:bookmarkEnd w:id="19"/>
@@ -11238,53 +10942,15 @@
         <w:rPr>
           <w:rFonts w:cstheme="minorHAnsi"/>
         </w:rPr>
-        <w:t xml:space="preserve">] </w:t>
-      </w:r>
-      <w:proofErr w:type="spellStart"/>
-      <w:r>
-        <w:rPr>
-          <w:rFonts w:cstheme="minorHAnsi"/>
-        </w:rPr>
-        <w:t>Shumailov</w:t>
-      </w:r>
-      <w:proofErr w:type="spellEnd"/>
-      <w:r>
-        <w:rPr>
-          <w:rFonts w:cstheme="minorHAnsi"/>
-        </w:rPr>
-        <w:t xml:space="preserve">, I., Shumaylov, Z., Zhao, Y., Gal, Y., </w:t>
-      </w:r>
-      <w:proofErr w:type="spellStart"/>
-      <w:r>
-        <w:rPr>
-          <w:rFonts w:cstheme="minorHAnsi"/>
-        </w:rPr>
-        <w:t>Papernot</w:t>
-      </w:r>
-      <w:proofErr w:type="spellEnd"/>
-      <w:r>
-        <w:rPr>
-          <w:rFonts w:cstheme="minorHAnsi"/>
-        </w:rPr>
-        <w:t xml:space="preserve">, N., &amp; Anderson, R. (2023). The curse of recursion: Training on generated data makes models forget. </w:t>
-      </w:r>
-      <w:proofErr w:type="spellStart"/>
+        <w:t xml:space="preserve">] Shumailov, I., Shumaylov, Z., Zhao, Y., Gal, Y., Papernot, N., &amp; Anderson, R. (2023). The curse of recursion: Training on generated data makes models forget. </w:t>
+      </w:r>
       <w:r>
         <w:rPr>
           <w:rFonts w:cstheme="minorHAnsi"/>
           <w:i/>
           <w:iCs/>
         </w:rPr>
-        <w:t>arXiv</w:t>
-      </w:r>
-      <w:proofErr w:type="spellEnd"/>
-      <w:r>
-        <w:rPr>
-          <w:rFonts w:cstheme="minorHAnsi"/>
-          <w:i/>
-          <w:iCs/>
-        </w:rPr>
-        <w:t xml:space="preserve"> preprint</w:t>
+        <w:t>arXiv preprint</w:t>
       </w:r>
       <w:r>
         <w:rPr>
@@ -11292,7 +10958,7 @@
         </w:rPr>
         <w:t xml:space="preserve">. </w:t>
       </w:r>
-      <w:hyperlink r:id="rId10" w:history="1">
+      <w:hyperlink r:id="rId11" w:history="1">
         <w:r>
           <w:rPr>
             <w:rStyle w:val="Hyperlink"/>
@@ -11324,35 +10990,7 @@
         <w:rPr>
           <w:rFonts w:cstheme="minorHAnsi"/>
         </w:rPr>
-        <w:t xml:space="preserve">] </w:t>
-      </w:r>
-      <w:proofErr w:type="spellStart"/>
-      <w:r>
-        <w:rPr>
-          <w:rFonts w:cstheme="minorHAnsi"/>
-        </w:rPr>
-        <w:t>Mescheder</w:t>
-      </w:r>
-      <w:proofErr w:type="spellEnd"/>
-      <w:r>
-        <w:rPr>
-          <w:rFonts w:cstheme="minorHAnsi"/>
-        </w:rPr>
-        <w:t xml:space="preserve">, L., Geiger, A., &amp; </w:t>
-      </w:r>
-      <w:proofErr w:type="spellStart"/>
-      <w:r>
-        <w:rPr>
-          <w:rFonts w:cstheme="minorHAnsi"/>
-        </w:rPr>
-        <w:t>Nowozin</w:t>
-      </w:r>
-      <w:proofErr w:type="spellEnd"/>
-      <w:r>
-        <w:rPr>
-          <w:rFonts w:cstheme="minorHAnsi"/>
-        </w:rPr>
-        <w:t xml:space="preserve">, S. (2018). Which training methods for GANs do actually converge? In </w:t>
+        <w:t xml:space="preserve">] Mescheder, L., Geiger, A., &amp; Nowozin, S. (2018). Which training methods for GANs do actually converge? In </w:t>
       </w:r>
       <w:r>
         <w:rPr>
@@ -11368,7 +11006,7 @@
         </w:rPr>
         <w:t xml:space="preserve"> (Vol. 80). PMLR. </w:t>
       </w:r>
-      <w:hyperlink r:id="rId11" w:history="1">
+      <w:hyperlink r:id="rId12" w:history="1">
         <w:r>
           <w:rPr>
             <w:rStyle w:val="Hyperlink"/>
@@ -11388,7 +11026,6 @@
         <w:rPr>
           <w:rFonts w:cstheme="minorHAnsi"/>
         </w:rPr>
-        <w:lastRenderedPageBreak/>
         <w:t>[</w:t>
       </w:r>
       <w:r>
@@ -11415,23 +11052,13 @@
         </w:rPr>
         <w:t xml:space="preserve">trained language models. </w:t>
       </w:r>
-      <w:proofErr w:type="spellStart"/>
       <w:r>
         <w:rPr>
           <w:rFonts w:cstheme="minorHAnsi"/>
           <w:i/>
           <w:iCs/>
         </w:rPr>
-        <w:t>arXiv</w:t>
-      </w:r>
-      <w:proofErr w:type="spellEnd"/>
-      <w:r>
-        <w:rPr>
-          <w:rFonts w:cstheme="minorHAnsi"/>
-          <w:i/>
-          <w:iCs/>
-        </w:rPr>
-        <w:t xml:space="preserve"> preprint</w:t>
+        <w:t>arXiv preprint</w:t>
       </w:r>
       <w:r>
         <w:rPr>
@@ -11439,7 +11066,7 @@
         </w:rPr>
         <w:t xml:space="preserve">. </w:t>
       </w:r>
-      <w:hyperlink r:id="rId12" w:history="1">
+      <w:hyperlink r:id="rId13" w:history="1">
         <w:r>
           <w:rPr>
             <w:rStyle w:val="Hyperlink"/>
@@ -11487,7 +11114,7 @@
         </w:rPr>
         <w:t xml:space="preserve">. University of Minnesota. </w:t>
       </w:r>
-      <w:hyperlink r:id="rId13" w:history="1">
+      <w:hyperlink r:id="rId14" w:history="1">
         <w:r>
           <w:rPr>
             <w:rStyle w:val="Hyperlink"/>
@@ -11521,23 +11148,13 @@
         </w:rPr>
         <w:t xml:space="preserve">] Keisha, F., Wu, Z., Wang, Z., et al. (2025). Knowledge collapse in LLMs: When fluency survives but facts fail under recursive synthetic training. </w:t>
       </w:r>
-      <w:proofErr w:type="spellStart"/>
       <w:r>
         <w:rPr>
           <w:rFonts w:cstheme="minorHAnsi"/>
           <w:i/>
           <w:iCs/>
         </w:rPr>
-        <w:t>NeurIPS</w:t>
-      </w:r>
-      <w:proofErr w:type="spellEnd"/>
-      <w:r>
-        <w:rPr>
-          <w:rFonts w:cstheme="minorHAnsi"/>
-          <w:i/>
-          <w:iCs/>
-        </w:rPr>
-        <w:t xml:space="preserve"> 2025 Workshop on Evaluating the Evolving LLM Lifecycle</w:t>
+        <w:t>NeurIPS 2025 Workshop on Evaluating the Evolving LLM Lifecycle</w:t>
       </w:r>
       <w:r>
         <w:rPr>
@@ -11545,7 +11162,7 @@
         </w:rPr>
         <w:t xml:space="preserve">. </w:t>
       </w:r>
-      <w:hyperlink r:id="rId14" w:history="1">
+      <w:hyperlink r:id="rId15" w:history="1">
         <w:r>
           <w:rPr>
             <w:rStyle w:val="Hyperlink"/>
@@ -11615,21 +11232,7 @@
         <w:rPr>
           <w:rFonts w:cstheme="minorHAnsi"/>
         </w:rPr>
-        <w:t xml:space="preserve">] Schaeffer, R., </w:t>
-      </w:r>
-      <w:proofErr w:type="spellStart"/>
-      <w:r>
-        <w:rPr>
-          <w:rFonts w:cstheme="minorHAnsi"/>
-        </w:rPr>
-        <w:t>Kazdan</w:t>
-      </w:r>
-      <w:proofErr w:type="spellEnd"/>
-      <w:r>
-        <w:rPr>
-          <w:rFonts w:cstheme="minorHAnsi"/>
-        </w:rPr>
-        <w:t>, J., et al. (2025). Position: Model collapse does not mean what you think.</w:t>
+        <w:t>] Schaeffer, R., Kazdan, J., et al. (2025). Position: Model collapse does not mean what you think.</w:t>
       </w:r>
       <w:r>
         <w:rPr>
@@ -11675,7 +11278,7 @@
         </w:rPr>
         <w:br/>
       </w:r>
-      <w:hyperlink r:id="rId15" w:history="1">
+      <w:hyperlink r:id="rId16" w:history="1">
         <w:r>
           <w:rPr>
             <w:rStyle w:val="Hyperlink"/>
@@ -11695,6 +11298,7 @@
         <w:rPr>
           <w:rFonts w:cstheme="minorHAnsi"/>
         </w:rPr>
+        <w:lastRenderedPageBreak/>
         <w:t xml:space="preserve">[9] </w:t>
       </w:r>
       <w:r>

</xml_diff>